<commit_message>
Add web development internship, update resume with Dino loader preview, and modernize Tailwind CSS classes
</commit_message>
<xml_diff>
--- a/Tushar_Jain_CV.docx
+++ b/Tushar_Jain_CV.docx
@@ -17,16 +17,6 @@
           <w:szCs w:val="56"/>
         </w:rPr>
         <w:br/>
-      </w:r>
-      <w:r>
-        <w:rPr>
-          <w:b/>
-          <w:bCs/>
-          <w:color w:val="1B3A5C"/>
-          <w:spacing w:val="100"/>
-          <w:sz w:val="56"/>
-          <w:szCs w:val="56"/>
-        </w:rPr>
         <w:t>TUSHAR JAIN</w:t>
       </w:r>
     </w:p>
@@ -210,7 +200,36 @@
         <w:spacing w:before="60" w:after="60"/>
       </w:pPr>
       <w:r>
-        <w:t>Engineering student at BMS College of Engineering (CSBS, 2024–2028) with a track record of shipping real-world products — from a health-tech wearable pitched at JIC Accelerator 7.0, to a metro app with 100+ Play Store downloads in 10 days, to a B2B SaaS reservation system. Works across the full stack: React/Next.js frontends, Supabase backends, ESP32/Arduino embedded firmware, and BLE hardware. Driven by a philosophy of utility over ornamentation every build solves a real user problem.</w:t>
+        <w:t>Engineering student at BMS College of Engineering (CSBS, 2024</w:t>
+      </w:r>
+      <w:r>
+        <w:t xml:space="preserve"> - </w:t>
+      </w:r>
+      <w:r>
+        <w:t>2028) with a track record of shipping real-world products from a health-tech wearable pitched at JIC Accelerator 7.0, to a metro app with 100</w:t>
+      </w:r>
+      <w:r>
+        <w:t>0</w:t>
+      </w:r>
+      <w:r>
+        <w:t xml:space="preserve"> Play Store </w:t>
+      </w:r>
+      <w:r>
+        <w:t>downloads,</w:t>
+      </w:r>
+      <w:r>
+        <w:t xml:space="preserve"> to a B2B SaaS reservation system. Works across the full stack: React/Next.js frontends, </w:t>
+      </w:r>
+      <w:proofErr w:type="spellStart"/>
+      <w:r>
+        <w:t>Supabase</w:t>
+      </w:r>
+      <w:proofErr w:type="spellEnd"/>
+      <w:r>
+        <w:t xml:space="preserve"> and firebase</w:t>
+      </w:r>
+      <w:r>
+        <w:t xml:space="preserve"> backends, ESP32/Arduino embedded firmware, and BLE hardware. Driven by a philosophy of utility over ornamentation every build solves a real user problem.</w:t>
       </w:r>
     </w:p>
     <w:p>
@@ -248,7 +267,7 @@
           <w:sz w:val="20"/>
           <w:szCs w:val="20"/>
         </w:rPr>
-        <w:t xml:space="preserve">Co-Founder &amp; Tech Lead </w:t>
+        <w:t xml:space="preserve">Cofounder &amp; Tech Lead </w:t>
       </w:r>
       <w:r>
         <w:rPr>
@@ -268,8 +287,20 @@
           <w:sz w:val="20"/>
           <w:szCs w:val="20"/>
         </w:rPr>
-        <w:t xml:space="preserve"> Pulse-Predict</w:t>
-      </w:r>
+        <w:t xml:space="preserve"> </w:t>
+      </w:r>
+      <w:proofErr w:type="spellStart"/>
+      <w:r>
+        <w:rPr>
+          <w:b/>
+          <w:bCs/>
+          <w:color w:val="1B3A5C"/>
+          <w:sz w:val="20"/>
+          <w:szCs w:val="20"/>
+        </w:rPr>
+        <w:t>PulsePredict</w:t>
+      </w:r>
+      <w:proofErr w:type="spellEnd"/>
       <w:r>
         <w:rPr>
           <w:b/>
@@ -323,12 +354,18 @@
         <w:pStyle w:val="ListParagraph"/>
         <w:numPr>
           <w:ilvl w:val="0"/>
-          <w:numId w:val="2"/>
+          <w:numId w:val="4"/>
         </w:numPr>
         <w:spacing w:before="30" w:after="30"/>
       </w:pPr>
       <w:r>
-        <w:t>Identified a critical gap in India's geriatric care market — fall detection &amp; vitals monitoring devices priced above ₹10,000 excluded the mass market. Conceptualized a sub-₹2,000 solution targeting 140M+ elderly Indians.</w:t>
+        <w:t>Identified a critical gap in India's geriatric care market fall detection &amp; vitals monitoring devices priced above ₹10,000 excluded the mass market. Conceptualized a sub-₹</w:t>
+      </w:r>
+      <w:r>
+        <w:t>6</w:t>
+      </w:r>
+      <w:r>
+        <w:t>,000 solution targeting 140M+ elderly Indians.</w:t>
       </w:r>
     </w:p>
     <w:p>
@@ -336,12 +373,12 @@
         <w:pStyle w:val="ListParagraph"/>
         <w:numPr>
           <w:ilvl w:val="0"/>
-          <w:numId w:val="2"/>
+          <w:numId w:val="4"/>
         </w:numPr>
         <w:spacing w:before="30" w:after="30"/>
       </w:pPr>
       <w:r>
-        <w:t>Sole builder: architected the ESP32 + MPU6050 hardware stack, wrote BLE/Serial firmware, built the companion mobile app, and launched a public website from scratch.</w:t>
+        <w:t>Solved critical false-positive challenges in fall detection through iterative motion threshold tuning during user testing, achieving a reliable alert system.</w:t>
       </w:r>
     </w:p>
     <w:p>
@@ -349,12 +386,18 @@
         <w:pStyle w:val="ListParagraph"/>
         <w:numPr>
           <w:ilvl w:val="0"/>
-          <w:numId w:val="2"/>
+          <w:numId w:val="4"/>
         </w:numPr>
         <w:spacing w:before="30" w:after="30"/>
       </w:pPr>
       <w:r>
-        <w:t>Solved critical false-positive challenges in fall detection through iterative motion threshold tuning during user testing, achieving a reliable alert system.</w:t>
+        <w:t>Validated business model against 3 direct competitors at JIC Accelerator 7.0; secured industry feedback that shaped the product roadmap and sub-</w:t>
+      </w:r>
+      <w:r>
+        <w:t>6</w:t>
+      </w:r>
+      <w:r>
+        <w:t>2,000 pricing strategy.</w:t>
       </w:r>
     </w:p>
     <w:p>
@@ -362,12 +405,12 @@
         <w:pStyle w:val="ListParagraph"/>
         <w:numPr>
           <w:ilvl w:val="0"/>
-          <w:numId w:val="2"/>
+          <w:numId w:val="4"/>
         </w:numPr>
         <w:spacing w:before="30" w:after="30"/>
       </w:pPr>
       <w:r>
-        <w:t>Validated business model against 3 direct competitors at JIC Accelerator 7.0; secured industry feedback that shaped the product roadmap and sub-₹2,000 pricing strategy.</w:t>
+        <w:t>Designed architecture for future ABDM (National Digital Health Mission) integration, enabling scale into India's official digital health infrastructure.</w:t>
       </w:r>
     </w:p>
     <w:p>
@@ -375,31 +418,13 @@
         <w:pStyle w:val="ListParagraph"/>
         <w:numPr>
           <w:ilvl w:val="0"/>
-          <w:numId w:val="2"/>
+          <w:numId w:val="4"/>
         </w:numPr>
         <w:spacing w:before="30" w:after="30"/>
       </w:pPr>
       <w:r>
-        <w:t>Designed architecture for future ABDM (National Digital Health Mission) integration, enabling scale into India's official digital health infrastructure.</w:t>
-      </w:r>
-    </w:p>
-    <w:p>
-      <w:pPr>
-        <w:pStyle w:val="ListParagraph"/>
-        <w:numPr>
-          <w:ilvl w:val="0"/>
-          <w:numId w:val="2"/>
-        </w:numPr>
-        <w:spacing w:before="30" w:after="30"/>
-      </w:pPr>
-      <w:r>
         <w:t>Tech Stack: ESP32, MPU6050, MAX30102 (SpO2), BLE/Bluetooth, C++, Embedded Firmware, Android (APK Build &amp; Publish).</w:t>
       </w:r>
-    </w:p>
-    <w:p>
-      <w:pPr>
-        <w:spacing w:before="110"/>
-      </w:pPr>
     </w:p>
     <w:p>
       <w:pPr>
@@ -444,7 +469,7 @@
         <w:pStyle w:val="ListParagraph"/>
         <w:numPr>
           <w:ilvl w:val="0"/>
-          <w:numId w:val="2"/>
+          <w:numId w:val="4"/>
         </w:numPr>
         <w:spacing w:before="30" w:after="30"/>
       </w:pPr>
@@ -579,18 +604,12 @@
         <w:pStyle w:val="ListParagraph"/>
         <w:numPr>
           <w:ilvl w:val="0"/>
-          <w:numId w:val="2"/>
+          <w:numId w:val="4"/>
         </w:numPr>
-        <w:spacing w:before="30" w:after="30"/>
-      </w:pPr>
-      <w:r>
-        <w:t>Centralized platform for Jaipur Metro route planning, timings, and fare calculation</w:t>
-      </w:r>
-      <w:r>
-        <w:t xml:space="preserve"> </w:t>
-      </w:r>
-      <w:r>
-        <w:t>solving the fragmented transport info landscape that relied on WhatsApp rumors and scattered Google searches.</w:t>
+        <w:spacing w:after="50"/>
+      </w:pPr>
+      <w:r>
+        <w:t xml:space="preserve">Developed a public utility Android application for Jaipur Metro, providing route planning, fare calculation, station information, and train timings through a single, easy-to-use platform. </w:t>
       </w:r>
     </w:p>
     <w:p>
@@ -598,12 +617,32 @@
         <w:pStyle w:val="ListParagraph"/>
         <w:numPr>
           <w:ilvl w:val="0"/>
-          <w:numId w:val="2"/>
+          <w:numId w:val="4"/>
         </w:numPr>
-        <w:spacing w:before="30" w:after="30"/>
-      </w:pPr>
-      <w:r>
-        <w:t>Achieved 100+ downloads within 10 days of Google Play Store launch, demonstrating immediate market-fit and real-world utility.</w:t>
+        <w:spacing w:after="50"/>
+      </w:pPr>
+      <w:r>
+        <w:t xml:space="preserve">Achieved </w:t>
+      </w:r>
+      <w:r>
+        <w:rPr>
+          <w:b/>
+          <w:bCs/>
+        </w:rPr>
+        <w:t>1,000+ Google Play Store downloads</w:t>
+      </w:r>
+      <w:r>
+        <w:t xml:space="preserve"> with </w:t>
+      </w:r>
+      <w:r>
+        <w:rPr>
+          <w:b/>
+          <w:bCs/>
+        </w:rPr>
+        <w:t>250+ monthly active users (MAU)</w:t>
+      </w:r>
+      <w:r>
+        <w:t xml:space="preserve">, helping commuters access reliable metro information without relying on scattered online sources. </w:t>
       </w:r>
     </w:p>
     <w:p>
@@ -611,12 +650,12 @@
         <w:pStyle w:val="ListParagraph"/>
         <w:numPr>
           <w:ilvl w:val="0"/>
-          <w:numId w:val="2"/>
+          <w:numId w:val="4"/>
         </w:numPr>
-        <w:spacing w:before="30" w:after="30"/>
-      </w:pPr>
-      <w:r>
-        <w:t>Designed a custom lightweight data architecture to handle transit route nodes and varying schedules without the overhead of full GIS databases keeping the app fast on low-connectivity networks.</w:t>
+        <w:spacing w:after="50"/>
+      </w:pPr>
+      <w:r>
+        <w:t xml:space="preserve">Designed a lightweight transit data architecture to efficiently manage route nodes, fare calculations, and schedule data, ensuring fast performance even on low-connectivity networks. </w:t>
       </w:r>
     </w:p>
     <w:p>
@@ -624,31 +663,39 @@
         <w:pStyle w:val="ListParagraph"/>
         <w:numPr>
           <w:ilvl w:val="0"/>
-          <w:numId w:val="2"/>
+          <w:numId w:val="4"/>
         </w:numPr>
-        <w:spacing w:before="30" w:after="30"/>
-      </w:pPr>
-      <w:r>
-        <w:t>Built mobile-first responsive UI focused on accessibility and speed for commuters on the move.</w:t>
-      </w:r>
-    </w:p>
-    <w:p>
-      <w:pPr>
-        <w:pStyle w:val="ListParagraph"/>
-        <w:numPr>
-          <w:ilvl w:val="0"/>
-          <w:numId w:val="2"/>
-        </w:numPr>
-        <w:spacing w:before="30" w:after="30"/>
-      </w:pPr>
-      <w:r>
-        <w:t>Tech Stack: React.js, JavaScript, HTML/CSS, Vercel.</w:t>
-      </w:r>
-    </w:p>
-    <w:p>
-      <w:pPr>
-        <w:spacing w:before="80"/>
-      </w:pPr>
+        <w:spacing w:after="50"/>
+      </w:pPr>
+      <w:r>
+        <w:t xml:space="preserve">Built a responsive, mobile-first interface focused on speed, accessibility, and an intuitive commuter experience, with continuous improvements based on real user feedback. </w:t>
+      </w:r>
+    </w:p>
+    <w:p>
+      <w:pPr>
+        <w:spacing w:after="50"/>
+      </w:pPr>
+      <w:r>
+        <w:t xml:space="preserve">        &gt;   </w:t>
+      </w:r>
+      <w:r>
+        <w:rPr>
+          <w:b/>
+          <w:bCs/>
+        </w:rPr>
+        <w:t>Tech Stack:</w:t>
+      </w:r>
+      <w:r>
+        <w:t xml:space="preserve"> React.js, JavaScript (ES6+), HTML5, CSS3, </w:t>
+      </w:r>
+      <w:proofErr w:type="spellStart"/>
+      <w:r>
+        <w:t>Vercel</w:t>
+      </w:r>
+      <w:proofErr w:type="spellEnd"/>
+      <w:r>
+        <w:t>.</w:t>
+      </w:r>
     </w:p>
     <w:p>
       <w:pPr>
@@ -662,7 +709,22 @@
           <w:sz w:val="20"/>
           <w:szCs w:val="20"/>
         </w:rPr>
-        <w:t>2. Namma Ride (Bengaluru Metro)</w:t>
+        <w:t xml:space="preserve">2. </w:t>
+      </w:r>
+      <w:proofErr w:type="spellStart"/>
+      <w:r>
+        <w:rPr>
+          <w:b/>
+          <w:bCs/>
+          <w:color w:val="1B3A5C"/>
+          <w:sz w:val="20"/>
+          <w:szCs w:val="20"/>
+        </w:rPr>
+        <w:t>NotesCSBS</w:t>
+      </w:r>
+      <w:proofErr w:type="spellEnd"/>
+      <w:r>
+        <w:t xml:space="preserve">  </w:t>
       </w:r>
       <w:r>
         <w:rPr>
@@ -672,7 +734,7 @@
           <w:sz w:val="16"/>
           <w:szCs w:val="16"/>
         </w:rPr>
-        <w:t xml:space="preserve"> Public Utility UX Multilingual </w:t>
+        <w:t xml:space="preserve"> Productivity Academic Notes Platform </w:t>
       </w:r>
     </w:p>
     <w:p>
@@ -680,6 +742,22 @@
         <w:spacing w:after="50"/>
       </w:pPr>
       <w:hyperlink r:id="rId17" w:history="1">
+        <w:r>
+          <w:rPr>
+            <w:rStyle w:val="Hyperlink"/>
+          </w:rPr>
+          <w:t>Live Demo</w:t>
+        </w:r>
+      </w:hyperlink>
+      <w:r>
+        <w:rPr>
+          <w:color w:val="6B7280"/>
+          <w:sz w:val="17"/>
+          <w:szCs w:val="17"/>
+        </w:rPr>
+        <w:t xml:space="preserve">  ·  </w:t>
+      </w:r>
+      <w:hyperlink r:id="rId18" w:history="1">
         <w:r>
           <w:rPr>
             <w:color w:val="0D7377"/>
@@ -688,6 +766,263 @@
           <w:t>Project Page</w:t>
         </w:r>
       </w:hyperlink>
+    </w:p>
+    <w:p>
+      <w:pPr>
+        <w:pStyle w:val="ListParagraph"/>
+        <w:numPr>
+          <w:ilvl w:val="0"/>
+          <w:numId w:val="4"/>
+        </w:numPr>
+        <w:spacing w:after="50"/>
+      </w:pPr>
+      <w:r>
+        <w:t xml:space="preserve">  Developed a centralized academic platform for </w:t>
+      </w:r>
+      <w:r>
+        <w:rPr>
+          <w:b/>
+          <w:bCs/>
+        </w:rPr>
+        <w:t>BMSCE CSBS students</w:t>
+      </w:r>
+      <w:r>
+        <w:t xml:space="preserve">, providing semester-wise notes, lab materials, previous year papers, and study resources through a single searchable portal. </w:t>
+      </w:r>
+    </w:p>
+    <w:p>
+      <w:pPr>
+        <w:pStyle w:val="ListParagraph"/>
+        <w:numPr>
+          <w:ilvl w:val="0"/>
+          <w:numId w:val="4"/>
+        </w:numPr>
+        <w:spacing w:after="50"/>
+      </w:pPr>
+      <w:r>
+        <w:t xml:space="preserve">  Built a production-ready full-stack application with </w:t>
+      </w:r>
+      <w:r>
+        <w:rPr>
+          <w:b/>
+          <w:bCs/>
+        </w:rPr>
+        <w:t>React.js</w:t>
+      </w:r>
+      <w:r>
+        <w:t xml:space="preserve">, </w:t>
+      </w:r>
+      <w:proofErr w:type="spellStart"/>
+      <w:r>
+        <w:rPr>
+          <w:b/>
+          <w:bCs/>
+        </w:rPr>
+        <w:t>Supabase</w:t>
+      </w:r>
+      <w:proofErr w:type="spellEnd"/>
+      <w:r>
+        <w:rPr>
+          <w:b/>
+          <w:bCs/>
+        </w:rPr>
+        <w:t xml:space="preserve"> Authentication</w:t>
+      </w:r>
+      <w:r>
+        <w:t xml:space="preserve">, </w:t>
+      </w:r>
+      <w:r>
+        <w:rPr>
+          <w:b/>
+          <w:bCs/>
+        </w:rPr>
+        <w:t>SQL-backed database</w:t>
+      </w:r>
+      <w:r>
+        <w:t xml:space="preserve">, secure file management, an </w:t>
+      </w:r>
+      <w:r>
+        <w:rPr>
+          <w:b/>
+          <w:bCs/>
+        </w:rPr>
+        <w:t>admin dashboard</w:t>
+      </w:r>
+      <w:r>
+        <w:t xml:space="preserve">, and Google Drive integration for scalable content management. </w:t>
+      </w:r>
+    </w:p>
+    <w:p>
+      <w:pPr>
+        <w:pStyle w:val="ListParagraph"/>
+        <w:numPr>
+          <w:ilvl w:val="0"/>
+          <w:numId w:val="4"/>
+        </w:numPr>
+        <w:spacing w:after="50"/>
+      </w:pPr>
+      <w:r>
+        <w:t xml:space="preserve">  Achieved </w:t>
+      </w:r>
+      <w:r>
+        <w:rPr>
+          <w:b/>
+          <w:bCs/>
+        </w:rPr>
+        <w:t>500+ organic Google Search clicks</w:t>
+      </w:r>
+      <w:r>
+        <w:t xml:space="preserve">, </w:t>
+      </w:r>
+      <w:r>
+        <w:rPr>
+          <w:b/>
+          <w:bCs/>
+        </w:rPr>
+        <w:t>3K+ search impressions</w:t>
+      </w:r>
+      <w:r>
+        <w:t xml:space="preserve">, </w:t>
+      </w:r>
+      <w:r>
+        <w:rPr>
+          <w:b/>
+          <w:bCs/>
+        </w:rPr>
+        <w:t>16% click-through rate (CTR)</w:t>
+      </w:r>
+      <w:r>
+        <w:t xml:space="preserve">, and an </w:t>
+      </w:r>
+      <w:r>
+        <w:rPr>
+          <w:b/>
+          <w:bCs/>
+        </w:rPr>
+        <w:t>average Google search position of 4.7</w:t>
+      </w:r>
+      <w:r>
+        <w:t xml:space="preserve"> through SEO optimization and structured content. </w:t>
+      </w:r>
+    </w:p>
+    <w:p>
+      <w:pPr>
+        <w:pStyle w:val="ListParagraph"/>
+        <w:numPr>
+          <w:ilvl w:val="0"/>
+          <w:numId w:val="4"/>
+        </w:numPr>
+        <w:spacing w:after="50"/>
+      </w:pPr>
+      <w:r>
+        <w:t xml:space="preserve">  Designed a responsive, mobile-first interface optimized for high-traffic examination periods, enabling students to quickly discover and access curated academic resources. </w:t>
+      </w:r>
+    </w:p>
+    <w:p>
+      <w:pPr>
+        <w:pStyle w:val="ListParagraph"/>
+        <w:numPr>
+          <w:ilvl w:val="0"/>
+          <w:numId w:val="4"/>
+        </w:numPr>
+        <w:spacing w:after="50"/>
+      </w:pPr>
+      <w:r>
+        <w:rPr>
+          <w:b/>
+          <w:bCs/>
+        </w:rPr>
+        <w:t>Tech Stack:</w:t>
+      </w:r>
+      <w:r>
+        <w:t xml:space="preserve"> React.js, JavaScript, </w:t>
+      </w:r>
+      <w:proofErr w:type="spellStart"/>
+      <w:r>
+        <w:t>Supabase</w:t>
+      </w:r>
+      <w:proofErr w:type="spellEnd"/>
+      <w:r>
+        <w:t xml:space="preserve"> (Auth &amp; PostgreSQL), SQL, Google Drive Integration, HTML5, CSS</w:t>
+      </w:r>
+      <w:proofErr w:type="gramStart"/>
+      <w:r>
+        <w:t xml:space="preserve">3,   </w:t>
+      </w:r>
+      <w:proofErr w:type="gramEnd"/>
+      <w:r>
+        <w:t xml:space="preserve"> </w:t>
+      </w:r>
+      <w:proofErr w:type="spellStart"/>
+      <w:r>
+        <w:t>Vercel</w:t>
+      </w:r>
+      <w:proofErr w:type="spellEnd"/>
+      <w:r>
+        <w:t>, Google Search Console (SEO).</w:t>
+      </w:r>
+    </w:p>
+    <w:p>
+      <w:pPr>
+        <w:spacing w:before="120" w:after="25"/>
+      </w:pPr>
+      <w:r>
+        <w:rPr>
+          <w:b/>
+          <w:bCs/>
+          <w:color w:val="1B3A5C"/>
+          <w:sz w:val="20"/>
+          <w:szCs w:val="20"/>
+        </w:rPr>
+        <w:lastRenderedPageBreak/>
+        <w:t xml:space="preserve">3. </w:t>
+      </w:r>
+      <w:proofErr w:type="spellStart"/>
+      <w:r>
+        <w:rPr>
+          <w:b/>
+          <w:bCs/>
+          <w:color w:val="1B3A5C"/>
+          <w:sz w:val="20"/>
+          <w:szCs w:val="20"/>
+        </w:rPr>
+        <w:t>Namma</w:t>
+      </w:r>
+      <w:proofErr w:type="spellEnd"/>
+      <w:r>
+        <w:rPr>
+          <w:b/>
+          <w:bCs/>
+          <w:color w:val="1B3A5C"/>
+          <w:sz w:val="20"/>
+          <w:szCs w:val="20"/>
+        </w:rPr>
+        <w:t xml:space="preserve"> Ride (Bengaluru Metro)</w:t>
+      </w:r>
+      <w:r>
+        <w:rPr>
+          <w:b/>
+          <w:bCs/>
+          <w:color w:val="0D7377"/>
+          <w:sz w:val="16"/>
+          <w:szCs w:val="16"/>
+        </w:rPr>
+        <w:t xml:space="preserve"> Public Utility UX Multilingual </w:t>
+      </w:r>
+    </w:p>
+    <w:p>
+      <w:pPr>
+        <w:spacing w:after="50"/>
+      </w:pPr>
+      <w:hyperlink r:id="rId19" w:history="1">
+        <w:r>
+          <w:rPr>
+            <w:color w:val="0D7377"/>
+            <w:u w:val="single"/>
+          </w:rPr>
+          <w:t>Project Page</w:t>
+        </w:r>
+      </w:hyperlink>
       <w:r>
         <w:rPr>
           <w:color w:val="6B7280"/>
@@ -696,7 +1031,7 @@
         </w:rPr>
         <w:t xml:space="preserve">  ·  </w:t>
       </w:r>
-      <w:hyperlink r:id="rId18" w:history="1">
+      <w:hyperlink r:id="rId20" w:history="1">
         <w:r>
           <w:rPr>
             <w:color w:val="0D7377"/>
@@ -711,7 +1046,7 @@
         <w:pStyle w:val="ListParagraph"/>
         <w:numPr>
           <w:ilvl w:val="0"/>
-          <w:numId w:val="2"/>
+          <w:numId w:val="3"/>
         </w:numPr>
         <w:spacing w:before="30" w:after="30"/>
       </w:pPr>
@@ -724,7 +1059,7 @@
         <w:pStyle w:val="ListParagraph"/>
         <w:numPr>
           <w:ilvl w:val="0"/>
-          <w:numId w:val="2"/>
+          <w:numId w:val="3"/>
         </w:numPr>
         <w:spacing w:before="30" w:after="30"/>
       </w:pPr>
@@ -737,7 +1072,7 @@
         <w:pStyle w:val="ListParagraph"/>
         <w:numPr>
           <w:ilvl w:val="0"/>
-          <w:numId w:val="2"/>
+          <w:numId w:val="3"/>
         </w:numPr>
         <w:spacing w:before="30" w:after="30"/>
       </w:pPr>
@@ -750,7 +1085,7 @@
         <w:pStyle w:val="ListParagraph"/>
         <w:numPr>
           <w:ilvl w:val="0"/>
-          <w:numId w:val="2"/>
+          <w:numId w:val="3"/>
         </w:numPr>
         <w:spacing w:before="30" w:after="30"/>
       </w:pPr>
@@ -760,7 +1095,7 @@
     </w:p>
     <w:p>
       <w:pPr>
-        <w:spacing w:before="80"/>
+        <w:spacing w:before="30" w:after="30"/>
       </w:pPr>
     </w:p>
     <w:p>
@@ -775,8 +1110,7 @@
           <w:sz w:val="20"/>
           <w:szCs w:val="20"/>
         </w:rPr>
-        <w:lastRenderedPageBreak/>
-        <w:br/>
+        <w:t>4</w:t>
       </w:r>
       <w:r>
         <w:rPr>
@@ -786,18 +1120,7 @@
           <w:sz w:val="20"/>
           <w:szCs w:val="20"/>
         </w:rPr>
-        <w:br/>
-      </w:r>
-      <w:r>
-        <w:rPr>
-          <w:b/>
-          <w:bCs/>
-          <w:color w:val="1B3A5C"/>
-          <w:sz w:val="20"/>
-          <w:szCs w:val="20"/>
-        </w:rPr>
-        <w:br/>
-        <w:t>3. BookMySlot</w:t>
+        <w:t>. Split-Payment System</w:t>
       </w:r>
       <w:r>
         <w:t xml:space="preserve">  </w:t>
@@ -810,6 +1133,187 @@
           <w:sz w:val="16"/>
           <w:szCs w:val="16"/>
         </w:rPr>
+        <w:t xml:space="preserve"> FinTech System Design Prototype </w:t>
+      </w:r>
+    </w:p>
+    <w:p>
+      <w:pPr>
+        <w:spacing w:after="50"/>
+      </w:pPr>
+      <w:hyperlink r:id="rId21" w:history="1">
+        <w:r>
+          <w:rPr>
+            <w:color w:val="0D7377"/>
+            <w:u w:val="single"/>
+          </w:rPr>
+          <w:t>GitHub</w:t>
+        </w:r>
+      </w:hyperlink>
+      <w:r>
+        <w:rPr>
+          <w:color w:val="6B7280"/>
+          <w:sz w:val="17"/>
+          <w:szCs w:val="17"/>
+        </w:rPr>
+        <w:t xml:space="preserve">  ·  </w:t>
+      </w:r>
+      <w:hyperlink r:id="rId22" w:history="1">
+        <w:r>
+          <w:rPr>
+            <w:color w:val="0D7377"/>
+            <w:u w:val="single"/>
+          </w:rPr>
+          <w:t>LinkedIn Post</w:t>
+        </w:r>
+      </w:hyperlink>
+      <w:r>
+        <w:rPr>
+          <w:color w:val="6B7280"/>
+          <w:sz w:val="17"/>
+          <w:szCs w:val="17"/>
+        </w:rPr>
+        <w:t xml:space="preserve">  ·  </w:t>
+      </w:r>
+      <w:hyperlink r:id="rId23" w:history="1">
+        <w:r>
+          <w:rPr>
+            <w:color w:val="0D7377"/>
+            <w:u w:val="single"/>
+          </w:rPr>
+          <w:t>Project Page</w:t>
+        </w:r>
+      </w:hyperlink>
+    </w:p>
+    <w:p>
+      <w:pPr>
+        <w:pStyle w:val="ListParagraph"/>
+        <w:numPr>
+          <w:ilvl w:val="0"/>
+          <w:numId w:val="3"/>
+        </w:numPr>
+        <w:spacing w:before="30" w:after="30"/>
+      </w:pPr>
+      <w:r>
+        <w:t>Concept-level fintech system enabling a single purchase to be split across multiple payment sources simultaneously (e.g., UPI + Credit Card).</w:t>
+      </w:r>
+    </w:p>
+    <w:p>
+      <w:pPr>
+        <w:pStyle w:val="ListParagraph"/>
+        <w:numPr>
+          <w:ilvl w:val="0"/>
+          <w:numId w:val="3"/>
+        </w:numPr>
+        <w:spacing w:before="30" w:after="30"/>
+      </w:pPr>
+      <w:r>
+        <w:t>Designed transaction atomicity logic: if any one payment source fails, the entire transaction is safely rolled back no partial charges or duplicate deductions.</w:t>
+      </w:r>
+    </w:p>
+    <w:p>
+      <w:pPr>
+        <w:pStyle w:val="ListParagraph"/>
+        <w:numPr>
+          <w:ilvl w:val="0"/>
+          <w:numId w:val="3"/>
+        </w:numPr>
+        <w:spacing w:before="30" w:after="30"/>
+      </w:pPr>
+      <w:r>
+        <w:t xml:space="preserve">Integrated </w:t>
+      </w:r>
+      <w:proofErr w:type="spellStart"/>
+      <w:r>
+        <w:t>Razorpay</w:t>
+      </w:r>
+      <w:proofErr w:type="spellEnd"/>
+      <w:r>
+        <w:t xml:space="preserve"> test mode to simulate real payment gateway interactions; explored edge cases including retries, timeout failures, and partial authorization scenarios.</w:t>
+      </w:r>
+    </w:p>
+    <w:p>
+      <w:pPr>
+        <w:pStyle w:val="ListParagraph"/>
+        <w:numPr>
+          <w:ilvl w:val="0"/>
+          <w:numId w:val="3"/>
+        </w:numPr>
+        <w:spacing w:before="30" w:after="30"/>
+      </w:pPr>
+      <w:r>
+        <w:t xml:space="preserve">Tech Stack: JavaScript, Node.js, </w:t>
+      </w:r>
+      <w:proofErr w:type="spellStart"/>
+      <w:r>
+        <w:t>Razorpay</w:t>
+      </w:r>
+      <w:proofErr w:type="spellEnd"/>
+      <w:r>
+        <w:t xml:space="preserve"> (Test Mode Integration).</w:t>
+      </w:r>
+    </w:p>
+    <w:p>
+      <w:pPr>
+        <w:spacing w:before="30" w:after="30"/>
+      </w:pPr>
+    </w:p>
+    <w:p>
+      <w:pPr>
+        <w:spacing w:before="120" w:after="25"/>
+      </w:pPr>
+      <w:r>
+        <w:rPr>
+          <w:b/>
+          <w:bCs/>
+          <w:color w:val="1B3A5C"/>
+          <w:sz w:val="20"/>
+          <w:szCs w:val="20"/>
+        </w:rPr>
+        <w:br/>
+      </w:r>
+      <w:r>
+        <w:rPr>
+          <w:b/>
+          <w:bCs/>
+          <w:color w:val="1B3A5C"/>
+          <w:sz w:val="20"/>
+          <w:szCs w:val="20"/>
+        </w:rPr>
+        <w:t>5</w:t>
+      </w:r>
+      <w:r>
+        <w:rPr>
+          <w:b/>
+          <w:bCs/>
+          <w:color w:val="1B3A5C"/>
+          <w:sz w:val="20"/>
+          <w:szCs w:val="20"/>
+        </w:rPr>
+        <w:t xml:space="preserve">. </w:t>
+      </w:r>
+      <w:proofErr w:type="spellStart"/>
+      <w:r>
+        <w:rPr>
+          <w:b/>
+          <w:bCs/>
+          <w:color w:val="1B3A5C"/>
+          <w:sz w:val="20"/>
+          <w:szCs w:val="20"/>
+        </w:rPr>
+        <w:t>BookMySlot</w:t>
+      </w:r>
+      <w:proofErr w:type="spellEnd"/>
+      <w:r>
+        <w:t xml:space="preserve">  </w:t>
+      </w:r>
+      <w:r>
+        <w:rPr>
+          <w:b/>
+          <w:bCs/>
+          <w:color w:val="0D7377"/>
+          <w:sz w:val="16"/>
+          <w:szCs w:val="16"/>
+        </w:rPr>
         <w:t xml:space="preserve"> B2B SaaS Operations Real time </w:t>
       </w:r>
     </w:p>
@@ -817,7 +1321,7 @@
       <w:pPr>
         <w:spacing w:after="50"/>
       </w:pPr>
-      <w:hyperlink r:id="rId19" w:history="1">
+      <w:hyperlink r:id="rId24" w:history="1">
         <w:r>
           <w:rPr>
             <w:color w:val="0D7377"/>
@@ -834,321 +1338,6 @@
         </w:rPr>
         <w:t xml:space="preserve">  ·  </w:t>
       </w:r>
-      <w:hyperlink r:id="rId20" w:history="1">
-        <w:r>
-          <w:rPr>
-            <w:color w:val="0D7377"/>
-            <w:u w:val="single"/>
-          </w:rPr>
-          <w:t>GitHub</w:t>
-        </w:r>
-      </w:hyperlink>
-      <w:r>
-        <w:rPr>
-          <w:color w:val="6B7280"/>
-          <w:sz w:val="17"/>
-          <w:szCs w:val="17"/>
-        </w:rPr>
-        <w:t xml:space="preserve">  ·  </w:t>
-      </w:r>
-      <w:hyperlink r:id="rId21" w:history="1">
-        <w:r>
-          <w:rPr>
-            <w:color w:val="0D7377"/>
-            <w:u w:val="single"/>
-          </w:rPr>
-          <w:t>Project Page</w:t>
-        </w:r>
-      </w:hyperlink>
-    </w:p>
-    <w:p>
-      <w:pPr>
-        <w:pStyle w:val="ListParagraph"/>
-        <w:numPr>
-          <w:ilvl w:val="0"/>
-          <w:numId w:val="2"/>
-        </w:numPr>
-        <w:spacing w:before="30" w:after="30"/>
-      </w:pPr>
-      <w:r>
-        <w:t>Verticalized B2B SaaS reservation system targeting Indian small businesses (restaurants as BookMyDine, clinics as BookMyClinic) that still operate on paper, WhatsApp, and phone calls.</w:t>
-      </w:r>
-    </w:p>
-    <w:p>
-      <w:pPr>
-        <w:pStyle w:val="ListParagraph"/>
-        <w:numPr>
-          <w:ilvl w:val="0"/>
-          <w:numId w:val="2"/>
-        </w:numPr>
-        <w:spacing w:before="30" w:after="30"/>
-      </w:pPr>
-      <w:r>
-        <w:t>Designed a full system not just one app with three synchronized touchpoints: customer-facing reservation website, staff/waiter live sync app, and owner admin panel with full operational visibility.</w:t>
-      </w:r>
-    </w:p>
-    <w:p>
-      <w:pPr>
-        <w:pStyle w:val="ListParagraph"/>
-        <w:numPr>
-          <w:ilvl w:val="0"/>
-          <w:numId w:val="2"/>
-        </w:numPr>
-        <w:spacing w:before="30" w:after="30"/>
-      </w:pPr>
-      <w:r>
-        <w:t>Used Supabase real-time database to sync state instantly across all three interfaces; Google Sheets API for lightweight owner reporting.</w:t>
-      </w:r>
-    </w:p>
-    <w:p>
-      <w:pPr>
-        <w:pStyle w:val="ListParagraph"/>
-        <w:numPr>
-          <w:ilvl w:val="0"/>
-          <w:numId w:val="2"/>
-        </w:numPr>
-        <w:spacing w:before="30" w:after="30"/>
-      </w:pPr>
-      <w:r>
-        <w:t>Focused on Indian business reality: ultra-low cost, mobile-first, and simple enough for non-technical staff to operate without training.</w:t>
-      </w:r>
-    </w:p>
-    <w:p>
-      <w:pPr>
-        <w:pStyle w:val="ListParagraph"/>
-        <w:numPr>
-          <w:ilvl w:val="0"/>
-          <w:numId w:val="2"/>
-        </w:numPr>
-        <w:spacing w:before="30" w:after="30"/>
-      </w:pPr>
-      <w:r>
-        <w:t>Tech Stack: HTML/CSS/JS, Supabase (Auth + Real-time DB), Vercel, Google Sheets API.</w:t>
-      </w:r>
-    </w:p>
-    <w:p>
-      <w:pPr>
-        <w:spacing w:before="80"/>
-      </w:pPr>
-    </w:p>
-    <w:p>
-      <w:pPr>
-        <w:spacing w:before="120" w:after="25"/>
-      </w:pPr>
-      <w:r>
-        <w:rPr>
-          <w:b/>
-          <w:bCs/>
-          <w:color w:val="1B3A5C"/>
-          <w:sz w:val="20"/>
-          <w:szCs w:val="20"/>
-        </w:rPr>
-        <w:t>4. Air Guitar</w:t>
-      </w:r>
-      <w:r>
-        <w:t xml:space="preserve">  </w:t>
-      </w:r>
-      <w:r>
-        <w:rPr>
-          <w:b/>
-          <w:bCs/>
-          <w:color w:val="0D7377"/>
-          <w:sz w:val="16"/>
-          <w:szCs w:val="16"/>
-        </w:rPr>
-        <w:t xml:space="preserve"> Embedded Systems Audio Synthesis Hardware </w:t>
-      </w:r>
-    </w:p>
-    <w:p>
-      <w:pPr>
-        <w:spacing w:after="50"/>
-      </w:pPr>
-      <w:hyperlink r:id="rId22" w:history="1">
-        <w:r>
-          <w:rPr>
-            <w:color w:val="0D7377"/>
-            <w:u w:val="single"/>
-          </w:rPr>
-          <w:t>GitHub</w:t>
-        </w:r>
-      </w:hyperlink>
-      <w:r>
-        <w:rPr>
-          <w:color w:val="6B7280"/>
-          <w:sz w:val="17"/>
-          <w:szCs w:val="17"/>
-        </w:rPr>
-        <w:t xml:space="preserve">  ·  </w:t>
-      </w:r>
-      <w:hyperlink r:id="rId23" w:history="1">
-        <w:r>
-          <w:rPr>
-            <w:color w:val="0D7377"/>
-            <w:u w:val="single"/>
-          </w:rPr>
-          <w:t>LinkedIn Post</w:t>
-        </w:r>
-      </w:hyperlink>
-      <w:r>
-        <w:rPr>
-          <w:color w:val="6B7280"/>
-          <w:sz w:val="17"/>
-          <w:szCs w:val="17"/>
-        </w:rPr>
-        <w:t xml:space="preserve">  ·  </w:t>
-      </w:r>
-      <w:hyperlink r:id="rId24" w:history="1">
-        <w:r>
-          <w:rPr>
-            <w:color w:val="0D7377"/>
-            <w:u w:val="single"/>
-          </w:rPr>
-          <w:t>Project Page</w:t>
-        </w:r>
-      </w:hyperlink>
-    </w:p>
-    <w:p>
-      <w:pPr>
-        <w:pStyle w:val="ListParagraph"/>
-        <w:numPr>
-          <w:ilvl w:val="0"/>
-          <w:numId w:val="2"/>
-        </w:numPr>
-        <w:spacing w:before="30" w:after="30"/>
-      </w:pPr>
-      <w:r>
-        <w:t>Gesture-controlled virtual guitar that synthesizes string sounds in real-time using the Karplus-Strong algorithm no pre-recorded samples, making it feel like a real physical instrument.</w:t>
-      </w:r>
-    </w:p>
-    <w:p>
-      <w:pPr>
-        <w:pStyle w:val="ListParagraph"/>
-        <w:numPr>
-          <w:ilvl w:val="0"/>
-          <w:numId w:val="2"/>
-        </w:numPr>
-        <w:spacing w:before="30" w:after="30"/>
-      </w:pPr>
-      <w:r>
-        <w:t>MPU6050 IMU tracks wrist tilt (string selection) and flicking acceleration (strumming velocity); data streamed over Serial at 115200 baud to a Python audio engine.</w:t>
-      </w:r>
-    </w:p>
-    <w:p>
-      <w:pPr>
-        <w:pStyle w:val="ListParagraph"/>
-        <w:numPr>
-          <w:ilvl w:val="0"/>
-          <w:numId w:val="2"/>
-        </w:numPr>
-        <w:spacing w:before="30" w:after="30"/>
-      </w:pPr>
-      <w:r>
-        <w:t>Achieved sub-10ms latency by implementing thread-safe audio callbacks; applied delta-based calibration to mitigate Serial data jitter for a responsive 'strum' feel.</w:t>
-      </w:r>
-    </w:p>
-    <w:p>
-      <w:pPr>
-        <w:pStyle w:val="ListParagraph"/>
-        <w:numPr>
-          <w:ilvl w:val="0"/>
-          <w:numId w:val="2"/>
-        </w:numPr>
-        <w:spacing w:before="30" w:after="30"/>
-      </w:pPr>
-      <w:r>
-        <w:t>Velocity-sensitive logic adjusts synthesized sound based on acceleration magnitude, creating dynamic playing expression.</w:t>
-      </w:r>
-    </w:p>
-    <w:p>
-      <w:pPr>
-        <w:pStyle w:val="ListParagraph"/>
-        <w:numPr>
-          <w:ilvl w:val="0"/>
-          <w:numId w:val="2"/>
-        </w:numPr>
-        <w:spacing w:before="30" w:after="30"/>
-      </w:pPr>
-      <w:r>
-        <w:t>Tech Stack: Python, Arduino, MPU6050 (IMU), NumPy, Karplus-Strong Synthesis, Serial Communication (115200 baud).</w:t>
-      </w:r>
-    </w:p>
-    <w:p>
-      <w:pPr>
-        <w:spacing w:before="80"/>
-      </w:pPr>
-    </w:p>
-    <w:p>
-      <w:pPr>
-        <w:spacing w:before="120" w:after="25"/>
-      </w:pPr>
-      <w:r>
-        <w:rPr>
-          <w:b/>
-          <w:bCs/>
-          <w:color w:val="1B3A5C"/>
-          <w:sz w:val="20"/>
-          <w:szCs w:val="20"/>
-        </w:rPr>
-        <w:t xml:space="preserve">5. Indigo In-Flight </w:t>
-      </w:r>
-      <w:r>
-        <w:rPr>
-          <w:b/>
-          <w:bCs/>
-          <w:color w:val="1B3A5C"/>
-          <w:sz w:val="20"/>
-          <w:szCs w:val="20"/>
-        </w:rPr>
-        <w:t>-</w:t>
-      </w:r>
-      <w:r>
-        <w:rPr>
-          <w:b/>
-          <w:bCs/>
-          <w:color w:val="1B3A5C"/>
-          <w:sz w:val="20"/>
-          <w:szCs w:val="20"/>
-        </w:rPr>
-        <w:t xml:space="preserve"> Air-Stream</w:t>
-      </w:r>
-      <w:r>
-        <w:t xml:space="preserve">  </w:t>
-      </w:r>
-      <w:r>
-        <w:rPr>
-          <w:b/>
-          <w:bCs/>
-          <w:color w:val="0D7377"/>
-          <w:sz w:val="16"/>
-          <w:szCs w:val="16"/>
-        </w:rPr>
-        <w:t xml:space="preserve"> Systems Offline</w:t>
-      </w:r>
-      <w:r>
-        <w:rPr>
-          <w:b/>
-          <w:bCs/>
-          <w:color w:val="0D7377"/>
-          <w:sz w:val="16"/>
-          <w:szCs w:val="16"/>
-        </w:rPr>
-        <w:t xml:space="preserve"> </w:t>
-      </w:r>
-      <w:r>
-        <w:rPr>
-          <w:b/>
-          <w:bCs/>
-          <w:color w:val="0D7377"/>
-          <w:sz w:val="16"/>
-          <w:szCs w:val="16"/>
-        </w:rPr>
-        <w:t xml:space="preserve">First Web </w:t>
-      </w:r>
-    </w:p>
-    <w:p>
-      <w:pPr>
-        <w:spacing w:after="50"/>
-      </w:pPr>
       <w:hyperlink r:id="rId25" w:history="1">
         <w:r>
           <w:rPr>
@@ -1181,12 +1370,28 @@
         <w:pStyle w:val="ListParagraph"/>
         <w:numPr>
           <w:ilvl w:val="0"/>
-          <w:numId w:val="2"/>
+          <w:numId w:val="3"/>
         </w:numPr>
         <w:spacing w:before="30" w:after="30"/>
       </w:pPr>
       <w:r>
-        <w:t>Offline-first in-flight entertainment web system inspired by how airlines stream content without internet built to explore air-gapped local network constraints.</w:t>
+        <w:t xml:space="preserve">Verticalized B2B SaaS reservation system targeting Indian small businesses (restaurants as </w:t>
+      </w:r>
+      <w:proofErr w:type="spellStart"/>
+      <w:r>
+        <w:t>BookMyDine</w:t>
+      </w:r>
+      <w:proofErr w:type="spellEnd"/>
+      <w:r>
+        <w:t xml:space="preserve">, clinics as </w:t>
+      </w:r>
+      <w:proofErr w:type="spellStart"/>
+      <w:r>
+        <w:t>BookMyClinic</w:t>
+      </w:r>
+      <w:proofErr w:type="spellEnd"/>
+      <w:r>
+        <w:t>) that still operate on paper, WhatsApp, and phone calls.</w:t>
       </w:r>
     </w:p>
     <w:p>
@@ -1194,12 +1399,12 @@
         <w:pStyle w:val="ListParagraph"/>
         <w:numPr>
           <w:ilvl w:val="0"/>
-          <w:numId w:val="2"/>
+          <w:numId w:val="3"/>
         </w:numPr>
         <w:spacing w:before="30" w:after="30"/>
       </w:pPr>
       <w:r>
-        <w:t>Designed fully offline-capable frontend with no external CDN dependencies; assets load reliably over a local server without internet access.</w:t>
+        <w:t>Designed a full system not just one app with three synchronized touchpoints: customer-facing reservation website, staff/waiter live sync app, and owner admin panel with full operational visibility.</w:t>
       </w:r>
     </w:p>
     <w:p>
@@ -1207,12 +1412,20 @@
         <w:pStyle w:val="ListParagraph"/>
         <w:numPr>
           <w:ilvl w:val="0"/>
-          <w:numId w:val="2"/>
+          <w:numId w:val="3"/>
         </w:numPr>
         <w:spacing w:before="30" w:after="30"/>
       </w:pPr>
       <w:r>
-        <w:t>Architected for multi-device delivery (phones, tablets) over a local network simulating real airline seatback entertainment delivery infrastructure.</w:t>
+        <w:t xml:space="preserve">Used </w:t>
+      </w:r>
+      <w:proofErr w:type="spellStart"/>
+      <w:r>
+        <w:t>Supabase</w:t>
+      </w:r>
+      <w:proofErr w:type="spellEnd"/>
+      <w:r>
+        <w:t xml:space="preserve"> real-time database to sync state instantly across all three interfaces; Google Sheets API for lightweight owner reporting.</w:t>
       </w:r>
     </w:p>
     <w:p>
@@ -1220,18 +1433,12 @@
         <w:pStyle w:val="ListParagraph"/>
         <w:numPr>
           <w:ilvl w:val="0"/>
-          <w:numId w:val="2"/>
+          <w:numId w:val="3"/>
         </w:numPr>
         <w:spacing w:before="30" w:after="30"/>
       </w:pPr>
       <w:r>
-        <w:t xml:space="preserve">Key insight: offline systems require fundamentally different UX </w:t>
-      </w:r>
-      <w:r>
-        <w:t>assumption’s</w:t>
-      </w:r>
-      <w:r>
-        <w:t xml:space="preserve"> reliability and predictability matter more than feature richness.</w:t>
+        <w:t>Focused on Indian business reality: ultra-low cost, mobile-first, and simple enough for non-technical staff to operate without training.</w:t>
       </w:r>
     </w:p>
     <w:p>
@@ -1239,12 +1446,37 @@
         <w:pStyle w:val="ListParagraph"/>
         <w:numPr>
           <w:ilvl w:val="0"/>
-          <w:numId w:val="2"/>
+          <w:numId w:val="3"/>
         </w:numPr>
         <w:spacing w:before="30" w:after="30"/>
       </w:pPr>
       <w:r>
-        <w:t>Tech Stack: HTML, CSS, JavaScript, Offline-first architecture.</w:t>
+        <w:t xml:space="preserve">Tech Stack: HTML/CSS/JS, </w:t>
+      </w:r>
+      <w:proofErr w:type="spellStart"/>
+      <w:r>
+        <w:t>Supabase</w:t>
+      </w:r>
+      <w:proofErr w:type="spellEnd"/>
+      <w:r>
+        <w:t xml:space="preserve"> (Auth + Real-time DB</w:t>
+      </w:r>
+      <w:r>
+        <w:t>)</w:t>
+      </w:r>
+      <w:r>
+        <w:t>, firebase</w:t>
+      </w:r>
+      <w:r>
+        <w:t xml:space="preserve">, </w:t>
+      </w:r>
+      <w:proofErr w:type="spellStart"/>
+      <w:r>
+        <w:t>Vercel</w:t>
+      </w:r>
+      <w:proofErr w:type="spellEnd"/>
+      <w:r>
+        <w:t>, Google Sheets API.</w:t>
       </w:r>
     </w:p>
     <w:p>
@@ -1264,7 +1496,17 @@
           <w:sz w:val="20"/>
           <w:szCs w:val="20"/>
         </w:rPr>
-        <w:t>6. Split-Payment System</w:t>
+        <w:t>6</w:t>
+      </w:r>
+      <w:r>
+        <w:rPr>
+          <w:b/>
+          <w:bCs/>
+          <w:color w:val="1B3A5C"/>
+          <w:sz w:val="20"/>
+          <w:szCs w:val="20"/>
+        </w:rPr>
+        <w:t>. Air Guitar</w:t>
       </w:r>
       <w:r>
         <w:t xml:space="preserve">  </w:t>
@@ -1277,7 +1519,7 @@
           <w:sz w:val="16"/>
           <w:szCs w:val="16"/>
         </w:rPr>
-        <w:t xml:space="preserve"> FinTech System Design Prototype </w:t>
+        <w:t xml:space="preserve"> Embedded Systems Audio Synthesis Hardware </w:t>
       </w:r>
     </w:p>
     <w:p>
@@ -1333,12 +1575,12 @@
         <w:pStyle w:val="ListParagraph"/>
         <w:numPr>
           <w:ilvl w:val="0"/>
-          <w:numId w:val="2"/>
+          <w:numId w:val="3"/>
         </w:numPr>
         <w:spacing w:before="30" w:after="30"/>
       </w:pPr>
       <w:r>
-        <w:t>Concept-level fintech system enabling a single purchase to be split across multiple payment sources simultaneously (e.g., UPI + Credit Card).</w:t>
+        <w:t>Gesture-controlled virtual guitar that synthesizes string sounds in real-time using the Karplus-Strong algorithm no pre-recorded samples, making it feel like a real physical instrument.</w:t>
       </w:r>
     </w:p>
     <w:p>
@@ -1346,12 +1588,12 @@
         <w:pStyle w:val="ListParagraph"/>
         <w:numPr>
           <w:ilvl w:val="0"/>
-          <w:numId w:val="2"/>
+          <w:numId w:val="3"/>
         </w:numPr>
         <w:spacing w:before="30" w:after="30"/>
       </w:pPr>
       <w:r>
-        <w:t>Designed transaction atomicity logic: if any one payment source fails, the entire transaction is safely rolled back no partial charges or duplicate deductions.</w:t>
+        <w:t>MPU6050 IMU tracks wrist tilt (string selection) and flicking acceleration (strumming velocity); data streamed over Serial at 115200 baud to a Python audio engine.</w:t>
       </w:r>
     </w:p>
     <w:p>
@@ -1359,12 +1601,12 @@
         <w:pStyle w:val="ListParagraph"/>
         <w:numPr>
           <w:ilvl w:val="0"/>
-          <w:numId w:val="2"/>
+          <w:numId w:val="3"/>
         </w:numPr>
         <w:spacing w:before="30" w:after="30"/>
       </w:pPr>
       <w:r>
-        <w:t>Integrated Razorpay test mode to simulate real payment gateway interactions; explored edge cases including retries, timeout failures, and partial authorization scenarios.</w:t>
+        <w:t>Achieved sub-10ms latency by implementing thread-safe audio callbacks; applied delta-based calibration to mitigate Serial data jitter for a responsive 'strum' feel.</w:t>
       </w:r>
     </w:p>
     <w:p>
@@ -1372,12 +1614,25 @@
         <w:pStyle w:val="ListParagraph"/>
         <w:numPr>
           <w:ilvl w:val="0"/>
-          <w:numId w:val="2"/>
+          <w:numId w:val="3"/>
         </w:numPr>
         <w:spacing w:before="30" w:after="30"/>
       </w:pPr>
       <w:r>
-        <w:t>Tech Stack: JavaScript, Node.js, Razorpay (Test Mode Integration).</w:t>
+        <w:t>Velocity-sensitive logic adjusts synthesized sound based on acceleration magnitude, creating dynamic playing expression.</w:t>
+      </w:r>
+    </w:p>
+    <w:p>
+      <w:pPr>
+        <w:pStyle w:val="ListParagraph"/>
+        <w:numPr>
+          <w:ilvl w:val="0"/>
+          <w:numId w:val="3"/>
+        </w:numPr>
+        <w:spacing w:before="30" w:after="30"/>
+      </w:pPr>
+      <w:r>
+        <w:t>Tech Stack: Python, Arduino, MPU6050 (IMU), NumPy, Karplus-Strong Synthesis, Serial Communication (115200 baud).</w:t>
       </w:r>
     </w:p>
     <w:p>
@@ -1397,7 +1652,37 @@
           <w:sz w:val="20"/>
           <w:szCs w:val="20"/>
         </w:rPr>
-        <w:t>7. NotesCSBS</w:t>
+        <w:t>7</w:t>
+      </w:r>
+      <w:r>
+        <w:rPr>
+          <w:b/>
+          <w:bCs/>
+          <w:color w:val="1B3A5C"/>
+          <w:sz w:val="20"/>
+          <w:szCs w:val="20"/>
+        </w:rPr>
+        <w:t xml:space="preserve">. Indigo In-Flight </w:t>
+      </w:r>
+      <w:r>
+        <w:rPr>
+          <w:b/>
+          <w:bCs/>
+          <w:color w:val="1B3A5C"/>
+          <w:sz w:val="20"/>
+          <w:szCs w:val="20"/>
+        </w:rPr>
+        <w:t>-</w:t>
+      </w:r>
+      <w:r>
+        <w:rPr>
+          <w:b/>
+          <w:bCs/>
+          <w:color w:val="1B3A5C"/>
+          <w:sz w:val="20"/>
+          <w:szCs w:val="20"/>
+        </w:rPr>
+        <w:t xml:space="preserve"> Air-Stream</w:t>
       </w:r>
       <w:r>
         <w:t xml:space="preserve">  </w:t>
@@ -1410,7 +1695,27 @@
           <w:sz w:val="16"/>
           <w:szCs w:val="16"/>
         </w:rPr>
-        <w:t xml:space="preserve"> Productivity Academic Platform React </w:t>
+        <w:t xml:space="preserve"> Systems Offline</w:t>
+      </w:r>
+      <w:r>
+        <w:rPr>
+          <w:b/>
+          <w:bCs/>
+          <w:color w:val="0D7377"/>
+          <w:sz w:val="16"/>
+          <w:szCs w:val="16"/>
+        </w:rPr>
+        <w:t xml:space="preserve"> </w:t>
+      </w:r>
+      <w:r>
+        <w:rPr>
+          <w:b/>
+          <w:bCs/>
+          <w:color w:val="0D7377"/>
+          <w:sz w:val="16"/>
+          <w:szCs w:val="16"/>
+        </w:rPr>
+        <w:t xml:space="preserve">First Web </w:t>
       </w:r>
     </w:p>
     <w:p>
@@ -1423,7 +1728,7 @@
             <w:color w:val="0D7377"/>
             <w:u w:val="single"/>
           </w:rPr>
-          <w:t>Live Demo</w:t>
+          <w:t>GitHub</w:t>
         </w:r>
       </w:hyperlink>
       <w:r>
@@ -1449,12 +1754,12 @@
         <w:pStyle w:val="ListParagraph"/>
         <w:numPr>
           <w:ilvl w:val="0"/>
-          <w:numId w:val="2"/>
+          <w:numId w:val="3"/>
         </w:numPr>
         <w:spacing w:before="30" w:after="30"/>
       </w:pPr>
       <w:r>
-        <w:t>Centralized academic resource hub for CSBS students at BMSCE eliminating the chaos of scattered study materials across WhatsApp groups and Google Classroom.</w:t>
+        <w:t>Offline-first in-flight entertainment web system inspired by how airlines stream content without internet built to explore air-gapped local network constraints.</w:t>
       </w:r>
     </w:p>
     <w:p>
@@ -1462,12 +1767,12 @@
         <w:pStyle w:val="ListParagraph"/>
         <w:numPr>
           <w:ilvl w:val="0"/>
-          <w:numId w:val="2"/>
+          <w:numId w:val="3"/>
         </w:numPr>
         <w:spacing w:before="30" w:after="30"/>
       </w:pPr>
       <w:r>
-        <w:t>Built responsive frontend with React.js component-based architecture; integrated Supabase for real-time document storage, user authentication, and secure access control.</w:t>
+        <w:t>Designed fully offline-capable frontend with no external CDN dependencies; assets load reliably over a local server without internet access.</w:t>
       </w:r>
     </w:p>
     <w:p>
@@ -1475,24 +1780,12 @@
         <w:pStyle w:val="ListParagraph"/>
         <w:numPr>
           <w:ilvl w:val="0"/>
-          <w:numId w:val="2"/>
+          <w:numId w:val="3"/>
         </w:numPr>
         <w:spacing w:before="30" w:after="30"/>
       </w:pPr>
       <w:r>
-        <w:t>Optimized for high</w:t>
-      </w:r>
-      <w:r>
-        <w:t xml:space="preserve"> </w:t>
-      </w:r>
-      <w:r>
-        <w:t>traffic exam</w:t>
-      </w:r>
-      <w:r>
-        <w:t xml:space="preserve"> </w:t>
-      </w:r>
-      <w:r>
-        <w:t>week scenarios; platform surfaces curated content without requiring students to dig through disorganized channels.</w:t>
+        <w:t>Architected for multi-device delivery (phones, tablets) over a local network simulating real airline seatback entertainment delivery infrastructure.</w:t>
       </w:r>
     </w:p>
     <w:p>
@@ -1500,12 +1793,31 @@
         <w:pStyle w:val="ListParagraph"/>
         <w:numPr>
           <w:ilvl w:val="0"/>
-          <w:numId w:val="2"/>
+          <w:numId w:val="3"/>
         </w:numPr>
         <w:spacing w:before="30" w:after="30"/>
       </w:pPr>
       <w:r>
-        <w:t>Tech Stack: React.js, Supabase (Auth + Real-time DB), Vercel.</w:t>
+        <w:t xml:space="preserve">Key insight: offline systems require fundamentally different UX </w:t>
+      </w:r>
+      <w:r>
+        <w:t>assumption’s</w:t>
+      </w:r>
+      <w:r>
+        <w:t xml:space="preserve"> reliability and predictability matter more than feature richness.</w:t>
+      </w:r>
+    </w:p>
+    <w:p>
+      <w:pPr>
+        <w:pStyle w:val="ListParagraph"/>
+        <w:numPr>
+          <w:ilvl w:val="0"/>
+          <w:numId w:val="3"/>
+        </w:numPr>
+        <w:spacing w:before="30" w:after="30"/>
+      </w:pPr>
+      <w:r>
+        <w:t>Tech Stack: HTML, CSS, JavaScript, Offline-first architecture.</w:t>
       </w:r>
     </w:p>
     <w:p>
@@ -1514,8 +1826,6 @@
           <w:bottom w:val="single" w:sz="8" w:space="3" w:color="0D7377"/>
         </w:pBdr>
         <w:spacing w:before="260" w:after="100"/>
-      </w:pPr>
-      <w:r>
         <w:rPr>
           <w:b/>
           <w:bCs/>
@@ -1525,8 +1835,324 @@
           <w:sz w:val="21"/>
           <w:szCs w:val="21"/>
         </w:rPr>
+      </w:pPr>
+    </w:p>
+    <w:p>
+      <w:pPr>
+        <w:pBdr>
+          <w:bottom w:val="single" w:sz="8" w:space="3" w:color="0D7377"/>
+        </w:pBdr>
+        <w:spacing w:before="260" w:after="100"/>
+        <w:rPr>
+          <w:b/>
+          <w:bCs/>
+          <w:caps/>
+          <w:color w:val="1B3A5C"/>
+          <w:spacing w:val="60"/>
+          <w:sz w:val="21"/>
+          <w:szCs w:val="21"/>
+        </w:rPr>
+      </w:pPr>
+      <w:r>
+        <w:rPr>
+          <w:b/>
+          <w:bCs/>
+          <w:caps/>
+          <w:color w:val="1B3A5C"/>
+          <w:spacing w:val="60"/>
+          <w:sz w:val="21"/>
+          <w:szCs w:val="21"/>
+        </w:rPr>
         <w:lastRenderedPageBreak/>
+        <w:t>Certifications</w:t>
+      </w:r>
+    </w:p>
+    <w:p>
+      <w:pPr>
+        <w:pStyle w:val="ListParagraph"/>
+        <w:numPr>
+          <w:ilvl w:val="0"/>
+          <w:numId w:val="7"/>
+        </w:numPr>
+        <w:rPr>
+          <w:sz w:val="22"/>
+          <w:szCs w:val="22"/>
+        </w:rPr>
+      </w:pPr>
+      <w:r>
+        <w:rPr>
+          <w:sz w:val="22"/>
+          <w:szCs w:val="22"/>
+        </w:rPr>
+        <w:t xml:space="preserve">Investment Risk Management </w:t>
+      </w:r>
+      <w:r>
+        <w:rPr>
+          <w:sz w:val="22"/>
+          <w:szCs w:val="22"/>
+        </w:rPr>
+        <w:t>-</w:t>
+      </w:r>
+      <w:r>
+        <w:rPr>
+          <w:sz w:val="22"/>
+          <w:szCs w:val="22"/>
+        </w:rPr>
+        <w:t xml:space="preserve"> </w:t>
+      </w:r>
+      <w:hyperlink r:id="rId32" w:history="1">
+        <w:r>
+          <w:rPr>
+            <w:rStyle w:val="Hyperlink"/>
+            <w:sz w:val="22"/>
+            <w:szCs w:val="22"/>
+          </w:rPr>
+          <w:t>Coursera</w:t>
+        </w:r>
+      </w:hyperlink>
+      <w:r>
+        <w:rPr>
+          <w:sz w:val="22"/>
+          <w:szCs w:val="22"/>
+        </w:rPr>
+        <w:t xml:space="preserve"> (202</w:t>
+      </w:r>
+      <w:r>
+        <w:rPr>
+          <w:sz w:val="22"/>
+          <w:szCs w:val="22"/>
+        </w:rPr>
+        <w:t>5</w:t>
+      </w:r>
+      <w:r>
+        <w:rPr>
+          <w:sz w:val="22"/>
+          <w:szCs w:val="22"/>
+        </w:rPr>
+        <w:t xml:space="preserve">) </w:t>
+      </w:r>
+      <w:r>
+        <w:rPr>
+          <w:sz w:val="22"/>
+          <w:szCs w:val="22"/>
+        </w:rPr>
+        <w:br/>
+      </w:r>
+    </w:p>
+    <w:p>
+      <w:pPr>
+        <w:pStyle w:val="ListParagraph"/>
+        <w:numPr>
+          <w:ilvl w:val="0"/>
+          <w:numId w:val="7"/>
+        </w:numPr>
+        <w:rPr>
+          <w:sz w:val="22"/>
+          <w:szCs w:val="22"/>
+        </w:rPr>
+      </w:pPr>
+      <w:r>
+        <w:rPr>
+          <w:sz w:val="22"/>
+          <w:szCs w:val="22"/>
+        </w:rPr>
+        <w:t xml:space="preserve">Business Analysis &amp; Process Management </w:t>
+      </w:r>
+      <w:r>
+        <w:rPr>
+          <w:sz w:val="22"/>
+          <w:szCs w:val="22"/>
+        </w:rPr>
+        <w:t>-</w:t>
+      </w:r>
+      <w:r>
+        <w:rPr>
+          <w:sz w:val="22"/>
+          <w:szCs w:val="22"/>
+        </w:rPr>
+        <w:t xml:space="preserve"> </w:t>
+      </w:r>
+      <w:hyperlink r:id="rId33" w:history="1">
+        <w:r>
+          <w:rPr>
+            <w:rStyle w:val="Hyperlink"/>
+            <w:sz w:val="22"/>
+            <w:szCs w:val="22"/>
+          </w:rPr>
+          <w:t>Coursera</w:t>
+        </w:r>
+      </w:hyperlink>
+      <w:r>
+        <w:rPr>
+          <w:sz w:val="22"/>
+          <w:szCs w:val="22"/>
+        </w:rPr>
+        <w:t xml:space="preserve"> (202</w:t>
+      </w:r>
+      <w:r>
+        <w:rPr>
+          <w:sz w:val="22"/>
+          <w:szCs w:val="22"/>
+        </w:rPr>
+        <w:t>5</w:t>
+      </w:r>
+      <w:r>
+        <w:rPr>
+          <w:sz w:val="22"/>
+          <w:szCs w:val="22"/>
+        </w:rPr>
+        <w:t xml:space="preserve">) </w:t>
+      </w:r>
+    </w:p>
+    <w:p>
+      <w:pPr>
+        <w:pBdr>
+          <w:bottom w:val="single" w:sz="8" w:space="3" w:color="0D7377"/>
+        </w:pBdr>
+        <w:spacing w:before="260" w:after="100"/>
+        <w:rPr>
+          <w:b/>
+          <w:bCs/>
+          <w:caps/>
+          <w:color w:val="1B3A5C"/>
+          <w:spacing w:val="60"/>
+          <w:sz w:val="21"/>
+          <w:szCs w:val="21"/>
+        </w:rPr>
+      </w:pPr>
+      <w:r>
+        <w:rPr>
+          <w:b/>
+          <w:bCs/>
+          <w:caps/>
+          <w:color w:val="1B3A5C"/>
+          <w:spacing w:val="60"/>
+          <w:sz w:val="21"/>
+          <w:szCs w:val="21"/>
+        </w:rPr>
+        <w:t>Achievements</w:t>
+      </w:r>
+    </w:p>
+    <w:p>
+      <w:pPr>
+        <w:pStyle w:val="ListParagraph"/>
+        <w:numPr>
+          <w:ilvl w:val="0"/>
+          <w:numId w:val="8"/>
+        </w:numPr>
+      </w:pPr>
+      <w:r>
+        <w:t xml:space="preserve">TOP 10 </w:t>
+      </w:r>
+      <w:proofErr w:type="gramStart"/>
+      <w:r>
+        <w:t>FINALIST</w:t>
+      </w:r>
+      <w:r>
+        <w:t xml:space="preserve"> ,</w:t>
+      </w:r>
+      <w:proofErr w:type="gramEnd"/>
+      <w:r>
+        <w:t xml:space="preserve"> CONFERENCE 2.0 HACKATHON (2026) </w:t>
+      </w:r>
+      <w:r>
+        <w:br/>
+        <w:t>selected among 500+ participating teams for developing safe route, an ai-powered safer route planning</w:t>
+      </w:r>
+      <w:r>
+        <w:t xml:space="preserve"> </w:t>
+      </w:r>
+      <w:r>
+        <w:t xml:space="preserve">solution. </w:t>
+      </w:r>
+      <w:r>
+        <w:br/>
+      </w:r>
+    </w:p>
+    <w:p>
+      <w:pPr>
+        <w:pStyle w:val="ListParagraph"/>
+        <w:numPr>
+          <w:ilvl w:val="0"/>
+          <w:numId w:val="8"/>
+        </w:numPr>
+      </w:pPr>
+      <w:r>
+        <w:t xml:space="preserve">JIC ACCELERATOR 7.0 </w:t>
+      </w:r>
+      <w:r>
+        <w:t>-</w:t>
+      </w:r>
+      <w:r>
+        <w:t xml:space="preserve"> pitched pulse </w:t>
+      </w:r>
+      <w:proofErr w:type="gramStart"/>
+      <w:r>
+        <w:t>predict</w:t>
+      </w:r>
+      <w:proofErr w:type="gramEnd"/>
+      <w:r>
+        <w:t xml:space="preserve">, a low-cost embedded health-tech wearable for elderly safety and remote monitoring. </w:t>
+      </w:r>
+      <w:r>
+        <w:br/>
+      </w:r>
+    </w:p>
+    <w:p>
+      <w:pPr>
+        <w:pStyle w:val="ListParagraph"/>
+        <w:numPr>
+          <w:ilvl w:val="0"/>
+          <w:numId w:val="8"/>
+        </w:numPr>
+      </w:pPr>
+      <w:r>
+        <w:t xml:space="preserve">JAIPUR RIDE </w:t>
+      </w:r>
+      <w:r>
+        <w:t>-</w:t>
+      </w:r>
+      <w:r>
+        <w:t xml:space="preserve"> reached 1,000+ google play store downloads and 250+ monthly active users (MA</w:t>
+      </w:r>
+      <w:r>
+        <w:t>U</w:t>
+      </w:r>
+      <w:r>
+        <w:t>).</w:t>
+      </w:r>
+    </w:p>
+    <w:p>
+      <w:pPr>
+        <w:pBdr>
+          <w:bottom w:val="single" w:sz="8" w:space="3" w:color="0D7377"/>
+        </w:pBdr>
+        <w:spacing w:before="260" w:after="100"/>
+      </w:pPr>
+      <w:r>
+        <w:rPr>
+          <w:b/>
+          <w:bCs/>
+          <w:caps/>
+          <w:color w:val="1B3A5C"/>
+          <w:spacing w:val="60"/>
+          <w:sz w:val="21"/>
+          <w:szCs w:val="21"/>
+        </w:rPr>
+        <w:br/>
         <w:t>Research</w:t>
+      </w:r>
+      <w:r>
+        <w:rPr>
+          <w:b/>
+          <w:bCs/>
+          <w:caps/>
+          <w:color w:val="1B3A5C"/>
+          <w:spacing w:val="60"/>
+          <w:sz w:val="21"/>
+          <w:szCs w:val="21"/>
+        </w:rPr>
+        <w:t xml:space="preserve"> </w:t>
       </w:r>
     </w:p>
     <w:p>
@@ -1551,7 +2177,7 @@
         </w:rPr>
         <w:t xml:space="preserve">   </w:t>
       </w:r>
-      <w:hyperlink r:id="rId32" w:history="1">
+      <w:hyperlink r:id="rId34" w:history="1">
         <w:r>
           <w:rPr>
             <w:color w:val="0D7377"/>
@@ -1568,7 +2194,7 @@
         </w:rPr>
         <w:t xml:space="preserve">  ·  </w:t>
       </w:r>
-      <w:hyperlink r:id="rId33" w:history="1">
+      <w:hyperlink r:id="rId35" w:history="1">
         <w:r>
           <w:rPr>
             <w:color w:val="0D7377"/>
@@ -1658,7 +2284,7 @@
         <w:pStyle w:val="ListParagraph"/>
         <w:numPr>
           <w:ilvl w:val="0"/>
-          <w:numId w:val="2"/>
+          <w:numId w:val="3"/>
         </w:numPr>
         <w:spacing w:before="30" w:after="30"/>
       </w:pPr>
@@ -1671,7 +2297,7 @@
         <w:pStyle w:val="ListParagraph"/>
         <w:numPr>
           <w:ilvl w:val="0"/>
-          <w:numId w:val="2"/>
+          <w:numId w:val="3"/>
         </w:numPr>
         <w:spacing w:before="30" w:after="30"/>
       </w:pPr>
@@ -1684,12 +2310,30 @@
         <w:pStyle w:val="ListParagraph"/>
         <w:numPr>
           <w:ilvl w:val="0"/>
-          <w:numId w:val="2"/>
+          <w:numId w:val="3"/>
         </w:numPr>
         <w:spacing w:before="30" w:after="30"/>
       </w:pPr>
       <w:r>
-        <w:t>Defined a strict Human-in-the-Loop protocol for all active system responses ensuring safety, legal compliance, and ethical operation in maritime security contexts.</w:t>
+        <w:t>Defined a strict Human</w:t>
+      </w:r>
+      <w:r>
+        <w:t xml:space="preserve"> </w:t>
+      </w:r>
+      <w:r>
+        <w:t>in</w:t>
+      </w:r>
+      <w:r>
+        <w:t xml:space="preserve"> </w:t>
+      </w:r>
+      <w:r>
+        <w:t>the</w:t>
+      </w:r>
+      <w:r>
+        <w:t xml:space="preserve"> </w:t>
+      </w:r>
+      <w:r>
+        <w:t>Loop protocol for all active system responses ensuring safety, legal compliance, and ethical operation in maritime security contexts.</w:t>
       </w:r>
     </w:p>
     <w:p>
@@ -1697,12 +2341,17 @@
         <w:pStyle w:val="ListParagraph"/>
         <w:numPr>
           <w:ilvl w:val="0"/>
-          <w:numId w:val="2"/>
+          <w:numId w:val="3"/>
         </w:numPr>
         <w:spacing w:before="30" w:after="30"/>
       </w:pPr>
-      <w:r>
-        <w:t>Analyzed theoretical models for localization accuracy, communication range constraints, and coordination latency between dual-vehicle systems.</w:t>
+      <w:proofErr w:type="spellStart"/>
+      <w:r>
+        <w:t>Analyzed</w:t>
+      </w:r>
+      <w:proofErr w:type="spellEnd"/>
+      <w:r>
+        <w:t xml:space="preserve"> theoretical models for localization accuracy, communication range constraints, and coordination latency between dual-vehicle systems.</w:t>
       </w:r>
     </w:p>
     <w:p>
@@ -1805,7 +2454,39 @@
           <w:sz w:val="17"/>
           <w:szCs w:val="17"/>
         </w:rPr>
-        <w:t xml:space="preserve"> (up to 3rd Semester)</w:t>
+        <w:t xml:space="preserve"> (up to </w:t>
+      </w:r>
+      <w:proofErr w:type="gramStart"/>
+      <w:r>
+        <w:rPr>
+          <w:i/>
+          <w:iCs/>
+          <w:color w:val="6B7280"/>
+          <w:sz w:val="17"/>
+          <w:szCs w:val="17"/>
+        </w:rPr>
+        <w:t>4</w:t>
+      </w:r>
+      <w:r>
+        <w:rPr>
+          <w:i/>
+          <w:iCs/>
+          <w:color w:val="6B7280"/>
+          <w:sz w:val="17"/>
+          <w:szCs w:val="17"/>
+        </w:rPr>
+        <w:t>rd</w:t>
+      </w:r>
+      <w:proofErr w:type="gramEnd"/>
+      <w:r>
+        <w:rPr>
+          <w:i/>
+          <w:iCs/>
+          <w:color w:val="6B7280"/>
+          <w:sz w:val="17"/>
+          <w:szCs w:val="17"/>
+        </w:rPr>
+        <w:t xml:space="preserve"> Semester)</w:t>
       </w:r>
     </w:p>
     <w:p>
@@ -1856,8 +2537,19 @@
         </w:rPr>
         <w:t xml:space="preserve">Backend &amp; Database: </w:t>
       </w:r>
-      <w:r>
-        <w:t>Supabase (Auth + Real-time DB), Google Sheets API, Node.js, REST APIs</w:t>
+      <w:proofErr w:type="spellStart"/>
+      <w:r>
+        <w:t>Supabase</w:t>
+      </w:r>
+      <w:proofErr w:type="spellEnd"/>
+      <w:r>
+        <w:t xml:space="preserve"> (Auth + Real-time DB</w:t>
+      </w:r>
+      <w:r>
+        <w:t>), Firebase</w:t>
+      </w:r>
+      <w:r>
+        <w:t>, Google Sheets API, Node.js, REST APIs</w:t>
       </w:r>
     </w:p>
     <w:p>
@@ -1873,7 +2565,10 @@
         <w:t xml:space="preserve">Hardware &amp; Embedded: </w:t>
       </w:r>
       <w:r>
-        <w:t>ESP32, Arduino, MPU6050 (IMU), MAX30102 (SpO2), BLE/Bluetooth, I2C/UART/SPI, Sensor Fusion, C/C++ Firmware</w:t>
+        <w:t xml:space="preserve">ESP32, Arduino, MPU6050 (IMU), MAX30102 (SpO2), BLE/Bluetooth, I2C/UART/SPI, Sensor Fusion, C/C++ </w:t>
+      </w:r>
+      <w:r>
+        <w:t>Firmware, MATLAB (academic).</w:t>
       </w:r>
     </w:p>
     <w:p>
@@ -1901,7 +2596,7 @@
         <w:t>MATLAB (Academic), C</w:t>
       </w:r>
       <w:r>
-        <w:t xml:space="preserve">, C++ </w:t>
+        <w:t>, C++</w:t>
       </w:r>
     </w:p>
     <w:p>
@@ -1917,10 +2612,34 @@
         <w:t xml:space="preserve">Tools &amp; Platforms: </w:t>
       </w:r>
       <w:r>
-        <w:t>Git/GitHub, Vercel, Razorpay (Test Mode), Android (APK Build &amp; Publish), Antigravity</w:t>
-      </w:r>
-      <w:r>
-        <w:t>,VS Code</w:t>
+        <w:t xml:space="preserve">Git/GitHub, </w:t>
+      </w:r>
+      <w:proofErr w:type="spellStart"/>
+      <w:r>
+        <w:t>Vercel</w:t>
+      </w:r>
+      <w:proofErr w:type="spellEnd"/>
+      <w:r>
+        <w:t xml:space="preserve">, </w:t>
+      </w:r>
+      <w:r>
+        <w:t>Razor pay</w:t>
+      </w:r>
+      <w:r>
+        <w:t xml:space="preserve"> (Test Mode), Android (APK Build &amp; Publish), </w:t>
+      </w:r>
+      <w:proofErr w:type="spellStart"/>
+      <w:proofErr w:type="gramStart"/>
+      <w:r>
+        <w:t>Antigravity</w:t>
+      </w:r>
+      <w:r>
+        <w:t>,VS</w:t>
+      </w:r>
+      <w:proofErr w:type="spellEnd"/>
+      <w:proofErr w:type="gramEnd"/>
+      <w:r>
+        <w:t xml:space="preserve"> Code</w:t>
       </w:r>
     </w:p>
     <w:p>
@@ -1954,7 +2673,7 @@
         </w:rPr>
         <w:t xml:space="preserve">Portfolio: </w:t>
       </w:r>
-      <w:hyperlink r:id="rId34" w:history="1">
+      <w:hyperlink r:id="rId36" w:history="1">
         <w:r>
           <w:rPr>
             <w:color w:val="0D7377"/>
@@ -1971,7 +2690,7 @@
         </w:rPr>
         <w:t xml:space="preserve">  ·  All Projects: </w:t>
       </w:r>
-      <w:hyperlink r:id="rId35" w:history="1">
+      <w:hyperlink r:id="rId37" w:history="1">
         <w:r>
           <w:rPr>
             <w:color w:val="0D7377"/>
@@ -1988,7 +2707,7 @@
         </w:rPr>
         <w:t xml:space="preserve">  ·  GitHub: </w:t>
       </w:r>
-      <w:hyperlink r:id="rId36" w:history="1">
+      <w:hyperlink r:id="rId38" w:history="1">
         <w:r>
           <w:rPr>
             <w:color w:val="0D7377"/>
@@ -2021,7 +2740,7 @@
         </w:rPr>
         <w:t xml:space="preserve">  LinkedIn: </w:t>
       </w:r>
-      <w:hyperlink r:id="rId37" w:history="1">
+      <w:hyperlink r:id="rId39" w:history="1">
         <w:r>
           <w:rPr>
             <w:color w:val="0D7377"/>
@@ -2044,6 +2763,643 @@
 <file path=word/numbering.xml><?xml version="1.0" encoding="utf-8"?>
 <w:numbering xmlns:wpc="http://schemas.microsoft.com/office/word/2010/wordprocessingCanvas" xmlns:cx="http://schemas.microsoft.com/office/drawing/2014/chartex" xmlns:cx1="http://schemas.microsoft.com/office/drawing/2015/9/8/chartex" xmlns:cx2="http://schemas.microsoft.com/office/drawing/2015/10/21/chartex" xmlns:cx3="http://schemas.microsoft.com/office/drawing/2016/5/9/chartex" xmlns:cx4="http://schemas.microsoft.com/office/drawing/2016/5/10/chartex" xmlns:cx5="http://schemas.microsoft.com/office/drawing/2016/5/11/chartex" xmlns:cx6="http://schemas.microsoft.com/office/drawing/2016/5/12/chartex" xmlns:cx7="http://schemas.microsoft.com/office/drawing/2016/5/13/chartex" xmlns:cx8="http://schemas.microsoft.com/office/drawing/2016/5/14/chartex" xmlns:mc="http://schemas.openxmlformats.org/markup-compatibility/2006" xmlns:aink="http://schemas.microsoft.com/office/drawing/2016/ink" xmlns:am3d="http://schemas.microsoft.com/office/drawing/2017/model3d" xmlns:o="urn:schemas-microsoft-com:office:office" xmlns:oel="http://schemas.microsoft.com/office/2019/extlst" xmlns:r="http://schemas.openxmlformats.org/officeDocument/2006/relationships" xmlns:m="http://schemas.openxmlformats.org/officeDocument/2006/math" xmlns:v="urn:schemas-microsoft-com:vml" xmlns:wp14="http://schemas.microsoft.com/office/word/2010/wordprocessingDrawing" xmlns:wp="http://schemas.openxmlformats.org/drawingml/2006/wordprocessingDrawing" xmlns:w10="urn:schemas-microsoft-com:office:word" xmlns:w="http://schemas.openxmlformats.org/wordprocessingml/2006/main" xmlns:w14="http://schemas.microsoft.com/office/word/2010/wordml" xmlns:w15="http://schemas.microsoft.com/office/word/2012/wordml" xmlns:w16cex="http://schemas.microsoft.com/office/word/2018/wordml/cex" xmlns:w16cid="http://schemas.microsoft.com/office/word/2016/wordml/cid" xmlns:w16="http://schemas.microsoft.com/office/word/2018/wordml" xmlns:w16du="http://schemas.microsoft.com/office/word/2023/wordml/word16du" xmlns:w16sdtdh="http://schemas.microsoft.com/office/word/2020/wordml/sdtdatahash" xmlns:w16sdtfl="http://schemas.microsoft.com/office/word/2024/wordml/sdtformatlock" xmlns:w16se="http://schemas.microsoft.com/office/word/2015/wordml/symex" xmlns:wpg="http://schemas.microsoft.com/office/word/2010/wordprocessingGroup" xmlns:wpi="http://schemas.microsoft.com/office/word/2010/wordprocessingInk" xmlns:wne="http://schemas.microsoft.com/office/word/2006/wordml" xmlns:wps="http://schemas.microsoft.com/office/word/2010/wordprocessingShape" mc:Ignorable="w14 w15 w16se w16cid w16 w16cex w16sdtdh w16sdtfl w16du wp14">
   <w:abstractNum w:abstractNumId="0" w15:restartNumberingAfterBreak="0">
+    <w:nsid w:val="0DB7589C"/>
+    <w:multiLevelType w:val="multilevel"/>
+    <w:tmpl w:val="52B2F2F4"/>
+    <w:lvl w:ilvl="0">
+      <w:start w:val="1"/>
+      <w:numFmt w:val="bullet"/>
+      <w:lvlText w:val=""/>
+      <w:lvlJc w:val="left"/>
+      <w:pPr>
+        <w:tabs>
+          <w:tab w:val="num" w:pos="720"/>
+        </w:tabs>
+        <w:ind w:left="720" w:hanging="360"/>
+      </w:pPr>
+      <w:rPr>
+        <w:rFonts w:ascii="Symbol" w:hAnsi="Symbol" w:hint="default"/>
+        <w:sz w:val="20"/>
+      </w:rPr>
+    </w:lvl>
+    <w:lvl w:ilvl="1" w:tentative="1">
+      <w:start w:val="1"/>
+      <w:numFmt w:val="bullet"/>
+      <w:lvlText w:val="o"/>
+      <w:lvlJc w:val="left"/>
+      <w:pPr>
+        <w:tabs>
+          <w:tab w:val="num" w:pos="1440"/>
+        </w:tabs>
+        <w:ind w:left="1440" w:hanging="360"/>
+      </w:pPr>
+      <w:rPr>
+        <w:rFonts w:ascii="Courier New" w:hAnsi="Courier New" w:hint="default"/>
+        <w:sz w:val="20"/>
+      </w:rPr>
+    </w:lvl>
+    <w:lvl w:ilvl="2" w:tentative="1">
+      <w:start w:val="1"/>
+      <w:numFmt w:val="bullet"/>
+      <w:lvlText w:val=""/>
+      <w:lvlJc w:val="left"/>
+      <w:pPr>
+        <w:tabs>
+          <w:tab w:val="num" w:pos="2160"/>
+        </w:tabs>
+        <w:ind w:left="2160" w:hanging="360"/>
+      </w:pPr>
+      <w:rPr>
+        <w:rFonts w:ascii="Wingdings" w:hAnsi="Wingdings" w:hint="default"/>
+        <w:sz w:val="20"/>
+      </w:rPr>
+    </w:lvl>
+    <w:lvl w:ilvl="3" w:tentative="1">
+      <w:start w:val="1"/>
+      <w:numFmt w:val="bullet"/>
+      <w:lvlText w:val=""/>
+      <w:lvlJc w:val="left"/>
+      <w:pPr>
+        <w:tabs>
+          <w:tab w:val="num" w:pos="2880"/>
+        </w:tabs>
+        <w:ind w:left="2880" w:hanging="360"/>
+      </w:pPr>
+      <w:rPr>
+        <w:rFonts w:ascii="Wingdings" w:hAnsi="Wingdings" w:hint="default"/>
+        <w:sz w:val="20"/>
+      </w:rPr>
+    </w:lvl>
+    <w:lvl w:ilvl="4" w:tentative="1">
+      <w:start w:val="1"/>
+      <w:numFmt w:val="bullet"/>
+      <w:lvlText w:val=""/>
+      <w:lvlJc w:val="left"/>
+      <w:pPr>
+        <w:tabs>
+          <w:tab w:val="num" w:pos="3600"/>
+        </w:tabs>
+        <w:ind w:left="3600" w:hanging="360"/>
+      </w:pPr>
+      <w:rPr>
+        <w:rFonts w:ascii="Wingdings" w:hAnsi="Wingdings" w:hint="default"/>
+        <w:sz w:val="20"/>
+      </w:rPr>
+    </w:lvl>
+    <w:lvl w:ilvl="5" w:tentative="1">
+      <w:start w:val="1"/>
+      <w:numFmt w:val="bullet"/>
+      <w:lvlText w:val=""/>
+      <w:lvlJc w:val="left"/>
+      <w:pPr>
+        <w:tabs>
+          <w:tab w:val="num" w:pos="4320"/>
+        </w:tabs>
+        <w:ind w:left="4320" w:hanging="360"/>
+      </w:pPr>
+      <w:rPr>
+        <w:rFonts w:ascii="Wingdings" w:hAnsi="Wingdings" w:hint="default"/>
+        <w:sz w:val="20"/>
+      </w:rPr>
+    </w:lvl>
+    <w:lvl w:ilvl="6" w:tentative="1">
+      <w:start w:val="1"/>
+      <w:numFmt w:val="bullet"/>
+      <w:lvlText w:val=""/>
+      <w:lvlJc w:val="left"/>
+      <w:pPr>
+        <w:tabs>
+          <w:tab w:val="num" w:pos="5040"/>
+        </w:tabs>
+        <w:ind w:left="5040" w:hanging="360"/>
+      </w:pPr>
+      <w:rPr>
+        <w:rFonts w:ascii="Wingdings" w:hAnsi="Wingdings" w:hint="default"/>
+        <w:sz w:val="20"/>
+      </w:rPr>
+    </w:lvl>
+    <w:lvl w:ilvl="7" w:tentative="1">
+      <w:start w:val="1"/>
+      <w:numFmt w:val="bullet"/>
+      <w:lvlText w:val=""/>
+      <w:lvlJc w:val="left"/>
+      <w:pPr>
+        <w:tabs>
+          <w:tab w:val="num" w:pos="5760"/>
+        </w:tabs>
+        <w:ind w:left="5760" w:hanging="360"/>
+      </w:pPr>
+      <w:rPr>
+        <w:rFonts w:ascii="Wingdings" w:hAnsi="Wingdings" w:hint="default"/>
+        <w:sz w:val="20"/>
+      </w:rPr>
+    </w:lvl>
+    <w:lvl w:ilvl="8" w:tentative="1">
+      <w:start w:val="1"/>
+      <w:numFmt w:val="bullet"/>
+      <w:lvlText w:val=""/>
+      <w:lvlJc w:val="left"/>
+      <w:pPr>
+        <w:tabs>
+          <w:tab w:val="num" w:pos="6480"/>
+        </w:tabs>
+        <w:ind w:left="6480" w:hanging="360"/>
+      </w:pPr>
+      <w:rPr>
+        <w:rFonts w:ascii="Wingdings" w:hAnsi="Wingdings" w:hint="default"/>
+        <w:sz w:val="20"/>
+      </w:rPr>
+    </w:lvl>
+  </w:abstractNum>
+  <w:abstractNum w:abstractNumId="1" w15:restartNumberingAfterBreak="0">
+    <w:nsid w:val="10584436"/>
+    <w:multiLevelType w:val="hybridMultilevel"/>
+    <w:tmpl w:val="2A0EAF26"/>
+    <w:lvl w:ilvl="0" w:tplc="0B88E44E">
+      <w:start w:val="2"/>
+      <w:numFmt w:val="bullet"/>
+      <w:lvlText w:val=""/>
+      <w:lvlJc w:val="left"/>
+      <w:pPr>
+        <w:ind w:left="720" w:hanging="360"/>
+      </w:pPr>
+      <w:rPr>
+        <w:rFonts w:ascii="Wingdings" w:eastAsia="Arial" w:hAnsi="Wingdings" w:cs="Arial" w:hint="default"/>
+      </w:rPr>
+    </w:lvl>
+    <w:lvl w:ilvl="1" w:tplc="40090003" w:tentative="1">
+      <w:start w:val="1"/>
+      <w:numFmt w:val="bullet"/>
+      <w:lvlText w:val="o"/>
+      <w:lvlJc w:val="left"/>
+      <w:pPr>
+        <w:ind w:left="1440" w:hanging="360"/>
+      </w:pPr>
+      <w:rPr>
+        <w:rFonts w:ascii="Courier New" w:hAnsi="Courier New" w:cs="Courier New" w:hint="default"/>
+      </w:rPr>
+    </w:lvl>
+    <w:lvl w:ilvl="2" w:tplc="40090005" w:tentative="1">
+      <w:start w:val="1"/>
+      <w:numFmt w:val="bullet"/>
+      <w:lvlText w:val=""/>
+      <w:lvlJc w:val="left"/>
+      <w:pPr>
+        <w:ind w:left="2160" w:hanging="360"/>
+      </w:pPr>
+      <w:rPr>
+        <w:rFonts w:ascii="Wingdings" w:hAnsi="Wingdings" w:hint="default"/>
+      </w:rPr>
+    </w:lvl>
+    <w:lvl w:ilvl="3" w:tplc="40090001" w:tentative="1">
+      <w:start w:val="1"/>
+      <w:numFmt w:val="bullet"/>
+      <w:lvlText w:val=""/>
+      <w:lvlJc w:val="left"/>
+      <w:pPr>
+        <w:ind w:left="2880" w:hanging="360"/>
+      </w:pPr>
+      <w:rPr>
+        <w:rFonts w:ascii="Symbol" w:hAnsi="Symbol" w:hint="default"/>
+      </w:rPr>
+    </w:lvl>
+    <w:lvl w:ilvl="4" w:tplc="40090003" w:tentative="1">
+      <w:start w:val="1"/>
+      <w:numFmt w:val="bullet"/>
+      <w:lvlText w:val="o"/>
+      <w:lvlJc w:val="left"/>
+      <w:pPr>
+        <w:ind w:left="3600" w:hanging="360"/>
+      </w:pPr>
+      <w:rPr>
+        <w:rFonts w:ascii="Courier New" w:hAnsi="Courier New" w:cs="Courier New" w:hint="default"/>
+      </w:rPr>
+    </w:lvl>
+    <w:lvl w:ilvl="5" w:tplc="40090005" w:tentative="1">
+      <w:start w:val="1"/>
+      <w:numFmt w:val="bullet"/>
+      <w:lvlText w:val=""/>
+      <w:lvlJc w:val="left"/>
+      <w:pPr>
+        <w:ind w:left="4320" w:hanging="360"/>
+      </w:pPr>
+      <w:rPr>
+        <w:rFonts w:ascii="Wingdings" w:hAnsi="Wingdings" w:hint="default"/>
+      </w:rPr>
+    </w:lvl>
+    <w:lvl w:ilvl="6" w:tplc="40090001" w:tentative="1">
+      <w:start w:val="1"/>
+      <w:numFmt w:val="bullet"/>
+      <w:lvlText w:val=""/>
+      <w:lvlJc w:val="left"/>
+      <w:pPr>
+        <w:ind w:left="5040" w:hanging="360"/>
+      </w:pPr>
+      <w:rPr>
+        <w:rFonts w:ascii="Symbol" w:hAnsi="Symbol" w:hint="default"/>
+      </w:rPr>
+    </w:lvl>
+    <w:lvl w:ilvl="7" w:tplc="40090003" w:tentative="1">
+      <w:start w:val="1"/>
+      <w:numFmt w:val="bullet"/>
+      <w:lvlText w:val="o"/>
+      <w:lvlJc w:val="left"/>
+      <w:pPr>
+        <w:ind w:left="5760" w:hanging="360"/>
+      </w:pPr>
+      <w:rPr>
+        <w:rFonts w:ascii="Courier New" w:hAnsi="Courier New" w:cs="Courier New" w:hint="default"/>
+      </w:rPr>
+    </w:lvl>
+    <w:lvl w:ilvl="8" w:tplc="40090005" w:tentative="1">
+      <w:start w:val="1"/>
+      <w:numFmt w:val="bullet"/>
+      <w:lvlText w:val=""/>
+      <w:lvlJc w:val="left"/>
+      <w:pPr>
+        <w:ind w:left="6480" w:hanging="360"/>
+      </w:pPr>
+      <w:rPr>
+        <w:rFonts w:ascii="Wingdings" w:hAnsi="Wingdings" w:hint="default"/>
+      </w:rPr>
+    </w:lvl>
+  </w:abstractNum>
+  <w:abstractNum w:abstractNumId="2" w15:restartNumberingAfterBreak="0">
+    <w:nsid w:val="299330FE"/>
+    <w:multiLevelType w:val="multilevel"/>
+    <w:tmpl w:val="814CE5E4"/>
+    <w:lvl w:ilvl="0">
+      <w:start w:val="1"/>
+      <w:numFmt w:val="bullet"/>
+      <w:lvlText w:val=""/>
+      <w:lvlJc w:val="left"/>
+      <w:pPr>
+        <w:tabs>
+          <w:tab w:val="num" w:pos="720"/>
+        </w:tabs>
+        <w:ind w:left="720" w:hanging="360"/>
+      </w:pPr>
+      <w:rPr>
+        <w:rFonts w:ascii="Symbol" w:hAnsi="Symbol" w:hint="default"/>
+        <w:sz w:val="20"/>
+      </w:rPr>
+    </w:lvl>
+    <w:lvl w:ilvl="1" w:tentative="1">
+      <w:start w:val="1"/>
+      <w:numFmt w:val="bullet"/>
+      <w:lvlText w:val="o"/>
+      <w:lvlJc w:val="left"/>
+      <w:pPr>
+        <w:tabs>
+          <w:tab w:val="num" w:pos="1440"/>
+        </w:tabs>
+        <w:ind w:left="1440" w:hanging="360"/>
+      </w:pPr>
+      <w:rPr>
+        <w:rFonts w:ascii="Courier New" w:hAnsi="Courier New" w:hint="default"/>
+        <w:sz w:val="20"/>
+      </w:rPr>
+    </w:lvl>
+    <w:lvl w:ilvl="2" w:tentative="1">
+      <w:start w:val="1"/>
+      <w:numFmt w:val="bullet"/>
+      <w:lvlText w:val=""/>
+      <w:lvlJc w:val="left"/>
+      <w:pPr>
+        <w:tabs>
+          <w:tab w:val="num" w:pos="2160"/>
+        </w:tabs>
+        <w:ind w:left="2160" w:hanging="360"/>
+      </w:pPr>
+      <w:rPr>
+        <w:rFonts w:ascii="Wingdings" w:hAnsi="Wingdings" w:hint="default"/>
+        <w:sz w:val="20"/>
+      </w:rPr>
+    </w:lvl>
+    <w:lvl w:ilvl="3" w:tentative="1">
+      <w:start w:val="1"/>
+      <w:numFmt w:val="bullet"/>
+      <w:lvlText w:val=""/>
+      <w:lvlJc w:val="left"/>
+      <w:pPr>
+        <w:tabs>
+          <w:tab w:val="num" w:pos="2880"/>
+        </w:tabs>
+        <w:ind w:left="2880" w:hanging="360"/>
+      </w:pPr>
+      <w:rPr>
+        <w:rFonts w:ascii="Wingdings" w:hAnsi="Wingdings" w:hint="default"/>
+        <w:sz w:val="20"/>
+      </w:rPr>
+    </w:lvl>
+    <w:lvl w:ilvl="4" w:tentative="1">
+      <w:start w:val="1"/>
+      <w:numFmt w:val="bullet"/>
+      <w:lvlText w:val=""/>
+      <w:lvlJc w:val="left"/>
+      <w:pPr>
+        <w:tabs>
+          <w:tab w:val="num" w:pos="3600"/>
+        </w:tabs>
+        <w:ind w:left="3600" w:hanging="360"/>
+      </w:pPr>
+      <w:rPr>
+        <w:rFonts w:ascii="Wingdings" w:hAnsi="Wingdings" w:hint="default"/>
+        <w:sz w:val="20"/>
+      </w:rPr>
+    </w:lvl>
+    <w:lvl w:ilvl="5" w:tentative="1">
+      <w:start w:val="1"/>
+      <w:numFmt w:val="bullet"/>
+      <w:lvlText w:val=""/>
+      <w:lvlJc w:val="left"/>
+      <w:pPr>
+        <w:tabs>
+          <w:tab w:val="num" w:pos="4320"/>
+        </w:tabs>
+        <w:ind w:left="4320" w:hanging="360"/>
+      </w:pPr>
+      <w:rPr>
+        <w:rFonts w:ascii="Wingdings" w:hAnsi="Wingdings" w:hint="default"/>
+        <w:sz w:val="20"/>
+      </w:rPr>
+    </w:lvl>
+    <w:lvl w:ilvl="6" w:tentative="1">
+      <w:start w:val="1"/>
+      <w:numFmt w:val="bullet"/>
+      <w:lvlText w:val=""/>
+      <w:lvlJc w:val="left"/>
+      <w:pPr>
+        <w:tabs>
+          <w:tab w:val="num" w:pos="5040"/>
+        </w:tabs>
+        <w:ind w:left="5040" w:hanging="360"/>
+      </w:pPr>
+      <w:rPr>
+        <w:rFonts w:ascii="Wingdings" w:hAnsi="Wingdings" w:hint="default"/>
+        <w:sz w:val="20"/>
+      </w:rPr>
+    </w:lvl>
+    <w:lvl w:ilvl="7" w:tentative="1">
+      <w:start w:val="1"/>
+      <w:numFmt w:val="bullet"/>
+      <w:lvlText w:val=""/>
+      <w:lvlJc w:val="left"/>
+      <w:pPr>
+        <w:tabs>
+          <w:tab w:val="num" w:pos="5760"/>
+        </w:tabs>
+        <w:ind w:left="5760" w:hanging="360"/>
+      </w:pPr>
+      <w:rPr>
+        <w:rFonts w:ascii="Wingdings" w:hAnsi="Wingdings" w:hint="default"/>
+        <w:sz w:val="20"/>
+      </w:rPr>
+    </w:lvl>
+    <w:lvl w:ilvl="8" w:tentative="1">
+      <w:start w:val="1"/>
+      <w:numFmt w:val="bullet"/>
+      <w:lvlText w:val=""/>
+      <w:lvlJc w:val="left"/>
+      <w:pPr>
+        <w:tabs>
+          <w:tab w:val="num" w:pos="6480"/>
+        </w:tabs>
+        <w:ind w:left="6480" w:hanging="360"/>
+      </w:pPr>
+      <w:rPr>
+        <w:rFonts w:ascii="Wingdings" w:hAnsi="Wingdings" w:hint="default"/>
+        <w:sz w:val="20"/>
+      </w:rPr>
+    </w:lvl>
+  </w:abstractNum>
+  <w:abstractNum w:abstractNumId="3" w15:restartNumberingAfterBreak="0">
+    <w:nsid w:val="3D6F7BE1"/>
+    <w:multiLevelType w:val="hybridMultilevel"/>
+    <w:tmpl w:val="6F1C1874"/>
+    <w:lvl w:ilvl="0" w:tplc="4009000B">
+      <w:start w:val="1"/>
+      <w:numFmt w:val="bullet"/>
+      <w:lvlText w:val=""/>
+      <w:lvlJc w:val="left"/>
+      <w:pPr>
+        <w:ind w:left="720" w:hanging="360"/>
+      </w:pPr>
+      <w:rPr>
+        <w:rFonts w:ascii="Wingdings" w:hAnsi="Wingdings" w:hint="default"/>
+      </w:rPr>
+    </w:lvl>
+    <w:lvl w:ilvl="1" w:tplc="40090003" w:tentative="1">
+      <w:start w:val="1"/>
+      <w:numFmt w:val="bullet"/>
+      <w:lvlText w:val="o"/>
+      <w:lvlJc w:val="left"/>
+      <w:pPr>
+        <w:ind w:left="1440" w:hanging="360"/>
+      </w:pPr>
+      <w:rPr>
+        <w:rFonts w:ascii="Courier New" w:hAnsi="Courier New" w:cs="Courier New" w:hint="default"/>
+      </w:rPr>
+    </w:lvl>
+    <w:lvl w:ilvl="2" w:tplc="40090005" w:tentative="1">
+      <w:start w:val="1"/>
+      <w:numFmt w:val="bullet"/>
+      <w:lvlText w:val=""/>
+      <w:lvlJc w:val="left"/>
+      <w:pPr>
+        <w:ind w:left="2160" w:hanging="360"/>
+      </w:pPr>
+      <w:rPr>
+        <w:rFonts w:ascii="Wingdings" w:hAnsi="Wingdings" w:hint="default"/>
+      </w:rPr>
+    </w:lvl>
+    <w:lvl w:ilvl="3" w:tplc="40090001" w:tentative="1">
+      <w:start w:val="1"/>
+      <w:numFmt w:val="bullet"/>
+      <w:lvlText w:val=""/>
+      <w:lvlJc w:val="left"/>
+      <w:pPr>
+        <w:ind w:left="2880" w:hanging="360"/>
+      </w:pPr>
+      <w:rPr>
+        <w:rFonts w:ascii="Symbol" w:hAnsi="Symbol" w:hint="default"/>
+      </w:rPr>
+    </w:lvl>
+    <w:lvl w:ilvl="4" w:tplc="40090003" w:tentative="1">
+      <w:start w:val="1"/>
+      <w:numFmt w:val="bullet"/>
+      <w:lvlText w:val="o"/>
+      <w:lvlJc w:val="left"/>
+      <w:pPr>
+        <w:ind w:left="3600" w:hanging="360"/>
+      </w:pPr>
+      <w:rPr>
+        <w:rFonts w:ascii="Courier New" w:hAnsi="Courier New" w:cs="Courier New" w:hint="default"/>
+      </w:rPr>
+    </w:lvl>
+    <w:lvl w:ilvl="5" w:tplc="40090005" w:tentative="1">
+      <w:start w:val="1"/>
+      <w:numFmt w:val="bullet"/>
+      <w:lvlText w:val=""/>
+      <w:lvlJc w:val="left"/>
+      <w:pPr>
+        <w:ind w:left="4320" w:hanging="360"/>
+      </w:pPr>
+      <w:rPr>
+        <w:rFonts w:ascii="Wingdings" w:hAnsi="Wingdings" w:hint="default"/>
+      </w:rPr>
+    </w:lvl>
+    <w:lvl w:ilvl="6" w:tplc="40090001" w:tentative="1">
+      <w:start w:val="1"/>
+      <w:numFmt w:val="bullet"/>
+      <w:lvlText w:val=""/>
+      <w:lvlJc w:val="left"/>
+      <w:pPr>
+        <w:ind w:left="5040" w:hanging="360"/>
+      </w:pPr>
+      <w:rPr>
+        <w:rFonts w:ascii="Symbol" w:hAnsi="Symbol" w:hint="default"/>
+      </w:rPr>
+    </w:lvl>
+    <w:lvl w:ilvl="7" w:tplc="40090003" w:tentative="1">
+      <w:start w:val="1"/>
+      <w:numFmt w:val="bullet"/>
+      <w:lvlText w:val="o"/>
+      <w:lvlJc w:val="left"/>
+      <w:pPr>
+        <w:ind w:left="5760" w:hanging="360"/>
+      </w:pPr>
+      <w:rPr>
+        <w:rFonts w:ascii="Courier New" w:hAnsi="Courier New" w:cs="Courier New" w:hint="default"/>
+      </w:rPr>
+    </w:lvl>
+    <w:lvl w:ilvl="8" w:tplc="40090005" w:tentative="1">
+      <w:start w:val="1"/>
+      <w:numFmt w:val="bullet"/>
+      <w:lvlText w:val=""/>
+      <w:lvlJc w:val="left"/>
+      <w:pPr>
+        <w:ind w:left="6480" w:hanging="360"/>
+      </w:pPr>
+      <w:rPr>
+        <w:rFonts w:ascii="Wingdings" w:hAnsi="Wingdings" w:hint="default"/>
+      </w:rPr>
+    </w:lvl>
+  </w:abstractNum>
+  <w:abstractNum w:abstractNumId="4" w15:restartNumberingAfterBreak="0">
+    <w:nsid w:val="45191782"/>
+    <w:multiLevelType w:val="hybridMultilevel"/>
+    <w:tmpl w:val="105CE1F8"/>
+    <w:lvl w:ilvl="0" w:tplc="4009000B">
+      <w:start w:val="1"/>
+      <w:numFmt w:val="bullet"/>
+      <w:lvlText w:val=""/>
+      <w:lvlJc w:val="left"/>
+      <w:pPr>
+        <w:ind w:left="720" w:hanging="360"/>
+      </w:pPr>
+      <w:rPr>
+        <w:rFonts w:ascii="Wingdings" w:hAnsi="Wingdings" w:hint="default"/>
+      </w:rPr>
+    </w:lvl>
+    <w:lvl w:ilvl="1" w:tplc="40090003" w:tentative="1">
+      <w:start w:val="1"/>
+      <w:numFmt w:val="bullet"/>
+      <w:lvlText w:val="o"/>
+      <w:lvlJc w:val="left"/>
+      <w:pPr>
+        <w:ind w:left="1440" w:hanging="360"/>
+      </w:pPr>
+      <w:rPr>
+        <w:rFonts w:ascii="Courier New" w:hAnsi="Courier New" w:cs="Courier New" w:hint="default"/>
+      </w:rPr>
+    </w:lvl>
+    <w:lvl w:ilvl="2" w:tplc="40090005" w:tentative="1">
+      <w:start w:val="1"/>
+      <w:numFmt w:val="bullet"/>
+      <w:lvlText w:val=""/>
+      <w:lvlJc w:val="left"/>
+      <w:pPr>
+        <w:ind w:left="2160" w:hanging="360"/>
+      </w:pPr>
+      <w:rPr>
+        <w:rFonts w:ascii="Wingdings" w:hAnsi="Wingdings" w:hint="default"/>
+      </w:rPr>
+    </w:lvl>
+    <w:lvl w:ilvl="3" w:tplc="40090001" w:tentative="1">
+      <w:start w:val="1"/>
+      <w:numFmt w:val="bullet"/>
+      <w:lvlText w:val=""/>
+      <w:lvlJc w:val="left"/>
+      <w:pPr>
+        <w:ind w:left="2880" w:hanging="360"/>
+      </w:pPr>
+      <w:rPr>
+        <w:rFonts w:ascii="Symbol" w:hAnsi="Symbol" w:hint="default"/>
+      </w:rPr>
+    </w:lvl>
+    <w:lvl w:ilvl="4" w:tplc="40090003" w:tentative="1">
+      <w:start w:val="1"/>
+      <w:numFmt w:val="bullet"/>
+      <w:lvlText w:val="o"/>
+      <w:lvlJc w:val="left"/>
+      <w:pPr>
+        <w:ind w:left="3600" w:hanging="360"/>
+      </w:pPr>
+      <w:rPr>
+        <w:rFonts w:ascii="Courier New" w:hAnsi="Courier New" w:cs="Courier New" w:hint="default"/>
+      </w:rPr>
+    </w:lvl>
+    <w:lvl w:ilvl="5" w:tplc="40090005" w:tentative="1">
+      <w:start w:val="1"/>
+      <w:numFmt w:val="bullet"/>
+      <w:lvlText w:val=""/>
+      <w:lvlJc w:val="left"/>
+      <w:pPr>
+        <w:ind w:left="4320" w:hanging="360"/>
+      </w:pPr>
+      <w:rPr>
+        <w:rFonts w:ascii="Wingdings" w:hAnsi="Wingdings" w:hint="default"/>
+      </w:rPr>
+    </w:lvl>
+    <w:lvl w:ilvl="6" w:tplc="40090001" w:tentative="1">
+      <w:start w:val="1"/>
+      <w:numFmt w:val="bullet"/>
+      <w:lvlText w:val=""/>
+      <w:lvlJc w:val="left"/>
+      <w:pPr>
+        <w:ind w:left="5040" w:hanging="360"/>
+      </w:pPr>
+      <w:rPr>
+        <w:rFonts w:ascii="Symbol" w:hAnsi="Symbol" w:hint="default"/>
+      </w:rPr>
+    </w:lvl>
+    <w:lvl w:ilvl="7" w:tplc="40090003" w:tentative="1">
+      <w:start w:val="1"/>
+      <w:numFmt w:val="bullet"/>
+      <w:lvlText w:val="o"/>
+      <w:lvlJc w:val="left"/>
+      <w:pPr>
+        <w:ind w:left="5760" w:hanging="360"/>
+      </w:pPr>
+      <w:rPr>
+        <w:rFonts w:ascii="Courier New" w:hAnsi="Courier New" w:cs="Courier New" w:hint="default"/>
+      </w:rPr>
+    </w:lvl>
+    <w:lvl w:ilvl="8" w:tplc="40090005" w:tentative="1">
+      <w:start w:val="1"/>
+      <w:numFmt w:val="bullet"/>
+      <w:lvlText w:val=""/>
+      <w:lvlJc w:val="left"/>
+      <w:pPr>
+        <w:ind w:left="6480" w:hanging="360"/>
+      </w:pPr>
+      <w:rPr>
+        <w:rFonts w:ascii="Wingdings" w:hAnsi="Wingdings" w:hint="default"/>
+      </w:rPr>
+    </w:lvl>
+  </w:abstractNum>
+  <w:abstractNum w:abstractNumId="5" w15:restartNumberingAfterBreak="0">
     <w:nsid w:val="64E44E11"/>
     <w:multiLevelType w:val="hybridMultilevel"/>
     <w:tmpl w:val="5C6E4360"/>
@@ -2104,7 +3460,119 @@
       <w:lvlJc w:val="left"/>
     </w:lvl>
   </w:abstractNum>
-  <w:abstractNum w:abstractNumId="1" w15:restartNumberingAfterBreak="0">
+  <w:abstractNum w:abstractNumId="6" w15:restartNumberingAfterBreak="0">
+    <w:nsid w:val="6C8B58D1"/>
+    <w:multiLevelType w:val="hybridMultilevel"/>
+    <w:tmpl w:val="B9A205E6"/>
+    <w:lvl w:ilvl="0" w:tplc="AD062BEE">
+      <w:numFmt w:val="bullet"/>
+      <w:lvlText w:val=""/>
+      <w:lvlJc w:val="left"/>
+      <w:pPr>
+        <w:ind w:left="720" w:hanging="360"/>
+      </w:pPr>
+      <w:rPr>
+        <w:rFonts w:ascii="Wingdings" w:eastAsia="Arial" w:hAnsi="Wingdings" w:cs="Arial" w:hint="default"/>
+      </w:rPr>
+    </w:lvl>
+    <w:lvl w:ilvl="1" w:tplc="40090003" w:tentative="1">
+      <w:start w:val="1"/>
+      <w:numFmt w:val="bullet"/>
+      <w:lvlText w:val="o"/>
+      <w:lvlJc w:val="left"/>
+      <w:pPr>
+        <w:ind w:left="1440" w:hanging="360"/>
+      </w:pPr>
+      <w:rPr>
+        <w:rFonts w:ascii="Courier New" w:hAnsi="Courier New" w:cs="Courier New" w:hint="default"/>
+      </w:rPr>
+    </w:lvl>
+    <w:lvl w:ilvl="2" w:tplc="40090005" w:tentative="1">
+      <w:start w:val="1"/>
+      <w:numFmt w:val="bullet"/>
+      <w:lvlText w:val=""/>
+      <w:lvlJc w:val="left"/>
+      <w:pPr>
+        <w:ind w:left="2160" w:hanging="360"/>
+      </w:pPr>
+      <w:rPr>
+        <w:rFonts w:ascii="Wingdings" w:hAnsi="Wingdings" w:hint="default"/>
+      </w:rPr>
+    </w:lvl>
+    <w:lvl w:ilvl="3" w:tplc="40090001" w:tentative="1">
+      <w:start w:val="1"/>
+      <w:numFmt w:val="bullet"/>
+      <w:lvlText w:val=""/>
+      <w:lvlJc w:val="left"/>
+      <w:pPr>
+        <w:ind w:left="2880" w:hanging="360"/>
+      </w:pPr>
+      <w:rPr>
+        <w:rFonts w:ascii="Symbol" w:hAnsi="Symbol" w:hint="default"/>
+      </w:rPr>
+    </w:lvl>
+    <w:lvl w:ilvl="4" w:tplc="40090003" w:tentative="1">
+      <w:start w:val="1"/>
+      <w:numFmt w:val="bullet"/>
+      <w:lvlText w:val="o"/>
+      <w:lvlJc w:val="left"/>
+      <w:pPr>
+        <w:ind w:left="3600" w:hanging="360"/>
+      </w:pPr>
+      <w:rPr>
+        <w:rFonts w:ascii="Courier New" w:hAnsi="Courier New" w:cs="Courier New" w:hint="default"/>
+      </w:rPr>
+    </w:lvl>
+    <w:lvl w:ilvl="5" w:tplc="40090005" w:tentative="1">
+      <w:start w:val="1"/>
+      <w:numFmt w:val="bullet"/>
+      <w:lvlText w:val=""/>
+      <w:lvlJc w:val="left"/>
+      <w:pPr>
+        <w:ind w:left="4320" w:hanging="360"/>
+      </w:pPr>
+      <w:rPr>
+        <w:rFonts w:ascii="Wingdings" w:hAnsi="Wingdings" w:hint="default"/>
+      </w:rPr>
+    </w:lvl>
+    <w:lvl w:ilvl="6" w:tplc="40090001" w:tentative="1">
+      <w:start w:val="1"/>
+      <w:numFmt w:val="bullet"/>
+      <w:lvlText w:val=""/>
+      <w:lvlJc w:val="left"/>
+      <w:pPr>
+        <w:ind w:left="5040" w:hanging="360"/>
+      </w:pPr>
+      <w:rPr>
+        <w:rFonts w:ascii="Symbol" w:hAnsi="Symbol" w:hint="default"/>
+      </w:rPr>
+    </w:lvl>
+    <w:lvl w:ilvl="7" w:tplc="40090003" w:tentative="1">
+      <w:start w:val="1"/>
+      <w:numFmt w:val="bullet"/>
+      <w:lvlText w:val="o"/>
+      <w:lvlJc w:val="left"/>
+      <w:pPr>
+        <w:ind w:left="5760" w:hanging="360"/>
+      </w:pPr>
+      <w:rPr>
+        <w:rFonts w:ascii="Courier New" w:hAnsi="Courier New" w:cs="Courier New" w:hint="default"/>
+      </w:rPr>
+    </w:lvl>
+    <w:lvl w:ilvl="8" w:tplc="40090005" w:tentative="1">
+      <w:start w:val="1"/>
+      <w:numFmt w:val="bullet"/>
+      <w:lvlText w:val=""/>
+      <w:lvlJc w:val="left"/>
+      <w:pPr>
+        <w:ind w:left="6480" w:hanging="360"/>
+      </w:pPr>
+      <w:rPr>
+        <w:rFonts w:ascii="Wingdings" w:hAnsi="Wingdings" w:hint="default"/>
+      </w:rPr>
+    </w:lvl>
+  </w:abstractNum>
+  <w:abstractNum w:abstractNumId="7" w15:restartNumberingAfterBreak="0">
     <w:nsid w:val="7BF2423F"/>
     <w:multiLevelType w:val="hybridMultilevel"/>
     <w:tmpl w:val="A07667B8"/>
@@ -2191,16 +3659,34 @@
     </w:lvl>
   </w:abstractNum>
   <w:num w:numId="1" w16cid:durableId="512115948">
-    <w:abstractNumId w:val="1"/>
+    <w:abstractNumId w:val="7"/>
     <w:lvlOverride w:ilvl="0">
       <w:startOverride w:val="1"/>
     </w:lvlOverride>
   </w:num>
   <w:num w:numId="2" w16cid:durableId="1337537686">
-    <w:abstractNumId w:val="0"/>
+    <w:abstractNumId w:val="5"/>
     <w:lvlOverride w:ilvl="0">
       <w:startOverride w:val="1"/>
     </w:lvlOverride>
+  </w:num>
+  <w:num w:numId="3" w16cid:durableId="1453286405">
+    <w:abstractNumId w:val="6"/>
+  </w:num>
+  <w:num w:numId="4" w16cid:durableId="850603687">
+    <w:abstractNumId w:val="1"/>
+  </w:num>
+  <w:num w:numId="5" w16cid:durableId="586958970">
+    <w:abstractNumId w:val="0"/>
+  </w:num>
+  <w:num w:numId="6" w16cid:durableId="107284215">
+    <w:abstractNumId w:val="2"/>
+  </w:num>
+  <w:num w:numId="7" w16cid:durableId="1839685743">
+    <w:abstractNumId w:val="3"/>
+  </w:num>
+  <w:num w:numId="8" w16cid:durableId="1843659547">
+    <w:abstractNumId w:val="4"/>
   </w:num>
 </w:numbering>
 </file>
@@ -2600,6 +4086,7 @@
   <w:style w:type="paragraph" w:default="1" w:styleId="Normal">
     <w:name w:val="Normal"/>
     <w:qFormat/>
+    <w:rsid w:val="007D1B7A"/>
   </w:style>
   <w:style w:type="paragraph" w:styleId="Heading1">
     <w:name w:val="heading 1"/>
@@ -2802,6 +4289,31 @@
     <w:rPr>
       <w:sz w:val="20"/>
       <w:szCs w:val="20"/>
+    </w:rPr>
+  </w:style>
+  <w:style w:type="character" w:styleId="UnresolvedMention">
+    <w:name w:val="Unresolved Mention"/>
+    <w:basedOn w:val="DefaultParagraphFont"/>
+    <w:uiPriority w:val="99"/>
+    <w:semiHidden/>
+    <w:unhideWhenUsed/>
+    <w:rsid w:val="00D93E7D"/>
+    <w:rPr>
+      <w:color w:val="605E5C"/>
+      <w:shd w:val="clear" w:color="auto" w:fill="E1DFDD"/>
+    </w:rPr>
+  </w:style>
+  <w:style w:type="paragraph" w:styleId="NormalWeb">
+    <w:name w:val="Normal (Web)"/>
+    <w:basedOn w:val="Normal"/>
+    <w:uiPriority w:val="99"/>
+    <w:semiHidden/>
+    <w:unhideWhenUsed/>
+    <w:rsid w:val="00D93E7D"/>
+    <w:rPr>
+      <w:rFonts w:ascii="Times New Roman" w:hAnsi="Times New Roman" w:cs="Times New Roman"/>
+      <w:sz w:val="24"/>
+      <w:szCs w:val="24"/>
     </w:rPr>
   </w:style>
 </w:styles>

</xml_diff>

<commit_message>
Add RestaurantOS and FlightDeck, restore Air Guitar & Split Payment in SEO, update architecture designs
</commit_message>
<xml_diff>
--- a/Tushar_Jain_CV.docx
+++ b/Tushar_Jain_CV.docx
@@ -1,11 +1,10 @@
 
 <file path=word/document.xml><?xml version="1.0" encoding="utf-8"?>
-<w:document xmlns:wpc="http://schemas.microsoft.com/office/word/2010/wordprocessingCanvas" xmlns:cx="http://schemas.microsoft.com/office/drawing/2014/chartex" xmlns:cx1="http://schemas.microsoft.com/office/drawing/2015/9/8/chartex" xmlns:cx2="http://schemas.microsoft.com/office/drawing/2015/10/21/chartex" xmlns:cx3="http://schemas.microsoft.com/office/drawing/2016/5/9/chartex" xmlns:cx4="http://schemas.microsoft.com/office/drawing/2016/5/10/chartex" xmlns:cx5="http://schemas.microsoft.com/office/drawing/2016/5/11/chartex" xmlns:cx6="http://schemas.microsoft.com/office/drawing/2016/5/12/chartex" xmlns:cx7="http://schemas.microsoft.com/office/drawing/2016/5/13/chartex" xmlns:cx8="http://schemas.microsoft.com/office/drawing/2016/5/14/chartex" xmlns:mc="http://schemas.openxmlformats.org/markup-compatibility/2006" xmlns:aink="http://schemas.microsoft.com/office/drawing/2016/ink" xmlns:am3d="http://schemas.microsoft.com/office/drawing/2017/model3d" xmlns:o="urn:schemas-microsoft-com:office:office" xmlns:oel="http://schemas.microsoft.com/office/2019/extlst" xmlns:r="http://schemas.openxmlformats.org/officeDocument/2006/relationships" xmlns:m="http://schemas.openxmlformats.org/officeDocument/2006/math" xmlns:v="urn:schemas-microsoft-com:vml" xmlns:wp14="http://schemas.microsoft.com/office/word/2010/wordprocessingDrawing" xmlns:wp="http://schemas.openxmlformats.org/drawingml/2006/wordprocessingDrawing" xmlns:w10="urn:schemas-microsoft-com:office:word" xmlns:w="http://schemas.openxmlformats.org/wordprocessingml/2006/main" xmlns:w14="http://schemas.microsoft.com/office/word/2010/wordml" xmlns:w15="http://schemas.microsoft.com/office/word/2012/wordml" xmlns:w16cex="http://schemas.microsoft.com/office/word/2018/wordml/cex" xmlns:w16cid="http://schemas.microsoft.com/office/word/2016/wordml/cid" xmlns:w16="http://schemas.microsoft.com/office/word/2018/wordml" xmlns:w16du="http://schemas.microsoft.com/office/word/2023/wordml/word16du" xmlns:w16sdtdh="http://schemas.microsoft.com/office/word/2020/wordml/sdtdatahash" xmlns:w16sdtfl="http://schemas.microsoft.com/office/word/2024/wordml/sdtformatlock" xmlns:w16se="http://schemas.microsoft.com/office/word/2015/wordml/symex" xmlns:wpg="http://schemas.microsoft.com/office/word/2010/wordprocessingGroup" xmlns:wpi="http://schemas.microsoft.com/office/word/2010/wordprocessingInk" xmlns:wne="http://schemas.microsoft.com/office/word/2006/wordml" xmlns:wps="http://schemas.microsoft.com/office/word/2010/wordprocessingShape" mc:Ignorable="w14 w15 w16se w16cid w16 w16cex w16sdtdh w16sdtfl w16du wp14">
+<w:document xmlns:wpc="http://schemas.microsoft.com/office/word/2010/wordprocessingCanvas" xmlns:cx="http://schemas.microsoft.com/office/drawing/2014/chartex" xmlns:cx1="http://schemas.microsoft.com/office/drawing/2015/9/8/chartex" xmlns:cx2="http://schemas.microsoft.com/office/drawing/2015/10/21/chartex" xmlns:cx3="http://schemas.microsoft.com/office/drawing/2016/5/9/chartex" xmlns:cx4="http://schemas.microsoft.com/office/drawing/2016/5/10/chartex" xmlns:cx5="http://schemas.microsoft.com/office/drawing/2016/5/11/chartex" xmlns:cx6="http://schemas.microsoft.com/office/drawing/2016/5/12/chartex" xmlns:cx7="http://schemas.microsoft.com/office/drawing/2016/5/13/chartex" xmlns:cx8="http://schemas.microsoft.com/office/drawing/2016/5/14/chartex" xmlns:mc="http://schemas.openxmlformats.org/markup-compatibility/2006" xmlns:aink="http://schemas.microsoft.com/office/drawing/2016/ink" xmlns:am3d="http://schemas.microsoft.com/office/drawing/2017/model3d" xmlns:o="urn:schemas-microsoft-com:office:office" xmlns:oel="http://schemas.microsoft.com/office/2019/extlst" xmlns:r="http://schemas.openxmlformats.org/officeDocument/2006/relationships" xmlns:m="http://schemas.openxmlformats.org/officeDocument/2006/math" xmlns:v="urn:schemas-microsoft-com:vml" xmlns:wp14="http://schemas.microsoft.com/office/word/2010/wordprocessingDrawing" xmlns:wp="http://schemas.openxmlformats.org/drawingml/2006/wordprocessingDrawing" xmlns:w10="urn:schemas-microsoft-com:office:word" xmlns:w="http://schemas.openxmlformats.org/wordprocessingml/2006/main" xmlns:w14="http://schemas.microsoft.com/office/word/2010/wordml" xmlns:w15="http://schemas.microsoft.com/office/word/2012/wordml" xmlns:w16cei="http://schemas.microsoft.com/office/word/2026/wordml/cei" xmlns:w16cex="http://schemas.microsoft.com/office/word/2018/wordml/cex" xmlns:w16cid="http://schemas.microsoft.com/office/word/2016/wordml/cid" xmlns:w16="http://schemas.microsoft.com/office/word/2018/wordml" xmlns:w16du="http://schemas.microsoft.com/office/word/2023/wordml/word16du" xmlns:w16sdtdh="http://schemas.microsoft.com/office/word/2020/wordml/sdtdatahash" xmlns:w16sdtfl="http://schemas.microsoft.com/office/word/2024/wordml/sdtformatlock" xmlns:w16se="http://schemas.microsoft.com/office/word/2015/wordml/symex" xmlns:wpg="http://schemas.microsoft.com/office/word/2010/wordprocessingGroup" xmlns:wpi="http://schemas.microsoft.com/office/word/2010/wordprocessingInk" xmlns:wne="http://schemas.microsoft.com/office/word/2006/wordml" xmlns:wps="http://schemas.microsoft.com/office/word/2010/wordprocessingShape" mc:Ignorable="w14 w15 w16se w16cid w16 w16cex w16sdtdh w16sdtfl w16du wp14">
   <w:body>
     <w:p>
       <w:pPr>
         <w:spacing w:after="50"/>
-        <w:jc w:val="center"/>
       </w:pPr>
       <w:r>
         <w:rPr>
@@ -16,7 +15,17 @@
           <w:sz w:val="56"/>
           <w:szCs w:val="56"/>
         </w:rPr>
-        <w:br/>
+        <w:t xml:space="preserve">         </w:t>
+      </w:r>
+      <w:r>
+        <w:rPr>
+          <w:b/>
+          <w:bCs/>
+          <w:color w:val="1B3A5C"/>
+          <w:spacing w:val="100"/>
+          <w:sz w:val="56"/>
+          <w:szCs w:val="56"/>
+        </w:rPr>
         <w:t>TUSHAR JAIN</w:t>
       </w:r>
     </w:p>
@@ -277,7 +286,7 @@
           <w:sz w:val="20"/>
           <w:szCs w:val="20"/>
         </w:rPr>
-        <w:t>--</w:t>
+        <w:t>-</w:t>
       </w:r>
       <w:r>
         <w:rPr>
@@ -521,6 +530,16 @@
         <w:t>1. Jaipur Ride (Metro)</w:t>
       </w:r>
       <w:r>
+        <w:rPr>
+          <w:b/>
+          <w:bCs/>
+          <w:color w:val="1B3A5C"/>
+          <w:sz w:val="20"/>
+          <w:szCs w:val="20"/>
+        </w:rPr>
+        <w:t xml:space="preserve"> |</w:t>
+      </w:r>
+      <w:r>
         <w:t xml:space="preserve"> </w:t>
       </w:r>
       <w:r>
@@ -604,7 +623,7 @@
         <w:pStyle w:val="ListParagraph"/>
         <w:numPr>
           <w:ilvl w:val="0"/>
-          <w:numId w:val="4"/>
+          <w:numId w:val="12"/>
         </w:numPr>
         <w:spacing w:after="50"/>
       </w:pPr>
@@ -617,7 +636,7 @@
         <w:pStyle w:val="ListParagraph"/>
         <w:numPr>
           <w:ilvl w:val="0"/>
-          <w:numId w:val="4"/>
+          <w:numId w:val="12"/>
         </w:numPr>
         <w:spacing w:after="50"/>
       </w:pPr>
@@ -650,7 +669,7 @@
         <w:pStyle w:val="ListParagraph"/>
         <w:numPr>
           <w:ilvl w:val="0"/>
-          <w:numId w:val="4"/>
+          <w:numId w:val="12"/>
         </w:numPr>
         <w:spacing w:after="50"/>
       </w:pPr>
@@ -663,7 +682,7 @@
         <w:pStyle w:val="ListParagraph"/>
         <w:numPr>
           <w:ilvl w:val="0"/>
-          <w:numId w:val="4"/>
+          <w:numId w:val="12"/>
         </w:numPr>
         <w:spacing w:after="50"/>
       </w:pPr>
@@ -673,16 +692,14 @@
     </w:p>
     <w:p>
       <w:pPr>
+        <w:pStyle w:val="ListParagraph"/>
+        <w:numPr>
+          <w:ilvl w:val="0"/>
+          <w:numId w:val="12"/>
+        </w:numPr>
         <w:spacing w:after="50"/>
       </w:pPr>
       <w:r>
-        <w:t xml:space="preserve">        &gt;   </w:t>
-      </w:r>
-      <w:r>
-        <w:rPr>
-          <w:b/>
-          <w:bCs/>
-        </w:rPr>
         <w:t>Tech Stack:</w:t>
       </w:r>
       <w:r>
@@ -724,7 +741,14 @@
       </w:r>
       <w:proofErr w:type="spellEnd"/>
       <w:r>
-        <w:t xml:space="preserve">  </w:t>
+        <w:rPr>
+          <w:b/>
+          <w:bCs/>
+          <w:color w:val="1B3A5C"/>
+          <w:sz w:val="20"/>
+          <w:szCs w:val="20"/>
+        </w:rPr>
+        <w:t xml:space="preserve"> |</w:t>
       </w:r>
       <w:r>
         <w:rPr>
@@ -744,7 +768,8 @@
       <w:hyperlink r:id="rId17" w:history="1">
         <w:r>
           <w:rPr>
-            <w:rStyle w:val="Hyperlink"/>
+            <w:color w:val="0D7377"/>
+            <w:u w:val="single"/>
           </w:rPr>
           <w:t>Live Demo</w:t>
         </w:r>
@@ -777,7 +802,7 @@
         <w:spacing w:after="50"/>
       </w:pPr>
       <w:r>
-        <w:t xml:space="preserve">  Developed a centralized academic platform for </w:t>
+        <w:t xml:space="preserve">Developed a centralized academic platform for </w:t>
       </w:r>
       <w:r>
         <w:rPr>
@@ -800,7 +825,7 @@
         <w:spacing w:after="50"/>
       </w:pPr>
       <w:r>
-        <w:t xml:space="preserve">  Built a production-ready full-stack application with </w:t>
+        <w:t xml:space="preserve">Built a production-ready full-stack application with </w:t>
       </w:r>
       <w:r>
         <w:rPr>
@@ -826,7 +851,14 @@
           <w:b/>
           <w:bCs/>
         </w:rPr>
-        <w:t xml:space="preserve"> Authentication</w:t>
+        <w:t xml:space="preserve"> </w:t>
+      </w:r>
+      <w:r>
+        <w:rPr>
+          <w:b/>
+          <w:bCs/>
+        </w:rPr>
+        <w:t>and Google drive</w:t>
       </w:r>
       <w:r>
         <w:t xml:space="preserve">, </w:t>
@@ -862,7 +894,7 @@
         <w:spacing w:after="50"/>
       </w:pPr>
       <w:r>
-        <w:t xml:space="preserve">  Achieved </w:t>
+        <w:t xml:space="preserve">Achieved </w:t>
       </w:r>
       <w:r>
         <w:rPr>
@@ -915,7 +947,7 @@
         <w:spacing w:after="50"/>
       </w:pPr>
       <w:r>
-        <w:t xml:space="preserve">  Designed a responsive, mobile-first interface optimized for high-traffic examination periods, enabling students to quickly discover and access curated academic resources. </w:t>
+        <w:t xml:space="preserve">Designed a responsive, mobile-first interface optimized for high-traffic examination periods, enabling students to quickly discover and access curated academic resources. </w:t>
       </w:r>
     </w:p>
     <w:p>
@@ -928,10 +960,6 @@
         <w:spacing w:after="50"/>
       </w:pPr>
       <w:r>
-        <w:rPr>
-          <w:b/>
-          <w:bCs/>
-        </w:rPr>
         <w:t>Tech Stack:</w:t>
       </w:r>
       <w:r>
@@ -945,11 +973,9 @@
       <w:r>
         <w:t xml:space="preserve"> (Auth &amp; PostgreSQL), SQL, Google Drive Integration, HTML5, CSS</w:t>
       </w:r>
-      <w:proofErr w:type="gramStart"/>
-      <w:r>
-        <w:t xml:space="preserve">3,   </w:t>
-      </w:r>
-      <w:proofErr w:type="gramEnd"/>
+      <w:r>
+        <w:t xml:space="preserve">3,  </w:t>
+      </w:r>
       <w:r>
         <w:t xml:space="preserve"> </w:t>
       </w:r>
@@ -974,10 +1000,8 @@
           <w:sz w:val="20"/>
           <w:szCs w:val="20"/>
         </w:rPr>
-        <w:lastRenderedPageBreak/>
-        <w:t xml:space="preserve">3. </w:t>
-      </w:r>
-      <w:proofErr w:type="spellStart"/>
+        <w:br/>
+      </w:r>
       <w:r>
         <w:rPr>
           <w:b/>
@@ -986,9 +1010,8 @@
           <w:sz w:val="20"/>
           <w:szCs w:val="20"/>
         </w:rPr>
-        <w:t>Namma</w:t>
-      </w:r>
-      <w:proofErr w:type="spellEnd"/>
+        <w:br/>
+      </w:r>
       <w:r>
         <w:rPr>
           <w:b/>
@@ -997,7 +1020,50 @@
           <w:sz w:val="20"/>
           <w:szCs w:val="20"/>
         </w:rPr>
+        <w:lastRenderedPageBreak/>
+        <w:br/>
+      </w:r>
+      <w:r>
+        <w:rPr>
+          <w:b/>
+          <w:bCs/>
+          <w:color w:val="1B3A5C"/>
+          <w:sz w:val="20"/>
+          <w:szCs w:val="20"/>
+        </w:rPr>
+        <w:t>3. N</w:t>
+      </w:r>
+      <w:proofErr w:type="spellStart"/>
+      <w:r>
+        <w:rPr>
+          <w:b/>
+          <w:bCs/>
+          <w:color w:val="1B3A5C"/>
+          <w:sz w:val="20"/>
+          <w:szCs w:val="20"/>
+        </w:rPr>
+        <w:t>amma</w:t>
+      </w:r>
+      <w:proofErr w:type="spellEnd"/>
+      <w:r>
+        <w:rPr>
+          <w:b/>
+          <w:bCs/>
+          <w:color w:val="1B3A5C"/>
+          <w:sz w:val="20"/>
+          <w:szCs w:val="20"/>
+        </w:rPr>
         <w:t xml:space="preserve"> Ride (Bengaluru Metro)</w:t>
+      </w:r>
+      <w:r>
+        <w:rPr>
+          <w:b/>
+          <w:bCs/>
+          <w:color w:val="1B3A5C"/>
+          <w:sz w:val="20"/>
+          <w:szCs w:val="20"/>
+        </w:rPr>
+        <w:t xml:space="preserve"> |</w:t>
       </w:r>
       <w:r>
         <w:rPr>
@@ -1123,7 +1189,14 @@
         <w:t>. Split-Payment System</w:t>
       </w:r>
       <w:r>
-        <w:t xml:space="preserve">  </w:t>
+        <w:rPr>
+          <w:b/>
+          <w:bCs/>
+          <w:color w:val="1B3A5C"/>
+          <w:sz w:val="20"/>
+          <w:szCs w:val="20"/>
+        </w:rPr>
+        <w:t xml:space="preserve"> |</w:t>
       </w:r>
       <w:r>
         <w:rPr>
@@ -1256,11 +1329,6 @@
       <w:pPr>
         <w:spacing w:before="30" w:after="30"/>
       </w:pPr>
-    </w:p>
-    <w:p>
-      <w:pPr>
-        <w:spacing w:before="120" w:after="25"/>
-      </w:pPr>
       <w:r>
         <w:rPr>
           <w:b/>
@@ -1300,11 +1368,267 @@
           <w:sz w:val="20"/>
           <w:szCs w:val="20"/>
         </w:rPr>
+        <w:t>RestaurantOS</w:t>
+      </w:r>
+      <w:proofErr w:type="spellEnd"/>
+      <w:r>
+        <w:rPr>
+          <w:b/>
+          <w:bCs/>
+          <w:color w:val="1B3A5C"/>
+          <w:sz w:val="20"/>
+          <w:szCs w:val="20"/>
+        </w:rPr>
+        <w:t xml:space="preserve"> | </w:t>
+      </w:r>
+      <w:r>
+        <w:rPr>
+          <w:b/>
+          <w:bCs/>
+          <w:color w:val="1B3A5C"/>
+          <w:sz w:val="16"/>
+          <w:szCs w:val="16"/>
+        </w:rPr>
+        <w:t>Full-Stack SaaS Restaurant Management Platform</w:t>
+      </w:r>
+    </w:p>
+    <w:p>
+      <w:pPr>
+        <w:spacing w:after="50"/>
+      </w:pPr>
+      <w:hyperlink r:id="rId24" w:history="1">
+        <w:r>
+          <w:rPr>
+            <w:color w:val="0D7377"/>
+            <w:u w:val="single"/>
+          </w:rPr>
+          <w:t>GitHub</w:t>
+        </w:r>
+      </w:hyperlink>
+      <w:r>
+        <w:rPr>
+          <w:color w:val="6B7280"/>
+          <w:sz w:val="17"/>
+          <w:szCs w:val="17"/>
+        </w:rPr>
+        <w:t xml:space="preserve">  ·  </w:t>
+      </w:r>
+      <w:hyperlink r:id="rId25" w:history="1">
+        <w:r>
+          <w:rPr>
+            <w:color w:val="0D7377"/>
+            <w:u w:val="single"/>
+          </w:rPr>
+          <w:t>Project Page</w:t>
+        </w:r>
+      </w:hyperlink>
+    </w:p>
+    <w:p>
+      <w:pPr>
+        <w:pStyle w:val="ListParagraph"/>
+        <w:numPr>
+          <w:ilvl w:val="0"/>
+          <w:numId w:val="10"/>
+        </w:numPr>
+        <w:spacing w:before="30" w:after="30"/>
+        <w:rPr>
+          <w:rFonts w:ascii="Segoe UI Symbol" w:hAnsi="Segoe UI Symbol" w:cs="Segoe UI Symbol"/>
+        </w:rPr>
+      </w:pPr>
+      <w:r>
+        <w:t xml:space="preserve">Built a </w:t>
+      </w:r>
+      <w:r>
+        <w:rPr>
+          <w:b/>
+          <w:bCs/>
+        </w:rPr>
+        <w:t>multi-tenant cloud-native Restaurant Management SaaS</w:t>
+      </w:r>
+      <w:r>
+        <w:t xml:space="preserve"> that unifies POS, table management, reservations, inventory, CRM, billing, and analytics into a single platform for restaurants. </w:t>
+      </w:r>
+    </w:p>
+    <w:p>
+      <w:pPr>
+        <w:pStyle w:val="ListParagraph"/>
+        <w:numPr>
+          <w:ilvl w:val="0"/>
+          <w:numId w:val="10"/>
+        </w:numPr>
+        <w:spacing w:before="30" w:after="30"/>
+      </w:pPr>
+      <w:r>
+        <w:t xml:space="preserve">Designed a </w:t>
+      </w:r>
+      <w:r>
+        <w:rPr>
+          <w:b/>
+          <w:bCs/>
+        </w:rPr>
+        <w:t>normalized PostgreSQL database with 20+ relational tables</w:t>
+      </w:r>
+      <w:r>
+        <w:t xml:space="preserve">, UUID-based schema, ACID-compliant transactions, foreign key constraints, Row Level Security (RLS), and role-based access for secure multi-restaurant data isolation. </w:t>
+      </w:r>
+    </w:p>
+    <w:p>
+      <w:pPr>
+        <w:pStyle w:val="ListParagraph"/>
+        <w:numPr>
+          <w:ilvl w:val="0"/>
+          <w:numId w:val="10"/>
+        </w:numPr>
+        <w:spacing w:before="30" w:after="30"/>
+      </w:pPr>
+      <w:r>
+        <w:t xml:space="preserve">Developed end-to-end operational modules including </w:t>
+      </w:r>
+      <w:r>
+        <w:rPr>
+          <w:b/>
+          <w:bCs/>
+        </w:rPr>
+        <w:t>interactive floor management, menu &amp; variant management, Kitchen Order Ticket (KOT), GST billing, dynamic UPI QR payments, reservations, recipe-based inventory, vendor management, loyalty CRM, and business analytics dashboards.</w:t>
+      </w:r>
+      <w:r>
+        <w:t xml:space="preserve"> </w:t>
+      </w:r>
+    </w:p>
+    <w:p>
+      <w:pPr>
+        <w:pStyle w:val="ListParagraph"/>
+        <w:numPr>
+          <w:ilvl w:val="0"/>
+          <w:numId w:val="10"/>
+        </w:numPr>
+        <w:spacing w:before="30" w:after="30"/>
+      </w:pPr>
+      <w:r>
+        <w:t xml:space="preserve">Implemented </w:t>
+      </w:r>
+      <w:r>
+        <w:rPr>
+          <w:b/>
+          <w:bCs/>
+        </w:rPr>
+        <w:t>real-time synchronization</w:t>
+      </w:r>
+      <w:r>
+        <w:t xml:space="preserve"> using </w:t>
+      </w:r>
+      <w:proofErr w:type="spellStart"/>
+      <w:r>
+        <w:t>Supabase</w:t>
+      </w:r>
+      <w:proofErr w:type="spellEnd"/>
+      <w:r>
+        <w:t xml:space="preserve"> Realtime/</w:t>
+      </w:r>
+      <w:proofErr w:type="spellStart"/>
+      <w:r>
+        <w:t>WebSockets</w:t>
+      </w:r>
+      <w:proofErr w:type="spellEnd"/>
+      <w:r>
+        <w:t xml:space="preserve"> with PostgreSQL triggers, stored procedures, and views for live table updates, KOT routing, automated inventory deduction, and reporting. </w:t>
+      </w:r>
+    </w:p>
+    <w:p>
+      <w:pPr>
+        <w:pStyle w:val="ListParagraph"/>
+        <w:numPr>
+          <w:ilvl w:val="0"/>
+          <w:numId w:val="10"/>
+        </w:numPr>
+        <w:spacing w:before="30" w:after="30"/>
+      </w:pPr>
+      <w:r>
+        <w:t>Tech Stack:</w:t>
+      </w:r>
+      <w:r>
+        <w:t xml:space="preserve"> React, TypeScript, Vite, </w:t>
+      </w:r>
+      <w:proofErr w:type="spellStart"/>
+      <w:r>
+        <w:t>Supabase</w:t>
+      </w:r>
+      <w:proofErr w:type="spellEnd"/>
+      <w:r>
+        <w:t xml:space="preserve">, PostgreSQL, SQL, Row Level Security (RLS), </w:t>
+      </w:r>
+      <w:proofErr w:type="spellStart"/>
+      <w:r>
+        <w:t>WebSockets</w:t>
+      </w:r>
+      <w:proofErr w:type="spellEnd"/>
+      <w:r>
+        <w:t xml:space="preserve">, </w:t>
+      </w:r>
+      <w:proofErr w:type="spellStart"/>
+      <w:r>
+        <w:t>Vercel</w:t>
+      </w:r>
+      <w:proofErr w:type="spellEnd"/>
+      <w:r>
+        <w:t>.</w:t>
+      </w:r>
+    </w:p>
+    <w:p>
+      <w:pPr>
+        <w:spacing w:before="120" w:after="25"/>
+      </w:pPr>
+      <w:r>
+        <w:rPr>
+          <w:b/>
+          <w:bCs/>
+          <w:color w:val="1B3A5C"/>
+          <w:sz w:val="20"/>
+          <w:szCs w:val="20"/>
+        </w:rPr>
+        <w:br/>
+      </w:r>
+      <w:r>
+        <w:rPr>
+          <w:b/>
+          <w:bCs/>
+          <w:color w:val="1B3A5C"/>
+          <w:sz w:val="20"/>
+          <w:szCs w:val="20"/>
+        </w:rPr>
+        <w:t>6</w:t>
+      </w:r>
+      <w:r>
+        <w:rPr>
+          <w:b/>
+          <w:bCs/>
+          <w:color w:val="1B3A5C"/>
+          <w:sz w:val="20"/>
+          <w:szCs w:val="20"/>
+        </w:rPr>
+        <w:t xml:space="preserve">. </w:t>
+      </w:r>
+      <w:proofErr w:type="spellStart"/>
+      <w:r>
+        <w:rPr>
+          <w:b/>
+          <w:bCs/>
+          <w:color w:val="1B3A5C"/>
+          <w:sz w:val="20"/>
+          <w:szCs w:val="20"/>
+        </w:rPr>
         <w:t>BookMySlot</w:t>
       </w:r>
       <w:proofErr w:type="spellEnd"/>
       <w:r>
-        <w:t xml:space="preserve">  </w:t>
+        <w:rPr>
+          <w:b/>
+          <w:bCs/>
+          <w:color w:val="1B3A5C"/>
+          <w:sz w:val="20"/>
+          <w:szCs w:val="20"/>
+        </w:rPr>
+        <w:t xml:space="preserve"> |</w:t>
       </w:r>
       <w:r>
         <w:rPr>
@@ -1321,7 +1645,7 @@
       <w:pPr>
         <w:spacing w:after="50"/>
       </w:pPr>
-      <w:hyperlink r:id="rId24" w:history="1">
+      <w:hyperlink r:id="rId26" w:history="1">
         <w:r>
           <w:rPr>
             <w:color w:val="0D7377"/>
@@ -1338,194 +1662,6 @@
         </w:rPr>
         <w:t xml:space="preserve">  ·  </w:t>
       </w:r>
-      <w:hyperlink r:id="rId25" w:history="1">
-        <w:r>
-          <w:rPr>
-            <w:color w:val="0D7377"/>
-            <w:u w:val="single"/>
-          </w:rPr>
-          <w:t>GitHub</w:t>
-        </w:r>
-      </w:hyperlink>
-      <w:r>
-        <w:rPr>
-          <w:color w:val="6B7280"/>
-          <w:sz w:val="17"/>
-          <w:szCs w:val="17"/>
-        </w:rPr>
-        <w:t xml:space="preserve">  ·  </w:t>
-      </w:r>
-      <w:hyperlink r:id="rId26" w:history="1">
-        <w:r>
-          <w:rPr>
-            <w:color w:val="0D7377"/>
-            <w:u w:val="single"/>
-          </w:rPr>
-          <w:t>Project Page</w:t>
-        </w:r>
-      </w:hyperlink>
-    </w:p>
-    <w:p>
-      <w:pPr>
-        <w:pStyle w:val="ListParagraph"/>
-        <w:numPr>
-          <w:ilvl w:val="0"/>
-          <w:numId w:val="3"/>
-        </w:numPr>
-        <w:spacing w:before="30" w:after="30"/>
-      </w:pPr>
-      <w:r>
-        <w:t xml:space="preserve">Verticalized B2B SaaS reservation system targeting Indian small businesses (restaurants as </w:t>
-      </w:r>
-      <w:proofErr w:type="spellStart"/>
-      <w:r>
-        <w:t>BookMyDine</w:t>
-      </w:r>
-      <w:proofErr w:type="spellEnd"/>
-      <w:r>
-        <w:t xml:space="preserve">, clinics as </w:t>
-      </w:r>
-      <w:proofErr w:type="spellStart"/>
-      <w:r>
-        <w:t>BookMyClinic</w:t>
-      </w:r>
-      <w:proofErr w:type="spellEnd"/>
-      <w:r>
-        <w:t>) that still operate on paper, WhatsApp, and phone calls.</w:t>
-      </w:r>
-    </w:p>
-    <w:p>
-      <w:pPr>
-        <w:pStyle w:val="ListParagraph"/>
-        <w:numPr>
-          <w:ilvl w:val="0"/>
-          <w:numId w:val="3"/>
-        </w:numPr>
-        <w:spacing w:before="30" w:after="30"/>
-      </w:pPr>
-      <w:r>
-        <w:t>Designed a full system not just one app with three synchronized touchpoints: customer-facing reservation website, staff/waiter live sync app, and owner admin panel with full operational visibility.</w:t>
-      </w:r>
-    </w:p>
-    <w:p>
-      <w:pPr>
-        <w:pStyle w:val="ListParagraph"/>
-        <w:numPr>
-          <w:ilvl w:val="0"/>
-          <w:numId w:val="3"/>
-        </w:numPr>
-        <w:spacing w:before="30" w:after="30"/>
-      </w:pPr>
-      <w:r>
-        <w:t xml:space="preserve">Used </w:t>
-      </w:r>
-      <w:proofErr w:type="spellStart"/>
-      <w:r>
-        <w:t>Supabase</w:t>
-      </w:r>
-      <w:proofErr w:type="spellEnd"/>
-      <w:r>
-        <w:t xml:space="preserve"> real-time database to sync state instantly across all three interfaces; Google Sheets API for lightweight owner reporting.</w:t>
-      </w:r>
-    </w:p>
-    <w:p>
-      <w:pPr>
-        <w:pStyle w:val="ListParagraph"/>
-        <w:numPr>
-          <w:ilvl w:val="0"/>
-          <w:numId w:val="3"/>
-        </w:numPr>
-        <w:spacing w:before="30" w:after="30"/>
-      </w:pPr>
-      <w:r>
-        <w:t>Focused on Indian business reality: ultra-low cost, mobile-first, and simple enough for non-technical staff to operate without training.</w:t>
-      </w:r>
-    </w:p>
-    <w:p>
-      <w:pPr>
-        <w:pStyle w:val="ListParagraph"/>
-        <w:numPr>
-          <w:ilvl w:val="0"/>
-          <w:numId w:val="3"/>
-        </w:numPr>
-        <w:spacing w:before="30" w:after="30"/>
-      </w:pPr>
-      <w:r>
-        <w:t xml:space="preserve">Tech Stack: HTML/CSS/JS, </w:t>
-      </w:r>
-      <w:proofErr w:type="spellStart"/>
-      <w:r>
-        <w:t>Supabase</w:t>
-      </w:r>
-      <w:proofErr w:type="spellEnd"/>
-      <w:r>
-        <w:t xml:space="preserve"> (Auth + Real-time DB</w:t>
-      </w:r>
-      <w:r>
-        <w:t>)</w:t>
-      </w:r>
-      <w:r>
-        <w:t>, firebase</w:t>
-      </w:r>
-      <w:r>
-        <w:t xml:space="preserve">, </w:t>
-      </w:r>
-      <w:proofErr w:type="spellStart"/>
-      <w:r>
-        <w:t>Vercel</w:t>
-      </w:r>
-      <w:proofErr w:type="spellEnd"/>
-      <w:r>
-        <w:t>, Google Sheets API.</w:t>
-      </w:r>
-    </w:p>
-    <w:p>
-      <w:pPr>
-        <w:spacing w:before="80"/>
-      </w:pPr>
-    </w:p>
-    <w:p>
-      <w:pPr>
-        <w:spacing w:before="120" w:after="25"/>
-      </w:pPr>
-      <w:r>
-        <w:rPr>
-          <w:b/>
-          <w:bCs/>
-          <w:color w:val="1B3A5C"/>
-          <w:sz w:val="20"/>
-          <w:szCs w:val="20"/>
-        </w:rPr>
-        <w:t>6</w:t>
-      </w:r>
-      <w:r>
-        <w:rPr>
-          <w:b/>
-          <w:bCs/>
-          <w:color w:val="1B3A5C"/>
-          <w:sz w:val="20"/>
-          <w:szCs w:val="20"/>
-        </w:rPr>
-        <w:t>. Air Guitar</w:t>
-      </w:r>
-      <w:r>
-        <w:t xml:space="preserve">  </w:t>
-      </w:r>
-      <w:r>
-        <w:rPr>
-          <w:b/>
-          <w:bCs/>
-          <w:color w:val="0D7377"/>
-          <w:sz w:val="16"/>
-          <w:szCs w:val="16"/>
-        </w:rPr>
-        <w:t xml:space="preserve"> Embedded Systems Audio Synthesis Hardware </w:t>
-      </w:r>
-    </w:p>
-    <w:p>
-      <w:pPr>
-        <w:spacing w:after="50"/>
-      </w:pPr>
       <w:hyperlink r:id="rId27" w:history="1">
         <w:r>
           <w:rPr>
@@ -1549,7 +1685,238 @@
             <w:color w:val="0D7377"/>
             <w:u w:val="single"/>
           </w:rPr>
-          <w:t>LinkedIn Post</w:t>
+          <w:t>Project Page</w:t>
+        </w:r>
+      </w:hyperlink>
+    </w:p>
+    <w:p>
+      <w:pPr>
+        <w:pStyle w:val="ListParagraph"/>
+        <w:numPr>
+          <w:ilvl w:val="0"/>
+          <w:numId w:val="3"/>
+        </w:numPr>
+        <w:spacing w:before="30" w:after="30"/>
+      </w:pPr>
+      <w:r>
+        <w:t xml:space="preserve">Verticalized B2B SaaS reservation system targeting Indian small businesses (restaurants as </w:t>
+      </w:r>
+      <w:proofErr w:type="spellStart"/>
+      <w:r>
+        <w:t>BookMyDine</w:t>
+      </w:r>
+      <w:proofErr w:type="spellEnd"/>
+      <w:r>
+        <w:t xml:space="preserve">, clinics as </w:t>
+      </w:r>
+      <w:proofErr w:type="spellStart"/>
+      <w:r>
+        <w:t>BookMyClinic</w:t>
+      </w:r>
+      <w:proofErr w:type="spellEnd"/>
+      <w:r>
+        <w:t>) that still operate on paper, WhatsApp, and phone calls.</w:t>
+      </w:r>
+    </w:p>
+    <w:p>
+      <w:pPr>
+        <w:pStyle w:val="ListParagraph"/>
+        <w:numPr>
+          <w:ilvl w:val="0"/>
+          <w:numId w:val="3"/>
+        </w:numPr>
+        <w:spacing w:before="30" w:after="30"/>
+      </w:pPr>
+      <w:r>
+        <w:t>Designed a full system not just one app with three synchronized touchpoints: customer-facing reservation website, staff/waiter live sync app, and owner admin panel with full operational visibility.</w:t>
+      </w:r>
+    </w:p>
+    <w:p>
+      <w:pPr>
+        <w:pStyle w:val="ListParagraph"/>
+        <w:numPr>
+          <w:ilvl w:val="0"/>
+          <w:numId w:val="3"/>
+        </w:numPr>
+        <w:spacing w:before="30" w:after="30"/>
+      </w:pPr>
+      <w:r>
+        <w:t xml:space="preserve">Used </w:t>
+      </w:r>
+      <w:proofErr w:type="spellStart"/>
+      <w:r>
+        <w:t>Supabase</w:t>
+      </w:r>
+      <w:proofErr w:type="spellEnd"/>
+      <w:r>
+        <w:t xml:space="preserve"> real-time database to sync state instantly across all three interfaces; Google Sheets API for lightweight owner reporting.</w:t>
+      </w:r>
+    </w:p>
+    <w:p>
+      <w:pPr>
+        <w:pStyle w:val="ListParagraph"/>
+        <w:numPr>
+          <w:ilvl w:val="0"/>
+          <w:numId w:val="3"/>
+        </w:numPr>
+        <w:spacing w:before="30" w:after="30"/>
+      </w:pPr>
+      <w:r>
+        <w:t>Focused on Indian business reality: ultra-low cost, mobile-first, and simple enough for non-technical staff to operate without training.</w:t>
+      </w:r>
+    </w:p>
+    <w:p>
+      <w:pPr>
+        <w:pStyle w:val="ListParagraph"/>
+        <w:numPr>
+          <w:ilvl w:val="0"/>
+          <w:numId w:val="3"/>
+        </w:numPr>
+        <w:spacing w:before="30" w:after="30"/>
+      </w:pPr>
+      <w:r>
+        <w:t xml:space="preserve">Tech Stack: HTML/CSS/JS, </w:t>
+      </w:r>
+      <w:proofErr w:type="spellStart"/>
+      <w:r>
+        <w:t>Supabase</w:t>
+      </w:r>
+      <w:proofErr w:type="spellEnd"/>
+      <w:r>
+        <w:t xml:space="preserve"> (Auth + Real-time DB</w:t>
+      </w:r>
+      <w:r>
+        <w:t>)</w:t>
+      </w:r>
+      <w:r>
+        <w:t>, firebase</w:t>
+      </w:r>
+      <w:r>
+        <w:t xml:space="preserve">, </w:t>
+      </w:r>
+      <w:proofErr w:type="spellStart"/>
+      <w:r>
+        <w:t>Vercel</w:t>
+      </w:r>
+      <w:proofErr w:type="spellEnd"/>
+      <w:r>
+        <w:t>, Google Sheets API.</w:t>
+      </w:r>
+    </w:p>
+    <w:p>
+      <w:pPr>
+        <w:spacing w:before="80"/>
+      </w:pPr>
+    </w:p>
+    <w:p>
+      <w:pPr>
+        <w:spacing w:before="120" w:after="25"/>
+      </w:pPr>
+      <w:r>
+        <w:rPr>
+          <w:b/>
+          <w:bCs/>
+          <w:color w:val="1B3A5C"/>
+          <w:sz w:val="20"/>
+          <w:szCs w:val="20"/>
+        </w:rPr>
+        <w:t>7</w:t>
+      </w:r>
+      <w:r>
+        <w:rPr>
+          <w:b/>
+          <w:bCs/>
+          <w:color w:val="1B3A5C"/>
+          <w:sz w:val="20"/>
+          <w:szCs w:val="20"/>
+        </w:rPr>
+        <w:t xml:space="preserve">. Indigo In-Flight </w:t>
+      </w:r>
+      <w:r>
+        <w:rPr>
+          <w:b/>
+          <w:bCs/>
+          <w:color w:val="1B3A5C"/>
+          <w:sz w:val="20"/>
+          <w:szCs w:val="20"/>
+        </w:rPr>
+        <w:t>-</w:t>
+      </w:r>
+      <w:r>
+        <w:rPr>
+          <w:b/>
+          <w:bCs/>
+          <w:color w:val="1B3A5C"/>
+          <w:sz w:val="20"/>
+          <w:szCs w:val="20"/>
+        </w:rPr>
+        <w:t xml:space="preserve"> </w:t>
+      </w:r>
+      <w:r>
+        <w:rPr>
+          <w:b/>
+          <w:bCs/>
+          <w:color w:val="1B3A5C"/>
+          <w:sz w:val="20"/>
+          <w:szCs w:val="20"/>
+        </w:rPr>
+        <w:t>Airstream</w:t>
+      </w:r>
+      <w:r>
+        <w:rPr>
+          <w:b/>
+          <w:bCs/>
+          <w:color w:val="1B3A5C"/>
+          <w:sz w:val="20"/>
+          <w:szCs w:val="20"/>
+        </w:rPr>
+        <w:t xml:space="preserve"> |</w:t>
+      </w:r>
+      <w:r>
+        <w:t xml:space="preserve"> </w:t>
+      </w:r>
+      <w:r>
+        <w:rPr>
+          <w:b/>
+          <w:bCs/>
+          <w:color w:val="0D7377"/>
+          <w:sz w:val="16"/>
+          <w:szCs w:val="16"/>
+        </w:rPr>
+        <w:t>Systems Offline</w:t>
+      </w:r>
+      <w:r>
+        <w:rPr>
+          <w:b/>
+          <w:bCs/>
+          <w:color w:val="0D7377"/>
+          <w:sz w:val="16"/>
+          <w:szCs w:val="16"/>
+        </w:rPr>
+        <w:t xml:space="preserve"> </w:t>
+      </w:r>
+      <w:r>
+        <w:rPr>
+          <w:b/>
+          <w:bCs/>
+          <w:color w:val="0D7377"/>
+          <w:sz w:val="16"/>
+          <w:szCs w:val="16"/>
+        </w:rPr>
+        <w:t xml:space="preserve">First Web </w:t>
+      </w:r>
+    </w:p>
+    <w:p>
+      <w:pPr>
+        <w:spacing w:after="50"/>
+      </w:pPr>
+      <w:hyperlink r:id="rId29" w:history="1">
+        <w:r>
+          <w:rPr>
+            <w:color w:val="0D7377"/>
+            <w:u w:val="single"/>
+          </w:rPr>
+          <w:t>GitHub</w:t>
         </w:r>
       </w:hyperlink>
       <w:r>
@@ -1560,7 +1927,7 @@
         </w:rPr>
         <w:t xml:space="preserve">  ·  </w:t>
       </w:r>
-      <w:hyperlink r:id="rId29" w:history="1">
+      <w:hyperlink r:id="rId30" w:history="1">
         <w:r>
           <w:rPr>
             <w:color w:val="0D7377"/>
@@ -1580,7 +1947,7 @@
         <w:spacing w:before="30" w:after="30"/>
       </w:pPr>
       <w:r>
-        <w:t>Gesture-controlled virtual guitar that synthesizes string sounds in real-time using the Karplus-Strong algorithm no pre-recorded samples, making it feel like a real physical instrument.</w:t>
+        <w:t>Offline-first in-flight entertainment web system inspired by how airlines stream content without internet built to explore air-gapped local network constraints.</w:t>
       </w:r>
     </w:p>
     <w:p>
@@ -1593,7 +1960,7 @@
         <w:spacing w:before="30" w:after="30"/>
       </w:pPr>
       <w:r>
-        <w:t>MPU6050 IMU tracks wrist tilt (string selection) and flicking acceleration (strumming velocity); data streamed over Serial at 115200 baud to a Python audio engine.</w:t>
+        <w:t>Designed fully offline-capable frontend with no external CDN dependencies; assets load reliably over a local server without internet access.</w:t>
       </w:r>
     </w:p>
     <w:p>
@@ -1606,7 +1973,7 @@
         <w:spacing w:before="30" w:after="30"/>
       </w:pPr>
       <w:r>
-        <w:t>Achieved sub-10ms latency by implementing thread-safe audio callbacks; applied delta-based calibration to mitigate Serial data jitter for a responsive 'strum' feel.</w:t>
+        <w:t>Architected for multi-device delivery (phones, tablets) over a local network simulating real airline seatback entertainment delivery infrastructure.</w:t>
       </w:r>
     </w:p>
     <w:p>
@@ -1619,7 +1986,13 @@
         <w:spacing w:before="30" w:after="30"/>
       </w:pPr>
       <w:r>
-        <w:t>Velocity-sensitive logic adjusts synthesized sound based on acceleration magnitude, creating dynamic playing expression.</w:t>
+        <w:t xml:space="preserve">Key insight: offline systems require fundamentally different UX </w:t>
+      </w:r>
+      <w:r>
+        <w:t>assumption’s</w:t>
+      </w:r>
+      <w:r>
+        <w:t xml:space="preserve"> reliability and predictability matter more than feature richness.</w:t>
       </w:r>
     </w:p>
     <w:p>
@@ -1632,19 +2005,17 @@
         <w:spacing w:before="30" w:after="30"/>
       </w:pPr>
       <w:r>
-        <w:t>Tech Stack: Python, Arduino, MPU6050 (IMU), NumPy, Karplus-Strong Synthesis, Serial Communication (115200 baud).</w:t>
-      </w:r>
-    </w:p>
-    <w:p>
-      <w:pPr>
-        <w:spacing w:before="80"/>
+        <w:t>Tech Stack: HTML, CSS, JavaScript, Offline-first architecture.</w:t>
+      </w:r>
+    </w:p>
+    <w:p>
+      <w:pPr>
+        <w:spacing w:before="30" w:after="30"/>
       </w:pPr>
     </w:p>
     <w:p>
       <w:pPr>
         <w:spacing w:before="120" w:after="25"/>
-      </w:pPr>
-      <w:r>
         <w:rPr>
           <w:b/>
           <w:bCs/>
@@ -1652,8 +2023,12 @@
           <w:sz w:val="20"/>
           <w:szCs w:val="20"/>
         </w:rPr>
-        <w:t>7</w:t>
-      </w:r>
+      </w:pPr>
+    </w:p>
+    <w:p>
+      <w:pPr>
+        <w:spacing w:before="120" w:after="25"/>
+      </w:pPr>
       <w:r>
         <w:rPr>
           <w:b/>
@@ -1662,7 +2037,8 @@
           <w:sz w:val="20"/>
           <w:szCs w:val="20"/>
         </w:rPr>
-        <w:t xml:space="preserve">. Indigo In-Flight </w:t>
+        <w:lastRenderedPageBreak/>
+        <w:t>8</w:t>
       </w:r>
       <w:r>
         <w:rPr>
@@ -1672,8 +2048,9 @@
           <w:sz w:val="20"/>
           <w:szCs w:val="20"/>
         </w:rPr>
-        <w:t>-</w:t>
-      </w:r>
+        <w:t xml:space="preserve">. </w:t>
+      </w:r>
+      <w:proofErr w:type="spellStart"/>
       <w:r>
         <w:rPr>
           <w:b/>
@@ -1682,47 +2059,45 @@
           <w:sz w:val="20"/>
           <w:szCs w:val="20"/>
         </w:rPr>
-        <w:t xml:space="preserve"> Air-Stream</w:t>
-      </w:r>
-      <w:r>
-        <w:t xml:space="preserve">  </w:t>
-      </w:r>
-      <w:r>
-        <w:rPr>
-          <w:b/>
-          <w:bCs/>
-          <w:color w:val="0D7377"/>
+        <w:t>FlightDeck</w:t>
+      </w:r>
+      <w:proofErr w:type="spellEnd"/>
+      <w:r>
+        <w:rPr>
+          <w:b/>
+          <w:bCs/>
+          <w:color w:val="1B3A5C"/>
+          <w:sz w:val="20"/>
+          <w:szCs w:val="20"/>
+        </w:rPr>
+        <w:t xml:space="preserve"> |</w:t>
+      </w:r>
+      <w:r>
+        <w:rPr>
+          <w:b/>
+          <w:bCs/>
+          <w:color w:val="1B3A5C"/>
           <w:sz w:val="16"/>
           <w:szCs w:val="16"/>
         </w:rPr>
-        <w:t xml:space="preserve"> Systems Offline</w:t>
-      </w:r>
-      <w:r>
-        <w:rPr>
-          <w:b/>
-          <w:bCs/>
-          <w:color w:val="0D7377"/>
+        <w:t xml:space="preserve"> </w:t>
+      </w:r>
+      <w:r>
+        <w:rPr>
+          <w:b/>
+          <w:bCs/>
+          <w:color w:val="1B3A5C"/>
           <w:sz w:val="16"/>
           <w:szCs w:val="16"/>
         </w:rPr>
-        <w:t xml:space="preserve"> </w:t>
-      </w:r>
-      <w:r>
-        <w:rPr>
-          <w:b/>
-          <w:bCs/>
-          <w:color w:val="0D7377"/>
-          <w:sz w:val="16"/>
-          <w:szCs w:val="16"/>
-        </w:rPr>
-        <w:t xml:space="preserve">First Web </w:t>
+        <w:t>Real-Time Flight Tracking &amp; Aviation Information Platform</w:t>
       </w:r>
     </w:p>
     <w:p>
       <w:pPr>
         <w:spacing w:after="50"/>
       </w:pPr>
-      <w:hyperlink r:id="rId30" w:history="1">
+      <w:hyperlink r:id="rId31" w:history="1">
         <w:r>
           <w:rPr>
             <w:color w:val="0D7377"/>
@@ -1739,27 +2114,53 @@
         </w:rPr>
         <w:t xml:space="preserve">  ·  </w:t>
       </w:r>
-      <w:hyperlink r:id="rId31" w:history="1">
+      <w:hyperlink r:id="rId32" w:history="1">
         <w:r>
           <w:rPr>
             <w:color w:val="0D7377"/>
             <w:u w:val="single"/>
           </w:rPr>
-          <w:t>Project Page</w:t>
+          <w:t>LinkedIn Post</w:t>
         </w:r>
       </w:hyperlink>
+      <w:r>
+        <w:rPr>
+          <w:color w:val="6B7280"/>
+          <w:sz w:val="17"/>
+          <w:szCs w:val="17"/>
+        </w:rPr>
+        <w:t xml:space="preserve">  </w:t>
+      </w:r>
     </w:p>
     <w:p>
       <w:pPr>
         <w:pStyle w:val="ListParagraph"/>
         <w:numPr>
           <w:ilvl w:val="0"/>
-          <w:numId w:val="3"/>
+          <w:numId w:val="11"/>
         </w:numPr>
-        <w:spacing w:before="30" w:after="30"/>
-      </w:pPr>
-      <w:r>
-        <w:t>Offline-first in-flight entertainment web system inspired by how airlines stream content without internet built to explore air-gapped local network constraints.</w:t>
+        <w:spacing w:before="120" w:after="25"/>
+      </w:pPr>
+      <w:r>
+        <w:t xml:space="preserve">Built a </w:t>
+      </w:r>
+      <w:r>
+        <w:rPr>
+          <w:b/>
+          <w:bCs/>
+        </w:rPr>
+        <w:t>real-time flight tracking web application</w:t>
+      </w:r>
+      <w:r>
+        <w:t xml:space="preserve"> that enables </w:t>
+      </w:r>
+      <w:proofErr w:type="spellStart"/>
+      <w:r>
+        <w:t>travelers</w:t>
+      </w:r>
+      <w:proofErr w:type="spellEnd"/>
+      <w:r>
+        <w:t xml:space="preserve"> and airport pickups to monitor live arrivals, departures, flight status, delays, terminals, gates, baggage belts, and destination weather.</w:t>
       </w:r>
     </w:p>
     <w:p>
@@ -1767,12 +2168,31 @@
         <w:pStyle w:val="ListParagraph"/>
         <w:numPr>
           <w:ilvl w:val="0"/>
-          <w:numId w:val="3"/>
+          <w:numId w:val="11"/>
         </w:numPr>
-        <w:spacing w:before="30" w:after="30"/>
-      </w:pPr>
-      <w:r>
-        <w:t>Designed fully offline-capable frontend with no external CDN dependencies; assets load reliably over a local server without internet access.</w:t>
+        <w:spacing w:before="120" w:after="25"/>
+      </w:pPr>
+      <w:r>
+        <w:t xml:space="preserve">Integrated </w:t>
+      </w:r>
+      <w:proofErr w:type="spellStart"/>
+      <w:r>
+        <w:rPr>
+          <w:b/>
+          <w:bCs/>
+        </w:rPr>
+        <w:t>AirLabs</w:t>
+      </w:r>
+      <w:proofErr w:type="spellEnd"/>
+      <w:r>
+        <w:rPr>
+          <w:b/>
+          <w:bCs/>
+        </w:rPr>
+        <w:t xml:space="preserve"> Aviation API</w:t>
+      </w:r>
+      <w:r>
+        <w:t xml:space="preserve"> to fetch real-time flight information and designed a responsive search experience optimized for fast flight lookup and status monitoring.</w:t>
       </w:r>
     </w:p>
     <w:p>
@@ -1780,12 +2200,12 @@
         <w:pStyle w:val="ListParagraph"/>
         <w:numPr>
           <w:ilvl w:val="0"/>
-          <w:numId w:val="3"/>
+          <w:numId w:val="11"/>
         </w:numPr>
-        <w:spacing w:before="30" w:after="30"/>
-      </w:pPr>
-      <w:r>
-        <w:t>Architected for multi-device delivery (phones, tablets) over a local network simulating real airline seatback entertainment delivery infrastructure.</w:t>
+        <w:spacing w:before="120" w:after="25"/>
+      </w:pPr>
+      <w:r>
+        <w:t>Developed an intuitive aviation dashboard featuring live flight details, airline information, airport metadata, route visualization, and mobile-first responsive UI.</w:t>
       </w:r>
     </w:p>
     <w:p>
@@ -1793,18 +2213,12 @@
         <w:pStyle w:val="ListParagraph"/>
         <w:numPr>
           <w:ilvl w:val="0"/>
-          <w:numId w:val="3"/>
+          <w:numId w:val="11"/>
         </w:numPr>
-        <w:spacing w:before="30" w:after="30"/>
-      </w:pPr>
-      <w:r>
-        <w:t xml:space="preserve">Key insight: offline systems require fundamentally different UX </w:t>
-      </w:r>
-      <w:r>
-        <w:t>assumption’s</w:t>
-      </w:r>
-      <w:r>
-        <w:t xml:space="preserve"> reliability and predictability matter more than feature richness.</w:t>
+        <w:spacing w:before="120" w:after="25"/>
+      </w:pPr>
+      <w:r>
+        <w:t>Architected reusable React components with Next.js and optimized performance using server-side rendering, efficient API handling, and modern frontend best practices.</w:t>
       </w:r>
     </w:p>
     <w:p>
@@ -1812,12 +2226,35 @@
         <w:pStyle w:val="ListParagraph"/>
         <w:numPr>
           <w:ilvl w:val="0"/>
-          <w:numId w:val="3"/>
+          <w:numId w:val="11"/>
         </w:numPr>
-        <w:spacing w:before="30" w:after="30"/>
-      </w:pPr>
-      <w:r>
-        <w:t>Tech Stack: HTML, CSS, JavaScript, Offline-first architecture.</w:t>
+        <w:spacing w:before="120" w:after="25"/>
+      </w:pPr>
+      <w:r>
+        <w:rPr>
+          <w:b/>
+          <w:bCs/>
+        </w:rPr>
+        <w:t>Tech Stack:</w:t>
+      </w:r>
+      <w:r>
+        <w:t xml:space="preserve"> Next.js, React, TypeScript, Tailwind CSS, </w:t>
+      </w:r>
+      <w:proofErr w:type="spellStart"/>
+      <w:r>
+        <w:t>AirLabs</w:t>
+      </w:r>
+      <w:proofErr w:type="spellEnd"/>
+      <w:r>
+        <w:t xml:space="preserve"> API, REST APIs, </w:t>
+      </w:r>
+      <w:proofErr w:type="spellStart"/>
+      <w:r>
+        <w:t>Vercel</w:t>
+      </w:r>
+      <w:proofErr w:type="spellEnd"/>
+      <w:r>
+        <w:t>.</w:t>
       </w:r>
     </w:p>
     <w:p>
@@ -1836,13 +2273,7 @@
           <w:szCs w:val="21"/>
         </w:rPr>
       </w:pPr>
-    </w:p>
-    <w:p>
-      <w:pPr>
-        <w:pBdr>
-          <w:bottom w:val="single" w:sz="8" w:space="3" w:color="0D7377"/>
-        </w:pBdr>
-        <w:spacing w:before="260" w:after="100"/>
+      <w:r>
         <w:rPr>
           <w:b/>
           <w:bCs/>
@@ -1852,18 +2283,6 @@
           <w:sz w:val="21"/>
           <w:szCs w:val="21"/>
         </w:rPr>
-      </w:pPr>
-      <w:r>
-        <w:rPr>
-          <w:b/>
-          <w:bCs/>
-          <w:caps/>
-          <w:color w:val="1B3A5C"/>
-          <w:spacing w:val="60"/>
-          <w:sz w:val="21"/>
-          <w:szCs w:val="21"/>
-        </w:rPr>
-        <w:lastRenderedPageBreak/>
         <w:t>Certifications</w:t>
       </w:r>
     </w:p>
@@ -1885,78 +2304,6 @@
           <w:szCs w:val="22"/>
         </w:rPr>
         <w:t xml:space="preserve">Investment Risk Management </w:t>
-      </w:r>
-      <w:r>
-        <w:rPr>
-          <w:sz w:val="22"/>
-          <w:szCs w:val="22"/>
-        </w:rPr>
-        <w:t>-</w:t>
-      </w:r>
-      <w:r>
-        <w:rPr>
-          <w:sz w:val="22"/>
-          <w:szCs w:val="22"/>
-        </w:rPr>
-        <w:t xml:space="preserve"> </w:t>
-      </w:r>
-      <w:hyperlink r:id="rId32" w:history="1">
-        <w:r>
-          <w:rPr>
-            <w:rStyle w:val="Hyperlink"/>
-            <w:sz w:val="22"/>
-            <w:szCs w:val="22"/>
-          </w:rPr>
-          <w:t>Coursera</w:t>
-        </w:r>
-      </w:hyperlink>
-      <w:r>
-        <w:rPr>
-          <w:sz w:val="22"/>
-          <w:szCs w:val="22"/>
-        </w:rPr>
-        <w:t xml:space="preserve"> (202</w:t>
-      </w:r>
-      <w:r>
-        <w:rPr>
-          <w:sz w:val="22"/>
-          <w:szCs w:val="22"/>
-        </w:rPr>
-        <w:t>5</w:t>
-      </w:r>
-      <w:r>
-        <w:rPr>
-          <w:sz w:val="22"/>
-          <w:szCs w:val="22"/>
-        </w:rPr>
-        <w:t xml:space="preserve">) </w:t>
-      </w:r>
-      <w:r>
-        <w:rPr>
-          <w:sz w:val="22"/>
-          <w:szCs w:val="22"/>
-        </w:rPr>
-        <w:br/>
-      </w:r>
-    </w:p>
-    <w:p>
-      <w:pPr>
-        <w:pStyle w:val="ListParagraph"/>
-        <w:numPr>
-          <w:ilvl w:val="0"/>
-          <w:numId w:val="7"/>
-        </w:numPr>
-        <w:rPr>
-          <w:sz w:val="22"/>
-          <w:szCs w:val="22"/>
-        </w:rPr>
-      </w:pPr>
-      <w:r>
-        <w:rPr>
-          <w:sz w:val="22"/>
-          <w:szCs w:val="22"/>
-        </w:rPr>
-        <w:t xml:space="preserve">Business Analysis &amp; Process Management </w:t>
       </w:r>
       <w:r>
         <w:rPr>
@@ -2006,6 +2353,71 @@
     </w:p>
     <w:p>
       <w:pPr>
+        <w:pStyle w:val="ListParagraph"/>
+        <w:numPr>
+          <w:ilvl w:val="0"/>
+          <w:numId w:val="7"/>
+        </w:numPr>
+        <w:rPr>
+          <w:sz w:val="22"/>
+          <w:szCs w:val="22"/>
+        </w:rPr>
+      </w:pPr>
+      <w:r>
+        <w:rPr>
+          <w:sz w:val="22"/>
+          <w:szCs w:val="22"/>
+        </w:rPr>
+        <w:t xml:space="preserve">Business Analysis &amp; Process Management </w:t>
+      </w:r>
+      <w:r>
+        <w:rPr>
+          <w:sz w:val="22"/>
+          <w:szCs w:val="22"/>
+        </w:rPr>
+        <w:t>-</w:t>
+      </w:r>
+      <w:r>
+        <w:rPr>
+          <w:sz w:val="22"/>
+          <w:szCs w:val="22"/>
+        </w:rPr>
+        <w:t xml:space="preserve"> </w:t>
+      </w:r>
+      <w:hyperlink r:id="rId34" w:history="1">
+        <w:r>
+          <w:rPr>
+            <w:rStyle w:val="Hyperlink"/>
+            <w:sz w:val="22"/>
+            <w:szCs w:val="22"/>
+          </w:rPr>
+          <w:t>Coursera</w:t>
+        </w:r>
+      </w:hyperlink>
+      <w:r>
+        <w:rPr>
+          <w:sz w:val="22"/>
+          <w:szCs w:val="22"/>
+        </w:rPr>
+        <w:t xml:space="preserve"> (202</w:t>
+      </w:r>
+      <w:r>
+        <w:rPr>
+          <w:sz w:val="22"/>
+          <w:szCs w:val="22"/>
+        </w:rPr>
+        <w:t>5</w:t>
+      </w:r>
+      <w:r>
+        <w:rPr>
+          <w:sz w:val="22"/>
+          <w:szCs w:val="22"/>
+        </w:rPr>
+        <w:t xml:space="preserve">) </w:t>
+      </w:r>
+    </w:p>
+    <w:p>
+      <w:pPr>
         <w:pBdr>
           <w:bottom w:val="single" w:sz="8" w:space="3" w:color="0D7377"/>
         </w:pBdr>
@@ -2044,14 +2456,12 @@
       <w:r>
         <w:t xml:space="preserve">TOP 10 </w:t>
       </w:r>
-      <w:proofErr w:type="gramStart"/>
       <w:r>
         <w:t>FINALIST</w:t>
       </w:r>
       <w:r>
-        <w:t xml:space="preserve"> ,</w:t>
-      </w:r>
-      <w:proofErr w:type="gramEnd"/>
+        <w:t>,</w:t>
+      </w:r>
       <w:r>
         <w:t xml:space="preserve"> CONFERENCE 2.0 HACKATHON (2026) </w:t>
       </w:r>
@@ -2086,11 +2496,9 @@
       <w:r>
         <w:t xml:space="preserve"> pitched pulse </w:t>
       </w:r>
-      <w:proofErr w:type="gramStart"/>
       <w:r>
         <w:t>predict</w:t>
       </w:r>
-      <w:proofErr w:type="gramEnd"/>
       <w:r>
         <w:t xml:space="preserve">, a low-cost embedded health-tech wearable for elderly safety and remote monitoring. </w:t>
       </w:r>
@@ -2177,7 +2585,7 @@
         </w:rPr>
         <w:t xml:space="preserve">   </w:t>
       </w:r>
-      <w:hyperlink r:id="rId34" w:history="1">
+      <w:hyperlink r:id="rId35" w:history="1">
         <w:r>
           <w:rPr>
             <w:color w:val="0D7377"/>
@@ -2194,7 +2602,7 @@
         </w:rPr>
         <w:t xml:space="preserve">  ·  </w:t>
       </w:r>
-      <w:hyperlink r:id="rId35" w:history="1">
+      <w:hyperlink r:id="rId36" w:history="1">
         <w:r>
           <w:rPr>
             <w:color w:val="0D7377"/>
@@ -2444,7 +2852,23 @@
           <w:bCs/>
           <w:color w:val="14A085"/>
         </w:rPr>
-        <w:t>CGPA: 9.08 / 10.0</w:t>
+        <w:t>CGPA: 9.08</w:t>
+      </w:r>
+      <w:r>
+        <w:rPr>
+          <w:b/>
+          <w:bCs/>
+          <w:color w:val="14A085"/>
+        </w:rPr>
+        <w:t>4</w:t>
+      </w:r>
+      <w:r>
+        <w:rPr>
+          <w:b/>
+          <w:bCs/>
+          <w:color w:val="14A085"/>
+        </w:rPr>
+        <w:t xml:space="preserve"> / 10.0</w:t>
       </w:r>
       <w:r>
         <w:rPr>
@@ -2456,7 +2880,6 @@
         </w:rPr>
         <w:t xml:space="preserve"> (up to </w:t>
       </w:r>
-      <w:proofErr w:type="gramStart"/>
       <w:r>
         <w:rPr>
           <w:i/>
@@ -2465,7 +2888,7 @@
           <w:sz w:val="17"/>
           <w:szCs w:val="17"/>
         </w:rPr>
-        <w:t>4</w:t>
+        <w:t>4th</w:t>
       </w:r>
       <w:r>
         <w:rPr>
@@ -2475,17 +2898,6 @@
           <w:sz w:val="17"/>
           <w:szCs w:val="17"/>
         </w:rPr>
-        <w:t>rd</w:t>
-      </w:r>
-      <w:proofErr w:type="gramEnd"/>
-      <w:r>
-        <w:rPr>
-          <w:i/>
-          <w:iCs/>
-          <w:color w:val="6B7280"/>
-          <w:sz w:val="17"/>
-          <w:szCs w:val="17"/>
-        </w:rPr>
         <w:t xml:space="preserve"> Semester)</w:t>
       </w:r>
     </w:p>
@@ -2612,34 +3024,30 @@
         <w:t xml:space="preserve">Tools &amp; Platforms: </w:t>
       </w:r>
       <w:r>
-        <w:t xml:space="preserve">Git/GitHub, </w:t>
+        <w:t>Git/</w:t>
       </w:r>
       <w:proofErr w:type="spellStart"/>
       <w:r>
-        <w:t>Vercel</w:t>
+        <w:t>GitHub,Vercel,</w:t>
+      </w:r>
+      <w:r>
+        <w:t>Razorpay</w:t>
       </w:r>
       <w:proofErr w:type="spellEnd"/>
       <w:r>
-        <w:t xml:space="preserve">, </w:t>
-      </w:r>
-      <w:r>
-        <w:t>Razor pay</w:t>
-      </w:r>
-      <w:r>
         <w:t xml:space="preserve"> (Test Mode), Android (APK Build &amp; Publish), </w:t>
       </w:r>
-      <w:proofErr w:type="spellStart"/>
-      <w:proofErr w:type="gramStart"/>
-      <w:r>
-        <w:t>Antigravity</w:t>
-      </w:r>
-      <w:r>
-        <w:t>,VS</w:t>
-      </w:r>
-      <w:proofErr w:type="spellEnd"/>
-      <w:proofErr w:type="gramEnd"/>
-      <w:r>
-        <w:t xml:space="preserve"> Code</w:t>
+      <w:r>
+        <w:t>Antigravity, VS</w:t>
+      </w:r>
+      <w:r>
+        <w:t xml:space="preserve"> </w:t>
+      </w:r>
+      <w:r>
+        <w:t>Code</w:t>
+      </w:r>
+      <w:r>
+        <w:t>, Arduino IDE</w:t>
       </w:r>
     </w:p>
     <w:p>
@@ -2673,7 +3081,7 @@
         </w:rPr>
         <w:t xml:space="preserve">Portfolio: </w:t>
       </w:r>
-      <w:hyperlink r:id="rId36" w:history="1">
+      <w:hyperlink r:id="rId37" w:history="1">
         <w:r>
           <w:rPr>
             <w:color w:val="0D7377"/>
@@ -2690,7 +3098,7 @@
         </w:rPr>
         <w:t xml:space="preserve">  ·  All Projects: </w:t>
       </w:r>
-      <w:hyperlink r:id="rId37" w:history="1">
+      <w:hyperlink r:id="rId38" w:history="1">
         <w:r>
           <w:rPr>
             <w:color w:val="0D7377"/>
@@ -2707,7 +3115,7 @@
         </w:rPr>
         <w:t xml:space="preserve">  ·  GitHub: </w:t>
       </w:r>
-      <w:hyperlink r:id="rId38" w:history="1">
+      <w:hyperlink r:id="rId39" w:history="1">
         <w:r>
           <w:rPr>
             <w:color w:val="0D7377"/>
@@ -2730,7 +3138,7 @@
           <w:sz w:val="17"/>
           <w:szCs w:val="17"/>
         </w:rPr>
-        <w:br/>
+        <w:t xml:space="preserve"> </w:t>
       </w:r>
       <w:r>
         <w:rPr>
@@ -2738,9 +3146,17 @@
           <w:sz w:val="17"/>
           <w:szCs w:val="17"/>
         </w:rPr>
-        <w:t xml:space="preserve">  LinkedIn: </w:t>
-      </w:r>
-      <w:hyperlink r:id="rId39" w:history="1">
+        <w:br/>
+      </w:r>
+      <w:r>
+        <w:rPr>
+          <w:color w:val="6B7280"/>
+          <w:sz w:val="17"/>
+          <w:szCs w:val="17"/>
+        </w:rPr>
+        <w:t xml:space="preserve">LinkedIn: </w:t>
+      </w:r>
+      <w:hyperlink r:id="rId40" w:history="1">
         <w:r>
           <w:rPr>
             <w:color w:val="0D7377"/>
@@ -2761,8 +3177,270 @@
 </file>
 
 <file path=word/numbering.xml><?xml version="1.0" encoding="utf-8"?>
-<w:numbering xmlns:wpc="http://schemas.microsoft.com/office/word/2010/wordprocessingCanvas" xmlns:cx="http://schemas.microsoft.com/office/drawing/2014/chartex" xmlns:cx1="http://schemas.microsoft.com/office/drawing/2015/9/8/chartex" xmlns:cx2="http://schemas.microsoft.com/office/drawing/2015/10/21/chartex" xmlns:cx3="http://schemas.microsoft.com/office/drawing/2016/5/9/chartex" xmlns:cx4="http://schemas.microsoft.com/office/drawing/2016/5/10/chartex" xmlns:cx5="http://schemas.microsoft.com/office/drawing/2016/5/11/chartex" xmlns:cx6="http://schemas.microsoft.com/office/drawing/2016/5/12/chartex" xmlns:cx7="http://schemas.microsoft.com/office/drawing/2016/5/13/chartex" xmlns:cx8="http://schemas.microsoft.com/office/drawing/2016/5/14/chartex" xmlns:mc="http://schemas.openxmlformats.org/markup-compatibility/2006" xmlns:aink="http://schemas.microsoft.com/office/drawing/2016/ink" xmlns:am3d="http://schemas.microsoft.com/office/drawing/2017/model3d" xmlns:o="urn:schemas-microsoft-com:office:office" xmlns:oel="http://schemas.microsoft.com/office/2019/extlst" xmlns:r="http://schemas.openxmlformats.org/officeDocument/2006/relationships" xmlns:m="http://schemas.openxmlformats.org/officeDocument/2006/math" xmlns:v="urn:schemas-microsoft-com:vml" xmlns:wp14="http://schemas.microsoft.com/office/word/2010/wordprocessingDrawing" xmlns:wp="http://schemas.openxmlformats.org/drawingml/2006/wordprocessingDrawing" xmlns:w10="urn:schemas-microsoft-com:office:word" xmlns:w="http://schemas.openxmlformats.org/wordprocessingml/2006/main" xmlns:w14="http://schemas.microsoft.com/office/word/2010/wordml" xmlns:w15="http://schemas.microsoft.com/office/word/2012/wordml" xmlns:w16cex="http://schemas.microsoft.com/office/word/2018/wordml/cex" xmlns:w16cid="http://schemas.microsoft.com/office/word/2016/wordml/cid" xmlns:w16="http://schemas.microsoft.com/office/word/2018/wordml" xmlns:w16du="http://schemas.microsoft.com/office/word/2023/wordml/word16du" xmlns:w16sdtdh="http://schemas.microsoft.com/office/word/2020/wordml/sdtdatahash" xmlns:w16sdtfl="http://schemas.microsoft.com/office/word/2024/wordml/sdtformatlock" xmlns:w16se="http://schemas.microsoft.com/office/word/2015/wordml/symex" xmlns:wpg="http://schemas.microsoft.com/office/word/2010/wordprocessingGroup" xmlns:wpi="http://schemas.microsoft.com/office/word/2010/wordprocessingInk" xmlns:wne="http://schemas.microsoft.com/office/word/2006/wordml" xmlns:wps="http://schemas.microsoft.com/office/word/2010/wordprocessingShape" mc:Ignorable="w14 w15 w16se w16cid w16 w16cex w16sdtdh w16sdtfl w16du wp14">
+<w:numbering xmlns:wpc="http://schemas.microsoft.com/office/word/2010/wordprocessingCanvas" xmlns:cx="http://schemas.microsoft.com/office/drawing/2014/chartex" xmlns:cx1="http://schemas.microsoft.com/office/drawing/2015/9/8/chartex" xmlns:cx2="http://schemas.microsoft.com/office/drawing/2015/10/21/chartex" xmlns:cx3="http://schemas.microsoft.com/office/drawing/2016/5/9/chartex" xmlns:cx4="http://schemas.microsoft.com/office/drawing/2016/5/10/chartex" xmlns:cx5="http://schemas.microsoft.com/office/drawing/2016/5/11/chartex" xmlns:cx6="http://schemas.microsoft.com/office/drawing/2016/5/12/chartex" xmlns:cx7="http://schemas.microsoft.com/office/drawing/2016/5/13/chartex" xmlns:cx8="http://schemas.microsoft.com/office/drawing/2016/5/14/chartex" xmlns:mc="http://schemas.openxmlformats.org/markup-compatibility/2006" xmlns:aink="http://schemas.microsoft.com/office/drawing/2016/ink" xmlns:am3d="http://schemas.microsoft.com/office/drawing/2017/model3d" xmlns:o="urn:schemas-microsoft-com:office:office" xmlns:oel="http://schemas.microsoft.com/office/2019/extlst" xmlns:r="http://schemas.openxmlformats.org/officeDocument/2006/relationships" xmlns:m="http://schemas.openxmlformats.org/officeDocument/2006/math" xmlns:v="urn:schemas-microsoft-com:vml" xmlns:wp14="http://schemas.microsoft.com/office/word/2010/wordprocessingDrawing" xmlns:wp="http://schemas.openxmlformats.org/drawingml/2006/wordprocessingDrawing" xmlns:w10="urn:schemas-microsoft-com:office:word" xmlns:w="http://schemas.openxmlformats.org/wordprocessingml/2006/main" xmlns:w14="http://schemas.microsoft.com/office/word/2010/wordml" xmlns:w15="http://schemas.microsoft.com/office/word/2012/wordml" xmlns:w16cei="http://schemas.microsoft.com/office/word/2026/wordml/cei" xmlns:w16cex="http://schemas.microsoft.com/office/word/2018/wordml/cex" xmlns:w16cid="http://schemas.microsoft.com/office/word/2016/wordml/cid" xmlns:w16="http://schemas.microsoft.com/office/word/2018/wordml" xmlns:w16du="http://schemas.microsoft.com/office/word/2023/wordml/word16du" xmlns:w16sdtdh="http://schemas.microsoft.com/office/word/2020/wordml/sdtdatahash" xmlns:w16sdtfl="http://schemas.microsoft.com/office/word/2024/wordml/sdtformatlock" xmlns:w16se="http://schemas.microsoft.com/office/word/2015/wordml/symex" xmlns:wpg="http://schemas.microsoft.com/office/word/2010/wordprocessingGroup" xmlns:wpi="http://schemas.microsoft.com/office/word/2010/wordprocessingInk" xmlns:wne="http://schemas.microsoft.com/office/word/2006/wordml" xmlns:wps="http://schemas.microsoft.com/office/word/2010/wordprocessingShape" mc:Ignorable="w14 w15 w16se w16cid w16 w16cex w16sdtdh w16sdtfl w16du wp14">
   <w:abstractNum w:abstractNumId="0" w15:restartNumberingAfterBreak="0">
+    <w:nsid w:val="03481C30"/>
+    <w:multiLevelType w:val="multilevel"/>
+    <w:tmpl w:val="38E4FDB2"/>
+    <w:lvl w:ilvl="0">
+      <w:start w:val="1"/>
+      <w:numFmt w:val="bullet"/>
+      <w:lvlText w:val=""/>
+      <w:lvlJc w:val="left"/>
+      <w:pPr>
+        <w:tabs>
+          <w:tab w:val="num" w:pos="720"/>
+        </w:tabs>
+        <w:ind w:left="720" w:hanging="360"/>
+      </w:pPr>
+      <w:rPr>
+        <w:rFonts w:ascii="Symbol" w:hAnsi="Symbol" w:hint="default"/>
+        <w:sz w:val="20"/>
+      </w:rPr>
+    </w:lvl>
+    <w:lvl w:ilvl="1" w:tentative="1">
+      <w:start w:val="1"/>
+      <w:numFmt w:val="bullet"/>
+      <w:lvlText w:val="o"/>
+      <w:lvlJc w:val="left"/>
+      <w:pPr>
+        <w:tabs>
+          <w:tab w:val="num" w:pos="1440"/>
+        </w:tabs>
+        <w:ind w:left="1440" w:hanging="360"/>
+      </w:pPr>
+      <w:rPr>
+        <w:rFonts w:ascii="Courier New" w:hAnsi="Courier New" w:hint="default"/>
+        <w:sz w:val="20"/>
+      </w:rPr>
+    </w:lvl>
+    <w:lvl w:ilvl="2" w:tentative="1">
+      <w:start w:val="1"/>
+      <w:numFmt w:val="bullet"/>
+      <w:lvlText w:val=""/>
+      <w:lvlJc w:val="left"/>
+      <w:pPr>
+        <w:tabs>
+          <w:tab w:val="num" w:pos="2160"/>
+        </w:tabs>
+        <w:ind w:left="2160" w:hanging="360"/>
+      </w:pPr>
+      <w:rPr>
+        <w:rFonts w:ascii="Wingdings" w:hAnsi="Wingdings" w:hint="default"/>
+        <w:sz w:val="20"/>
+      </w:rPr>
+    </w:lvl>
+    <w:lvl w:ilvl="3" w:tentative="1">
+      <w:start w:val="1"/>
+      <w:numFmt w:val="bullet"/>
+      <w:lvlText w:val=""/>
+      <w:lvlJc w:val="left"/>
+      <w:pPr>
+        <w:tabs>
+          <w:tab w:val="num" w:pos="2880"/>
+        </w:tabs>
+        <w:ind w:left="2880" w:hanging="360"/>
+      </w:pPr>
+      <w:rPr>
+        <w:rFonts w:ascii="Wingdings" w:hAnsi="Wingdings" w:hint="default"/>
+        <w:sz w:val="20"/>
+      </w:rPr>
+    </w:lvl>
+    <w:lvl w:ilvl="4" w:tentative="1">
+      <w:start w:val="1"/>
+      <w:numFmt w:val="bullet"/>
+      <w:lvlText w:val=""/>
+      <w:lvlJc w:val="left"/>
+      <w:pPr>
+        <w:tabs>
+          <w:tab w:val="num" w:pos="3600"/>
+        </w:tabs>
+        <w:ind w:left="3600" w:hanging="360"/>
+      </w:pPr>
+      <w:rPr>
+        <w:rFonts w:ascii="Wingdings" w:hAnsi="Wingdings" w:hint="default"/>
+        <w:sz w:val="20"/>
+      </w:rPr>
+    </w:lvl>
+    <w:lvl w:ilvl="5" w:tentative="1">
+      <w:start w:val="1"/>
+      <w:numFmt w:val="bullet"/>
+      <w:lvlText w:val=""/>
+      <w:lvlJc w:val="left"/>
+      <w:pPr>
+        <w:tabs>
+          <w:tab w:val="num" w:pos="4320"/>
+        </w:tabs>
+        <w:ind w:left="4320" w:hanging="360"/>
+      </w:pPr>
+      <w:rPr>
+        <w:rFonts w:ascii="Wingdings" w:hAnsi="Wingdings" w:hint="default"/>
+        <w:sz w:val="20"/>
+      </w:rPr>
+    </w:lvl>
+    <w:lvl w:ilvl="6" w:tentative="1">
+      <w:start w:val="1"/>
+      <w:numFmt w:val="bullet"/>
+      <w:lvlText w:val=""/>
+      <w:lvlJc w:val="left"/>
+      <w:pPr>
+        <w:tabs>
+          <w:tab w:val="num" w:pos="5040"/>
+        </w:tabs>
+        <w:ind w:left="5040" w:hanging="360"/>
+      </w:pPr>
+      <w:rPr>
+        <w:rFonts w:ascii="Wingdings" w:hAnsi="Wingdings" w:hint="default"/>
+        <w:sz w:val="20"/>
+      </w:rPr>
+    </w:lvl>
+    <w:lvl w:ilvl="7" w:tentative="1">
+      <w:start w:val="1"/>
+      <w:numFmt w:val="bullet"/>
+      <w:lvlText w:val=""/>
+      <w:lvlJc w:val="left"/>
+      <w:pPr>
+        <w:tabs>
+          <w:tab w:val="num" w:pos="5760"/>
+        </w:tabs>
+        <w:ind w:left="5760" w:hanging="360"/>
+      </w:pPr>
+      <w:rPr>
+        <w:rFonts w:ascii="Wingdings" w:hAnsi="Wingdings" w:hint="default"/>
+        <w:sz w:val="20"/>
+      </w:rPr>
+    </w:lvl>
+    <w:lvl w:ilvl="8" w:tentative="1">
+      <w:start w:val="1"/>
+      <w:numFmt w:val="bullet"/>
+      <w:lvlText w:val=""/>
+      <w:lvlJc w:val="left"/>
+      <w:pPr>
+        <w:tabs>
+          <w:tab w:val="num" w:pos="6480"/>
+        </w:tabs>
+        <w:ind w:left="6480" w:hanging="360"/>
+      </w:pPr>
+      <w:rPr>
+        <w:rFonts w:ascii="Wingdings" w:hAnsi="Wingdings" w:hint="default"/>
+        <w:sz w:val="20"/>
+      </w:rPr>
+    </w:lvl>
+  </w:abstractNum>
+  <w:abstractNum w:abstractNumId="1" w15:restartNumberingAfterBreak="0">
+    <w:nsid w:val="0D37276F"/>
+    <w:multiLevelType w:val="hybridMultilevel"/>
+    <w:tmpl w:val="244AB7B0"/>
+    <w:lvl w:ilvl="0" w:tplc="4009000B">
+      <w:start w:val="1"/>
+      <w:numFmt w:val="bullet"/>
+      <w:lvlText w:val=""/>
+      <w:lvlJc w:val="left"/>
+      <w:pPr>
+        <w:ind w:left="720" w:hanging="360"/>
+      </w:pPr>
+      <w:rPr>
+        <w:rFonts w:ascii="Wingdings" w:hAnsi="Wingdings" w:hint="default"/>
+      </w:rPr>
+    </w:lvl>
+    <w:lvl w:ilvl="1" w:tplc="40090003" w:tentative="1">
+      <w:start w:val="1"/>
+      <w:numFmt w:val="bullet"/>
+      <w:lvlText w:val="o"/>
+      <w:lvlJc w:val="left"/>
+      <w:pPr>
+        <w:ind w:left="1440" w:hanging="360"/>
+      </w:pPr>
+      <w:rPr>
+        <w:rFonts w:ascii="Courier New" w:hAnsi="Courier New" w:cs="Courier New" w:hint="default"/>
+      </w:rPr>
+    </w:lvl>
+    <w:lvl w:ilvl="2" w:tplc="40090005" w:tentative="1">
+      <w:start w:val="1"/>
+      <w:numFmt w:val="bullet"/>
+      <w:lvlText w:val=""/>
+      <w:lvlJc w:val="left"/>
+      <w:pPr>
+        <w:ind w:left="2160" w:hanging="360"/>
+      </w:pPr>
+      <w:rPr>
+        <w:rFonts w:ascii="Wingdings" w:hAnsi="Wingdings" w:hint="default"/>
+      </w:rPr>
+    </w:lvl>
+    <w:lvl w:ilvl="3" w:tplc="40090001" w:tentative="1">
+      <w:start w:val="1"/>
+      <w:numFmt w:val="bullet"/>
+      <w:lvlText w:val=""/>
+      <w:lvlJc w:val="left"/>
+      <w:pPr>
+        <w:ind w:left="2880" w:hanging="360"/>
+      </w:pPr>
+      <w:rPr>
+        <w:rFonts w:ascii="Symbol" w:hAnsi="Symbol" w:hint="default"/>
+      </w:rPr>
+    </w:lvl>
+    <w:lvl w:ilvl="4" w:tplc="40090003" w:tentative="1">
+      <w:start w:val="1"/>
+      <w:numFmt w:val="bullet"/>
+      <w:lvlText w:val="o"/>
+      <w:lvlJc w:val="left"/>
+      <w:pPr>
+        <w:ind w:left="3600" w:hanging="360"/>
+      </w:pPr>
+      <w:rPr>
+        <w:rFonts w:ascii="Courier New" w:hAnsi="Courier New" w:cs="Courier New" w:hint="default"/>
+      </w:rPr>
+    </w:lvl>
+    <w:lvl w:ilvl="5" w:tplc="40090005" w:tentative="1">
+      <w:start w:val="1"/>
+      <w:numFmt w:val="bullet"/>
+      <w:lvlText w:val=""/>
+      <w:lvlJc w:val="left"/>
+      <w:pPr>
+        <w:ind w:left="4320" w:hanging="360"/>
+      </w:pPr>
+      <w:rPr>
+        <w:rFonts w:ascii="Wingdings" w:hAnsi="Wingdings" w:hint="default"/>
+      </w:rPr>
+    </w:lvl>
+    <w:lvl w:ilvl="6" w:tplc="40090001" w:tentative="1">
+      <w:start w:val="1"/>
+      <w:numFmt w:val="bullet"/>
+      <w:lvlText w:val=""/>
+      <w:lvlJc w:val="left"/>
+      <w:pPr>
+        <w:ind w:left="5040" w:hanging="360"/>
+      </w:pPr>
+      <w:rPr>
+        <w:rFonts w:ascii="Symbol" w:hAnsi="Symbol" w:hint="default"/>
+      </w:rPr>
+    </w:lvl>
+    <w:lvl w:ilvl="7" w:tplc="40090003" w:tentative="1">
+      <w:start w:val="1"/>
+      <w:numFmt w:val="bullet"/>
+      <w:lvlText w:val="o"/>
+      <w:lvlJc w:val="left"/>
+      <w:pPr>
+        <w:ind w:left="5760" w:hanging="360"/>
+      </w:pPr>
+      <w:rPr>
+        <w:rFonts w:ascii="Courier New" w:hAnsi="Courier New" w:cs="Courier New" w:hint="default"/>
+      </w:rPr>
+    </w:lvl>
+    <w:lvl w:ilvl="8" w:tplc="40090005" w:tentative="1">
+      <w:start w:val="1"/>
+      <w:numFmt w:val="bullet"/>
+      <w:lvlText w:val=""/>
+      <w:lvlJc w:val="left"/>
+      <w:pPr>
+        <w:ind w:left="6480" w:hanging="360"/>
+      </w:pPr>
+      <w:rPr>
+        <w:rFonts w:ascii="Wingdings" w:hAnsi="Wingdings" w:hint="default"/>
+      </w:rPr>
+    </w:lvl>
+  </w:abstractNum>
+  <w:abstractNum w:abstractNumId="2" w15:restartNumberingAfterBreak="0">
     <w:nsid w:val="0DB7589C"/>
     <w:multiLevelType w:val="multilevel"/>
     <w:tmpl w:val="52B2F2F4"/>
@@ -2911,7 +3589,7 @@
       </w:rPr>
     </w:lvl>
   </w:abstractNum>
-  <w:abstractNum w:abstractNumId="1" w15:restartNumberingAfterBreak="0">
+  <w:abstractNum w:abstractNumId="3" w15:restartNumberingAfterBreak="0">
     <w:nsid w:val="10584436"/>
     <w:multiLevelType w:val="hybridMultilevel"/>
     <w:tmpl w:val="2A0EAF26"/>
@@ -3024,7 +3702,120 @@
       </w:rPr>
     </w:lvl>
   </w:abstractNum>
-  <w:abstractNum w:abstractNumId="2" w15:restartNumberingAfterBreak="0">
+  <w:abstractNum w:abstractNumId="4" w15:restartNumberingAfterBreak="0">
+    <w:nsid w:val="294624E7"/>
+    <w:multiLevelType w:val="hybridMultilevel"/>
+    <w:tmpl w:val="B268C7C8"/>
+    <w:lvl w:ilvl="0" w:tplc="4009000B">
+      <w:start w:val="1"/>
+      <w:numFmt w:val="bullet"/>
+      <w:lvlText w:val=""/>
+      <w:lvlJc w:val="left"/>
+      <w:pPr>
+        <w:ind w:left="720" w:hanging="360"/>
+      </w:pPr>
+      <w:rPr>
+        <w:rFonts w:ascii="Wingdings" w:hAnsi="Wingdings" w:hint="default"/>
+      </w:rPr>
+    </w:lvl>
+    <w:lvl w:ilvl="1" w:tplc="40090003" w:tentative="1">
+      <w:start w:val="1"/>
+      <w:numFmt w:val="bullet"/>
+      <w:lvlText w:val="o"/>
+      <w:lvlJc w:val="left"/>
+      <w:pPr>
+        <w:ind w:left="1440" w:hanging="360"/>
+      </w:pPr>
+      <w:rPr>
+        <w:rFonts w:ascii="Courier New" w:hAnsi="Courier New" w:cs="Courier New" w:hint="default"/>
+      </w:rPr>
+    </w:lvl>
+    <w:lvl w:ilvl="2" w:tplc="40090005" w:tentative="1">
+      <w:start w:val="1"/>
+      <w:numFmt w:val="bullet"/>
+      <w:lvlText w:val=""/>
+      <w:lvlJc w:val="left"/>
+      <w:pPr>
+        <w:ind w:left="2160" w:hanging="360"/>
+      </w:pPr>
+      <w:rPr>
+        <w:rFonts w:ascii="Wingdings" w:hAnsi="Wingdings" w:hint="default"/>
+      </w:rPr>
+    </w:lvl>
+    <w:lvl w:ilvl="3" w:tplc="40090001" w:tentative="1">
+      <w:start w:val="1"/>
+      <w:numFmt w:val="bullet"/>
+      <w:lvlText w:val=""/>
+      <w:lvlJc w:val="left"/>
+      <w:pPr>
+        <w:ind w:left="2880" w:hanging="360"/>
+      </w:pPr>
+      <w:rPr>
+        <w:rFonts w:ascii="Symbol" w:hAnsi="Symbol" w:hint="default"/>
+      </w:rPr>
+    </w:lvl>
+    <w:lvl w:ilvl="4" w:tplc="40090003" w:tentative="1">
+      <w:start w:val="1"/>
+      <w:numFmt w:val="bullet"/>
+      <w:lvlText w:val="o"/>
+      <w:lvlJc w:val="left"/>
+      <w:pPr>
+        <w:ind w:left="3600" w:hanging="360"/>
+      </w:pPr>
+      <w:rPr>
+        <w:rFonts w:ascii="Courier New" w:hAnsi="Courier New" w:cs="Courier New" w:hint="default"/>
+      </w:rPr>
+    </w:lvl>
+    <w:lvl w:ilvl="5" w:tplc="40090005" w:tentative="1">
+      <w:start w:val="1"/>
+      <w:numFmt w:val="bullet"/>
+      <w:lvlText w:val=""/>
+      <w:lvlJc w:val="left"/>
+      <w:pPr>
+        <w:ind w:left="4320" w:hanging="360"/>
+      </w:pPr>
+      <w:rPr>
+        <w:rFonts w:ascii="Wingdings" w:hAnsi="Wingdings" w:hint="default"/>
+      </w:rPr>
+    </w:lvl>
+    <w:lvl w:ilvl="6" w:tplc="40090001" w:tentative="1">
+      <w:start w:val="1"/>
+      <w:numFmt w:val="bullet"/>
+      <w:lvlText w:val=""/>
+      <w:lvlJc w:val="left"/>
+      <w:pPr>
+        <w:ind w:left="5040" w:hanging="360"/>
+      </w:pPr>
+      <w:rPr>
+        <w:rFonts w:ascii="Symbol" w:hAnsi="Symbol" w:hint="default"/>
+      </w:rPr>
+    </w:lvl>
+    <w:lvl w:ilvl="7" w:tplc="40090003" w:tentative="1">
+      <w:start w:val="1"/>
+      <w:numFmt w:val="bullet"/>
+      <w:lvlText w:val="o"/>
+      <w:lvlJc w:val="left"/>
+      <w:pPr>
+        <w:ind w:left="5760" w:hanging="360"/>
+      </w:pPr>
+      <w:rPr>
+        <w:rFonts w:ascii="Courier New" w:hAnsi="Courier New" w:cs="Courier New" w:hint="default"/>
+      </w:rPr>
+    </w:lvl>
+    <w:lvl w:ilvl="8" w:tplc="40090005" w:tentative="1">
+      <w:start w:val="1"/>
+      <w:numFmt w:val="bullet"/>
+      <w:lvlText w:val=""/>
+      <w:lvlJc w:val="left"/>
+      <w:pPr>
+        <w:ind w:left="6480" w:hanging="360"/>
+      </w:pPr>
+      <w:rPr>
+        <w:rFonts w:ascii="Wingdings" w:hAnsi="Wingdings" w:hint="default"/>
+      </w:rPr>
+    </w:lvl>
+  </w:abstractNum>
+  <w:abstractNum w:abstractNumId="5" w15:restartNumberingAfterBreak="0">
     <w:nsid w:val="299330FE"/>
     <w:multiLevelType w:val="multilevel"/>
     <w:tmpl w:val="814CE5E4"/>
@@ -3173,7 +3964,7 @@
       </w:rPr>
     </w:lvl>
   </w:abstractNum>
-  <w:abstractNum w:abstractNumId="3" w15:restartNumberingAfterBreak="0">
+  <w:abstractNum w:abstractNumId="6" w15:restartNumberingAfterBreak="0">
     <w:nsid w:val="3D6F7BE1"/>
     <w:multiLevelType w:val="hybridMultilevel"/>
     <w:tmpl w:val="6F1C1874"/>
@@ -3286,7 +4077,7 @@
       </w:rPr>
     </w:lvl>
   </w:abstractNum>
-  <w:abstractNum w:abstractNumId="4" w15:restartNumberingAfterBreak="0">
+  <w:abstractNum w:abstractNumId="7" w15:restartNumberingAfterBreak="0">
     <w:nsid w:val="45191782"/>
     <w:multiLevelType w:val="hybridMultilevel"/>
     <w:tmpl w:val="105CE1F8"/>
@@ -3399,7 +4190,7 @@
       </w:rPr>
     </w:lvl>
   </w:abstractNum>
-  <w:abstractNum w:abstractNumId="5" w15:restartNumberingAfterBreak="0">
+  <w:abstractNum w:abstractNumId="8" w15:restartNumberingAfterBreak="0">
     <w:nsid w:val="64E44E11"/>
     <w:multiLevelType w:val="hybridMultilevel"/>
     <w:tmpl w:val="5C6E4360"/>
@@ -3460,7 +4251,7 @@
       <w:lvlJc w:val="left"/>
     </w:lvl>
   </w:abstractNum>
-  <w:abstractNum w:abstractNumId="6" w15:restartNumberingAfterBreak="0">
+  <w:abstractNum w:abstractNumId="9" w15:restartNumberingAfterBreak="0">
     <w:nsid w:val="6C8B58D1"/>
     <w:multiLevelType w:val="hybridMultilevel"/>
     <w:tmpl w:val="B9A205E6"/>
@@ -3572,7 +4363,7 @@
       </w:rPr>
     </w:lvl>
   </w:abstractNum>
-  <w:abstractNum w:abstractNumId="7" w15:restartNumberingAfterBreak="0">
+  <w:abstractNum w:abstractNumId="10" w15:restartNumberingAfterBreak="0">
     <w:nsid w:val="7BF2423F"/>
     <w:multiLevelType w:val="hybridMultilevel"/>
     <w:tmpl w:val="A07667B8"/>
@@ -3658,34 +4449,159 @@
       </w:pPr>
     </w:lvl>
   </w:abstractNum>
+  <w:abstractNum w:abstractNumId="11" w15:restartNumberingAfterBreak="0">
+    <w:nsid w:val="7CE53E4E"/>
+    <w:multiLevelType w:val="hybridMultilevel"/>
+    <w:tmpl w:val="0366BB8C"/>
+    <w:lvl w:ilvl="0" w:tplc="4009000B">
+      <w:start w:val="1"/>
+      <w:numFmt w:val="bullet"/>
+      <w:lvlText w:val=""/>
+      <w:lvlJc w:val="left"/>
+      <w:pPr>
+        <w:ind w:left="720" w:hanging="360"/>
+      </w:pPr>
+      <w:rPr>
+        <w:rFonts w:ascii="Wingdings" w:hAnsi="Wingdings" w:hint="default"/>
+      </w:rPr>
+    </w:lvl>
+    <w:lvl w:ilvl="1" w:tplc="40090003" w:tentative="1">
+      <w:start w:val="1"/>
+      <w:numFmt w:val="bullet"/>
+      <w:lvlText w:val="o"/>
+      <w:lvlJc w:val="left"/>
+      <w:pPr>
+        <w:ind w:left="1440" w:hanging="360"/>
+      </w:pPr>
+      <w:rPr>
+        <w:rFonts w:ascii="Courier New" w:hAnsi="Courier New" w:cs="Courier New" w:hint="default"/>
+      </w:rPr>
+    </w:lvl>
+    <w:lvl w:ilvl="2" w:tplc="40090005" w:tentative="1">
+      <w:start w:val="1"/>
+      <w:numFmt w:val="bullet"/>
+      <w:lvlText w:val=""/>
+      <w:lvlJc w:val="left"/>
+      <w:pPr>
+        <w:ind w:left="2160" w:hanging="360"/>
+      </w:pPr>
+      <w:rPr>
+        <w:rFonts w:ascii="Wingdings" w:hAnsi="Wingdings" w:hint="default"/>
+      </w:rPr>
+    </w:lvl>
+    <w:lvl w:ilvl="3" w:tplc="40090001" w:tentative="1">
+      <w:start w:val="1"/>
+      <w:numFmt w:val="bullet"/>
+      <w:lvlText w:val=""/>
+      <w:lvlJc w:val="left"/>
+      <w:pPr>
+        <w:ind w:left="2880" w:hanging="360"/>
+      </w:pPr>
+      <w:rPr>
+        <w:rFonts w:ascii="Symbol" w:hAnsi="Symbol" w:hint="default"/>
+      </w:rPr>
+    </w:lvl>
+    <w:lvl w:ilvl="4" w:tplc="40090003" w:tentative="1">
+      <w:start w:val="1"/>
+      <w:numFmt w:val="bullet"/>
+      <w:lvlText w:val="o"/>
+      <w:lvlJc w:val="left"/>
+      <w:pPr>
+        <w:ind w:left="3600" w:hanging="360"/>
+      </w:pPr>
+      <w:rPr>
+        <w:rFonts w:ascii="Courier New" w:hAnsi="Courier New" w:cs="Courier New" w:hint="default"/>
+      </w:rPr>
+    </w:lvl>
+    <w:lvl w:ilvl="5" w:tplc="40090005" w:tentative="1">
+      <w:start w:val="1"/>
+      <w:numFmt w:val="bullet"/>
+      <w:lvlText w:val=""/>
+      <w:lvlJc w:val="left"/>
+      <w:pPr>
+        <w:ind w:left="4320" w:hanging="360"/>
+      </w:pPr>
+      <w:rPr>
+        <w:rFonts w:ascii="Wingdings" w:hAnsi="Wingdings" w:hint="default"/>
+      </w:rPr>
+    </w:lvl>
+    <w:lvl w:ilvl="6" w:tplc="40090001" w:tentative="1">
+      <w:start w:val="1"/>
+      <w:numFmt w:val="bullet"/>
+      <w:lvlText w:val=""/>
+      <w:lvlJc w:val="left"/>
+      <w:pPr>
+        <w:ind w:left="5040" w:hanging="360"/>
+      </w:pPr>
+      <w:rPr>
+        <w:rFonts w:ascii="Symbol" w:hAnsi="Symbol" w:hint="default"/>
+      </w:rPr>
+    </w:lvl>
+    <w:lvl w:ilvl="7" w:tplc="40090003" w:tentative="1">
+      <w:start w:val="1"/>
+      <w:numFmt w:val="bullet"/>
+      <w:lvlText w:val="o"/>
+      <w:lvlJc w:val="left"/>
+      <w:pPr>
+        <w:ind w:left="5760" w:hanging="360"/>
+      </w:pPr>
+      <w:rPr>
+        <w:rFonts w:ascii="Courier New" w:hAnsi="Courier New" w:cs="Courier New" w:hint="default"/>
+      </w:rPr>
+    </w:lvl>
+    <w:lvl w:ilvl="8" w:tplc="40090005" w:tentative="1">
+      <w:start w:val="1"/>
+      <w:numFmt w:val="bullet"/>
+      <w:lvlText w:val=""/>
+      <w:lvlJc w:val="left"/>
+      <w:pPr>
+        <w:ind w:left="6480" w:hanging="360"/>
+      </w:pPr>
+      <w:rPr>
+        <w:rFonts w:ascii="Wingdings" w:hAnsi="Wingdings" w:hint="default"/>
+      </w:rPr>
+    </w:lvl>
+  </w:abstractNum>
   <w:num w:numId="1" w16cid:durableId="512115948">
-    <w:abstractNumId w:val="7"/>
+    <w:abstractNumId w:val="10"/>
     <w:lvlOverride w:ilvl="0">
       <w:startOverride w:val="1"/>
     </w:lvlOverride>
   </w:num>
   <w:num w:numId="2" w16cid:durableId="1337537686">
-    <w:abstractNumId w:val="5"/>
+    <w:abstractNumId w:val="8"/>
     <w:lvlOverride w:ilvl="0">
       <w:startOverride w:val="1"/>
     </w:lvlOverride>
   </w:num>
   <w:num w:numId="3" w16cid:durableId="1453286405">
+    <w:abstractNumId w:val="9"/>
+  </w:num>
+  <w:num w:numId="4" w16cid:durableId="850603687">
+    <w:abstractNumId w:val="3"/>
+  </w:num>
+  <w:num w:numId="5" w16cid:durableId="586958970">
+    <w:abstractNumId w:val="2"/>
+  </w:num>
+  <w:num w:numId="6" w16cid:durableId="107284215">
+    <w:abstractNumId w:val="5"/>
+  </w:num>
+  <w:num w:numId="7" w16cid:durableId="1839685743">
     <w:abstractNumId w:val="6"/>
   </w:num>
-  <w:num w:numId="4" w16cid:durableId="850603687">
+  <w:num w:numId="8" w16cid:durableId="1843659547">
+    <w:abstractNumId w:val="7"/>
+  </w:num>
+  <w:num w:numId="9" w16cid:durableId="281884056">
+    <w:abstractNumId w:val="0"/>
+  </w:num>
+  <w:num w:numId="10" w16cid:durableId="500512921">
+    <w:abstractNumId w:val="11"/>
+  </w:num>
+  <w:num w:numId="11" w16cid:durableId="1394431562">
     <w:abstractNumId w:val="1"/>
   </w:num>
-  <w:num w:numId="5" w16cid:durableId="586958970">
-    <w:abstractNumId w:val="0"/>
-  </w:num>
-  <w:num w:numId="6" w16cid:durableId="107284215">
-    <w:abstractNumId w:val="2"/>
-  </w:num>
-  <w:num w:numId="7" w16cid:durableId="1839685743">
-    <w:abstractNumId w:val="3"/>
-  </w:num>
-  <w:num w:numId="8" w16cid:durableId="1843659547">
+  <w:num w:numId="12" w16cid:durableId="598216421">
     <w:abstractNumId w:val="4"/>
   </w:num>
 </w:numbering>
@@ -4086,7 +5002,7 @@
   <w:style w:type="paragraph" w:default="1" w:styleId="Normal">
     <w:name w:val="Normal"/>
     <w:qFormat/>
-    <w:rsid w:val="007D1B7A"/>
+    <w:rsid w:val="0035205C"/>
   </w:style>
   <w:style w:type="paragraph" w:styleId="Heading1">
     <w:name w:val="heading 1"/>
@@ -4175,7 +5091,6 @@
   <w:style w:type="character" w:default="1" w:styleId="DefaultParagraphFont">
     <w:name w:val="Default Paragraph Font"/>
     <w:uiPriority w:val="1"/>
-    <w:semiHidden/>
     <w:unhideWhenUsed/>
   </w:style>
   <w:style w:type="table" w:default="1" w:styleId="TableNormal">

</xml_diff>